<commit_message>
lab3 finished lab4 initialize
</commit_message>
<xml_diff>
--- a/lab3/lab3实验报告模板.docx
+++ b/lab3/lab3实验报告模板.docx
@@ -267,7 +267,29 @@
           <w:szCs w:val="32"/>
           <w:u w:val="single"/>
         </w:rPr>
-        <w:t xml:space="preserve">                        </w:t>
+        <w:t xml:space="preserve">       </w:t>
+      </w:r>
+      <w:r>
+        <w:rPr>
+          <w:rFonts w:hint="eastAsia"/>
+          <w:b/>
+          <w:bCs/>
+          <w:sz w:val="32"/>
+          <w:szCs w:val="32"/>
+          <w:u w:val="single"/>
+          <w:lang w:val="en-US" w:eastAsia="zh-CN"/>
+        </w:rPr>
+        <w:t>软件学院</w:t>
+      </w:r>
+      <w:r>
+        <w:rPr>
+          <w:b/>
+          <w:bCs/>
+          <w:sz w:val="32"/>
+          <w:szCs w:val="32"/>
+          <w:u w:val="single"/>
+        </w:rPr>
+        <w:t xml:space="preserve">         </w:t>
       </w:r>
     </w:p>
     <w:p>
@@ -300,17 +322,30 @@
           <w:szCs w:val="32"/>
           <w:u w:val="single"/>
         </w:rPr>
-        <w:t xml:space="preserve">                        </w:t>
+        <w:t xml:space="preserve">        </w:t>
       </w:r>
       <w:r>
         <w:rPr>
+          <w:rFonts w:hint="eastAsia"/>
           <w:b/>
           <w:bCs/>
           <w:sz w:val="32"/>
           <w:szCs w:val="32"/>
           <w:u w:val="single"/>
-        </w:rPr>
-        <w:t xml:space="preserve"> </w:t>
+          <w:lang w:val="en-US" w:eastAsia="zh-CN"/>
+        </w:rPr>
+        <w:t>软件工程</w:t>
+      </w:r>
+      <w:r>
+        <w:rPr>
+          <w:rFonts w:hint="eastAsia"/>
+          <w:b/>
+          <w:bCs/>
+          <w:sz w:val="32"/>
+          <w:szCs w:val="32"/>
+          <w:u w:val="single"/>
+        </w:rPr>
+        <w:t xml:space="preserve">         </w:t>
       </w:r>
     </w:p>
     <w:p>
@@ -383,7 +418,29 @@
           <w:szCs w:val="32"/>
           <w:u w:val="single"/>
         </w:rPr>
-        <w:t xml:space="preserve">                       </w:t>
+        <w:t xml:space="preserve">       </w:t>
+      </w:r>
+      <w:r>
+        <w:rPr>
+          <w:rFonts w:hint="eastAsia"/>
+          <w:b/>
+          <w:bCs/>
+          <w:sz w:val="32"/>
+          <w:szCs w:val="32"/>
+          <w:u w:val="single"/>
+          <w:lang w:val="en-US" w:eastAsia="zh-CN"/>
+        </w:rPr>
+        <w:t>李佳璐</w:t>
+      </w:r>
+      <w:r>
+        <w:rPr>
+          <w:b/>
+          <w:bCs/>
+          <w:sz w:val="32"/>
+          <w:szCs w:val="32"/>
+          <w:u w:val="single"/>
+        </w:rPr>
+        <w:t xml:space="preserve">          </w:t>
       </w:r>
     </w:p>
     <w:p>
@@ -439,13 +496,15 @@
       </w:r>
       <w:r>
         <w:rPr>
+          <w:rFonts w:hint="eastAsia"/>
           <w:b/>
           <w:bCs/>
           <w:sz w:val="32"/>
           <w:szCs w:val="32"/>
           <w:u w:val="single"/>
-        </w:rPr>
-        <w:t xml:space="preserve">               </w:t>
+          <w:lang w:val="en-US" w:eastAsia="zh-CN"/>
+        </w:rPr>
+        <w:t>22302010078</w:t>
       </w:r>
       <w:r>
         <w:rPr>
@@ -456,7 +515,17 @@
           <w:szCs w:val="32"/>
           <w:u w:val="single"/>
         </w:rPr>
-        <w:t xml:space="preserve">   </w:t>
+        <w:t xml:space="preserve">     </w:t>
+      </w:r>
+      <w:r>
+        <w:rPr>
+          <w:b/>
+          <w:bCs/>
+          <w:sz w:val="32"/>
+          <w:szCs w:val="32"/>
+          <w:u w:val="single"/>
+        </w:rPr>
+        <w:t xml:space="preserve">  </w:t>
       </w:r>
     </w:p>
     <w:p>
@@ -607,8 +676,6 @@
         </w:rPr>
         <w:t xml:space="preserve">学期 </w:t>
       </w:r>
-      <w:bookmarkStart w:id="0" w:name="_GoBack"/>
-      <w:bookmarkEnd w:id="0"/>
     </w:p>
     <w:p>
       <w:pPr>
@@ -632,7 +699,7 @@
     </w:p>
     <w:tbl>
       <w:tblPr>
-        <w:tblStyle w:val="4"/>
+        <w:tblStyle w:val="6"/>
         <w:tblW w:w="9540" w:type="dxa"/>
         <w:tblInd w:w="-432" w:type="dxa"/>
         <w:tblBorders>
@@ -680,7 +747,7 @@
           </w:tcPr>
           <w:tbl>
             <w:tblPr>
-              <w:tblStyle w:val="4"/>
+              <w:tblStyle w:val="6"/>
               <w:tblW w:w="8481" w:type="dxa"/>
               <w:tblInd w:w="0" w:type="dxa"/>
               <w:tblBorders>
@@ -770,12 +837,23 @@
                   <w:pPr>
                     <w:ind w:right="-51"/>
                     <w:rPr>
-                      <w:rFonts w:ascii="宋体" w:hAnsi="宋体"/>
+                      <w:rFonts w:hint="default" w:ascii="宋体" w:hAnsi="宋体" w:eastAsia="宋体"/>
                       <w:b/>
                       <w:sz w:val="28"/>
                       <w:szCs w:val="28"/>
+                      <w:lang w:val="en-US" w:eastAsia="zh-CN"/>
                     </w:rPr>
                   </w:pPr>
+                  <w:r>
+                    <w:rPr>
+                      <w:rFonts w:hint="eastAsia" w:ascii="宋体" w:hAnsi="宋体"/>
+                      <w:b/>
+                      <w:sz w:val="28"/>
+                      <w:szCs w:val="28"/>
+                      <w:lang w:val="en-US" w:eastAsia="zh-CN"/>
+                    </w:rPr>
+                    <w:t>RSA</w:t>
+                  </w:r>
                 </w:p>
               </w:tc>
               <w:tc>
@@ -846,75 +924,140 @@
           </w:p>
           <w:p>
             <w:pPr>
-              <w:rPr>
-                <w:bCs/>
-                <w:szCs w:val="21"/>
-              </w:rPr>
-            </w:pPr>
-          </w:p>
-          <w:p>
-            <w:pPr>
-              <w:rPr>
-                <w:bCs/>
-                <w:szCs w:val="21"/>
-              </w:rPr>
-            </w:pPr>
-          </w:p>
-          <w:p>
-            <w:pPr>
-              <w:rPr>
-                <w:bCs/>
-                <w:szCs w:val="21"/>
-              </w:rPr>
-            </w:pPr>
-          </w:p>
-          <w:p>
-            <w:pPr>
-              <w:rPr>
-                <w:bCs/>
-                <w:szCs w:val="21"/>
-              </w:rPr>
-            </w:pPr>
-          </w:p>
-          <w:p>
-            <w:pPr>
-              <w:rPr>
-                <w:bCs/>
-                <w:szCs w:val="21"/>
-              </w:rPr>
-            </w:pPr>
-          </w:p>
-          <w:p>
-            <w:pPr>
-              <w:rPr>
-                <w:bCs/>
-                <w:szCs w:val="21"/>
-              </w:rPr>
-            </w:pPr>
-          </w:p>
-          <w:p>
-            <w:pPr>
-              <w:rPr>
-                <w:bCs/>
-                <w:szCs w:val="21"/>
-              </w:rPr>
-            </w:pPr>
-          </w:p>
-          <w:p>
-            <w:pPr>
-              <w:rPr>
-                <w:bCs/>
-                <w:szCs w:val="21"/>
-              </w:rPr>
-            </w:pPr>
-          </w:p>
-          <w:p>
-            <w:pPr>
-              <w:rPr>
-                <w:bCs/>
-                <w:szCs w:val="21"/>
-              </w:rPr>
-            </w:pPr>
+              <w:keepNext w:val="0"/>
+              <w:keepLines w:val="0"/>
+              <w:widowControl/>
+              <w:suppressLineNumbers w:val="0"/>
+              <w:jc w:val="left"/>
+            </w:pPr>
+            <w:r>
+              <w:rPr>
+                <w:rFonts w:hint="eastAsia" w:ascii="宋体" w:hAnsi="宋体" w:cs="宋体"/>
+                <w:color w:val="1E0707"/>
+                <w:kern w:val="0"/>
+                <w:sz w:val="19"/>
+                <w:szCs w:val="19"/>
+                <w:lang w:val="en-US" w:eastAsia="zh-CN" w:bidi="ar"/>
+              </w:rPr>
+              <w:t xml:space="preserve">1. </w:t>
+            </w:r>
+            <w:r>
+              <w:rPr>
+                <w:rFonts w:hint="eastAsia" w:ascii="宋体" w:hAnsi="宋体" w:eastAsia="宋体" w:cs="宋体"/>
+                <w:color w:val="1E0707"/>
+                <w:kern w:val="0"/>
+                <w:sz w:val="19"/>
+                <w:szCs w:val="19"/>
+                <w:lang w:val="en-US" w:eastAsia="zh-CN" w:bidi="ar"/>
+              </w:rPr>
+              <w:t xml:space="preserve">实现 </w:t>
+            </w:r>
+            <w:r>
+              <w:rPr>
+                <w:rFonts w:ascii="Book Antiqua" w:hAnsi="Book Antiqua" w:eastAsia="Book Antiqua" w:cs="Book Antiqua"/>
+                <w:color w:val="1E0707"/>
+                <w:kern w:val="0"/>
+                <w:sz w:val="19"/>
+                <w:szCs w:val="19"/>
+                <w:lang w:val="en-US" w:eastAsia="zh-CN" w:bidi="ar"/>
+              </w:rPr>
+              <w:t xml:space="preserve">RSA </w:t>
+            </w:r>
+            <w:r>
+              <w:rPr>
+                <w:rFonts w:hint="eastAsia" w:ascii="宋体" w:hAnsi="宋体" w:eastAsia="宋体" w:cs="宋体"/>
+                <w:color w:val="1E0707"/>
+                <w:kern w:val="0"/>
+                <w:sz w:val="19"/>
+                <w:szCs w:val="19"/>
+                <w:lang w:val="en-US" w:eastAsia="zh-CN" w:bidi="ar"/>
+              </w:rPr>
+              <w:t xml:space="preserve">加密 </w:t>
+            </w:r>
+          </w:p>
+          <w:p>
+            <w:pPr>
+              <w:keepNext w:val="0"/>
+              <w:keepLines w:val="0"/>
+              <w:widowControl/>
+              <w:suppressLineNumbers w:val="0"/>
+              <w:jc w:val="left"/>
+            </w:pPr>
+            <w:r>
+              <w:rPr>
+                <w:rFonts w:hint="eastAsia" w:ascii="宋体" w:hAnsi="宋体" w:cs="宋体"/>
+                <w:color w:val="1E0707"/>
+                <w:kern w:val="0"/>
+                <w:sz w:val="19"/>
+                <w:szCs w:val="19"/>
+                <w:lang w:val="en-US" w:eastAsia="zh-CN" w:bidi="ar"/>
+              </w:rPr>
+              <w:t xml:space="preserve">2. </w:t>
+            </w:r>
+            <w:r>
+              <w:rPr>
+                <w:rFonts w:hint="eastAsia" w:ascii="宋体" w:hAnsi="宋体" w:eastAsia="宋体" w:cs="宋体"/>
+                <w:color w:val="1E0707"/>
+                <w:kern w:val="0"/>
+                <w:sz w:val="19"/>
+                <w:szCs w:val="19"/>
+                <w:lang w:val="en-US" w:eastAsia="zh-CN" w:bidi="ar"/>
+              </w:rPr>
+              <w:t xml:space="preserve">理解分解模数破解 </w:t>
+            </w:r>
+            <w:r>
+              <w:rPr>
+                <w:rFonts w:hint="default" w:ascii="Book Antiqua" w:hAnsi="Book Antiqua" w:eastAsia="Book Antiqua" w:cs="Book Antiqua"/>
+                <w:color w:val="1E0707"/>
+                <w:kern w:val="0"/>
+                <w:sz w:val="19"/>
+                <w:szCs w:val="19"/>
+                <w:lang w:val="en-US" w:eastAsia="zh-CN" w:bidi="ar"/>
+              </w:rPr>
+              <w:t xml:space="preserve">RSA </w:t>
+            </w:r>
+            <w:r>
+              <w:rPr>
+                <w:rFonts w:hint="eastAsia" w:ascii="宋体" w:hAnsi="宋体" w:eastAsia="宋体" w:cs="宋体"/>
+                <w:color w:val="1E0707"/>
+                <w:kern w:val="0"/>
+                <w:sz w:val="19"/>
+                <w:szCs w:val="19"/>
+                <w:lang w:val="en-US" w:eastAsia="zh-CN" w:bidi="ar"/>
+              </w:rPr>
+              <w:t xml:space="preserve">的过程 </w:t>
+            </w:r>
+          </w:p>
+          <w:p>
+            <w:pPr>
+              <w:keepNext w:val="0"/>
+              <w:keepLines w:val="0"/>
+              <w:widowControl/>
+              <w:suppressLineNumbers w:val="0"/>
+              <w:jc w:val="left"/>
+            </w:pPr>
+            <w:r>
+              <w:rPr>
+                <w:rFonts w:hint="eastAsia" w:ascii="宋体" w:hAnsi="宋体" w:cs="宋体"/>
+                <w:color w:val="1E0707"/>
+                <w:kern w:val="0"/>
+                <w:sz w:val="19"/>
+                <w:szCs w:val="19"/>
+                <w:lang w:val="en-US" w:eastAsia="zh-CN" w:bidi="ar"/>
+              </w:rPr>
+              <w:t xml:space="preserve">3. </w:t>
+            </w:r>
+            <w:r>
+              <w:rPr>
+                <w:rFonts w:hint="eastAsia" w:ascii="宋体" w:hAnsi="宋体" w:eastAsia="宋体" w:cs="宋体"/>
+                <w:color w:val="1E0707"/>
+                <w:kern w:val="0"/>
+                <w:sz w:val="19"/>
+                <w:szCs w:val="19"/>
+                <w:lang w:val="en-US" w:eastAsia="zh-CN" w:bidi="ar"/>
+              </w:rPr>
+              <w:t>理解公共模数攻击</w:t>
+            </w:r>
           </w:p>
           <w:p>
             <w:pPr>
@@ -944,11 +1087,1833 @@
           </w:p>
           <w:p>
             <w:pPr>
+              <w:keepNext w:val="0"/>
+              <w:keepLines w:val="0"/>
+              <w:widowControl/>
+              <w:suppressLineNumbers w:val="0"/>
+              <w:jc w:val="left"/>
+              <w:rPr>
+                <w:rFonts w:hint="eastAsia" w:ascii="宋体" w:hAnsi="宋体" w:eastAsia="宋体" w:cs="宋体"/>
+                <w:b/>
+                <w:bCs/>
+                <w:color w:val="1E0707"/>
+                <w:kern w:val="0"/>
+                <w:sz w:val="19"/>
+                <w:szCs w:val="19"/>
+                <w:lang w:val="en-US" w:eastAsia="zh-CN" w:bidi="ar"/>
+              </w:rPr>
+            </w:pPr>
+            <w:r>
+              <w:rPr>
+                <w:rFonts w:hint="eastAsia" w:ascii="宋体" w:hAnsi="宋体" w:eastAsia="宋体" w:cs="宋体"/>
+                <w:b/>
+                <w:bCs/>
+                <w:color w:val="1E0707"/>
+                <w:kern w:val="0"/>
+                <w:sz w:val="19"/>
+                <w:szCs w:val="19"/>
+                <w:lang w:val="en-US" w:eastAsia="zh-CN" w:bidi="ar"/>
+              </w:rPr>
+              <w:t>1. RSA 原理理解</w:t>
+            </w:r>
+          </w:p>
+          <w:p>
+            <w:pPr>
+              <w:keepNext w:val="0"/>
+              <w:keepLines w:val="0"/>
+              <w:widowControl/>
+              <w:suppressLineNumbers w:val="0"/>
+              <w:jc w:val="left"/>
+              <w:rPr>
+                <w:rFonts w:hint="eastAsia" w:ascii="宋体" w:hAnsi="宋体" w:eastAsia="宋体" w:cs="宋体"/>
+                <w:color w:val="1E0707"/>
+                <w:kern w:val="0"/>
+                <w:sz w:val="19"/>
+                <w:szCs w:val="19"/>
+                <w:lang w:val="en-US" w:eastAsia="zh-CN" w:bidi="ar"/>
+              </w:rPr>
+            </w:pPr>
+            <w:r>
+              <w:rPr>
+                <w:rFonts w:hint="eastAsia" w:ascii="宋体" w:hAnsi="宋体" w:eastAsia="宋体" w:cs="宋体"/>
+                <w:color w:val="1E0707"/>
+                <w:kern w:val="0"/>
+                <w:sz w:val="19"/>
+                <w:szCs w:val="19"/>
+                <w:lang w:val="en-US" w:eastAsia="zh-CN" w:bidi="ar"/>
+              </w:rPr>
+              <w:t>RSA 是一种典型的公钥加密算法，基于大整数分解困难性建立安全性。公钥由两个大质数相乘得到的模数</w:t>
+            </w:r>
+            <w:r>
+              <w:rPr>
+                <w:rFonts w:hint="eastAsia" w:ascii="宋体" w:hAnsi="宋体" w:cs="宋体"/>
+                <w:color w:val="1E0707"/>
+                <w:kern w:val="0"/>
+                <w:sz w:val="19"/>
+                <w:szCs w:val="19"/>
+                <w:lang w:val="en-US" w:eastAsia="zh-CN" w:bidi="ar"/>
+              </w:rPr>
+              <w:t>n</w:t>
+            </w:r>
+            <w:r>
+              <w:rPr>
+                <w:rFonts w:hint="eastAsia" w:ascii="宋体" w:hAnsi="宋体" w:eastAsia="宋体" w:cs="宋体"/>
+                <w:color w:val="1E0707"/>
+                <w:kern w:val="0"/>
+                <w:sz w:val="19"/>
+                <w:szCs w:val="19"/>
+                <w:lang w:val="en-US" w:eastAsia="zh-CN" w:bidi="ar"/>
+              </w:rPr>
+              <w:t>和一个公开指数</w:t>
+            </w:r>
+            <w:r>
+              <w:rPr>
+                <w:rFonts w:hint="eastAsia" w:ascii="宋体" w:hAnsi="宋体" w:cs="宋体"/>
+                <w:color w:val="1E0707"/>
+                <w:kern w:val="0"/>
+                <w:sz w:val="19"/>
+                <w:szCs w:val="19"/>
+                <w:lang w:val="en-US" w:eastAsia="zh-CN" w:bidi="ar"/>
+              </w:rPr>
+              <w:t>e</w:t>
+            </w:r>
+            <w:r>
+              <w:rPr>
+                <w:rFonts w:hint="eastAsia" w:ascii="宋体" w:hAnsi="宋体" w:eastAsia="宋体" w:cs="宋体"/>
+                <w:color w:val="1E0707"/>
+                <w:kern w:val="0"/>
+                <w:sz w:val="19"/>
+                <w:szCs w:val="19"/>
+                <w:lang w:val="en-US" w:eastAsia="zh-CN" w:bidi="ar"/>
+              </w:rPr>
+              <w:t>构成，私钥由相同质数计算得到。通过理解 RSA 的密钥生成过程、加密与解密过程，为后续实验奠定理论基础。</w:t>
+            </w:r>
+          </w:p>
+          <w:p>
+            <w:pPr>
+              <w:keepNext w:val="0"/>
+              <w:keepLines w:val="0"/>
+              <w:widowControl/>
+              <w:suppressLineNumbers w:val="0"/>
+              <w:jc w:val="left"/>
+              <w:rPr>
+                <w:rFonts w:hint="eastAsia" w:ascii="宋体" w:hAnsi="宋体" w:eastAsia="宋体" w:cs="宋体"/>
+                <w:color w:val="1E0707"/>
+                <w:kern w:val="0"/>
+                <w:sz w:val="19"/>
+                <w:szCs w:val="19"/>
+                <w:lang w:val="en-US" w:eastAsia="zh-CN" w:bidi="ar"/>
+              </w:rPr>
+            </w:pPr>
+          </w:p>
+          <w:p>
+            <w:pPr>
+              <w:keepNext w:val="0"/>
+              <w:keepLines w:val="0"/>
+              <w:widowControl/>
+              <w:suppressLineNumbers w:val="0"/>
+              <w:jc w:val="left"/>
+              <w:rPr>
+                <w:rFonts w:hint="eastAsia" w:ascii="宋体" w:hAnsi="宋体" w:eastAsia="宋体" w:cs="宋体"/>
+                <w:b/>
+                <w:bCs/>
+                <w:color w:val="1E0707"/>
+                <w:kern w:val="0"/>
+                <w:sz w:val="19"/>
+                <w:szCs w:val="19"/>
+                <w:lang w:val="en-US" w:eastAsia="zh-CN" w:bidi="ar"/>
+              </w:rPr>
+            </w:pPr>
+            <w:r>
+              <w:rPr>
+                <w:rFonts w:hint="eastAsia" w:ascii="宋体" w:hAnsi="宋体" w:eastAsia="宋体" w:cs="宋体"/>
+                <w:b/>
+                <w:bCs/>
+                <w:color w:val="1E0707"/>
+                <w:kern w:val="0"/>
+                <w:sz w:val="19"/>
+                <w:szCs w:val="19"/>
+                <w:lang w:val="en-US" w:eastAsia="zh-CN" w:bidi="ar"/>
+              </w:rPr>
+              <w:t>2. 密钥生成 (Key Generation)</w:t>
+            </w:r>
+          </w:p>
+          <w:p>
+            <w:pPr>
+              <w:keepNext w:val="0"/>
+              <w:keepLines w:val="0"/>
+              <w:widowControl/>
+              <w:suppressLineNumbers w:val="0"/>
+              <w:jc w:val="left"/>
+              <w:rPr>
+                <w:rFonts w:hint="eastAsia" w:ascii="宋体" w:hAnsi="宋体" w:eastAsia="宋体" w:cs="宋体"/>
+                <w:color w:val="1E0707"/>
+                <w:kern w:val="0"/>
+                <w:sz w:val="19"/>
+                <w:szCs w:val="19"/>
+                <w:lang w:val="en-US" w:eastAsia="zh-CN" w:bidi="ar"/>
+              </w:rPr>
+            </w:pPr>
+            <w:r>
+              <w:rPr>
+                <w:rFonts w:hint="eastAsia" w:ascii="宋体" w:hAnsi="宋体" w:eastAsia="宋体" w:cs="宋体"/>
+                <w:color w:val="1E0707"/>
+                <w:kern w:val="0"/>
+                <w:sz w:val="19"/>
+                <w:szCs w:val="19"/>
+                <w:lang w:val="en-US" w:eastAsia="zh-CN" w:bidi="ar"/>
+              </w:rPr>
+              <w:t>密钥生成过程包括：</w:t>
+            </w:r>
+          </w:p>
+          <w:p>
+            <w:pPr>
+              <w:keepNext w:val="0"/>
+              <w:keepLines w:val="0"/>
+              <w:widowControl/>
+              <w:suppressLineNumbers w:val="0"/>
+              <w:jc w:val="left"/>
+              <w:rPr>
+                <w:rFonts w:hint="default" w:ascii="宋体" w:hAnsi="宋体" w:eastAsia="宋体" w:cs="宋体"/>
+                <w:color w:val="1E0707"/>
+                <w:kern w:val="0"/>
+                <w:sz w:val="19"/>
+                <w:szCs w:val="19"/>
+                <w:lang w:val="en-US" w:eastAsia="zh-CN" w:bidi="ar"/>
+              </w:rPr>
+            </w:pPr>
+            <w:r>
+              <w:rPr>
+                <w:rFonts w:hint="eastAsia" w:ascii="宋体" w:hAnsi="宋体" w:eastAsia="宋体" w:cs="宋体"/>
+                <w:color w:val="1E0707"/>
+                <w:kern w:val="0"/>
+                <w:sz w:val="19"/>
+                <w:szCs w:val="19"/>
+                <w:lang w:val="en-US" w:eastAsia="zh-CN" w:bidi="ar"/>
+              </w:rPr>
+              <w:t>随机选取两个大质数</w:t>
+            </w:r>
+            <w:r>
+              <w:rPr>
+                <w:rFonts w:hint="eastAsia" w:ascii="宋体" w:hAnsi="宋体" w:cs="宋体"/>
+                <w:color w:val="1E0707"/>
+                <w:kern w:val="0"/>
+                <w:sz w:val="19"/>
+                <w:szCs w:val="19"/>
+                <w:lang w:val="en-US" w:eastAsia="zh-CN" w:bidi="ar"/>
+              </w:rPr>
+              <w:t>p</w:t>
+            </w:r>
+            <w:r>
+              <w:rPr>
+                <w:rFonts w:hint="eastAsia" w:ascii="宋体" w:hAnsi="宋体" w:eastAsia="宋体" w:cs="宋体"/>
+                <w:color w:val="1E0707"/>
+                <w:kern w:val="0"/>
+                <w:sz w:val="19"/>
+                <w:szCs w:val="19"/>
+                <w:lang w:val="en-US" w:eastAsia="zh-CN" w:bidi="ar"/>
+              </w:rPr>
+              <w:t>、</w:t>
+            </w:r>
+            <w:r>
+              <w:rPr>
+                <w:rFonts w:hint="eastAsia" w:ascii="宋体" w:hAnsi="宋体" w:cs="宋体"/>
+                <w:color w:val="1E0707"/>
+                <w:kern w:val="0"/>
+                <w:sz w:val="19"/>
+                <w:szCs w:val="19"/>
+                <w:lang w:val="en-US" w:eastAsia="zh-CN" w:bidi="ar"/>
+              </w:rPr>
+              <w:t>q</w:t>
+            </w:r>
+            <w:r>
+              <w:rPr>
+                <w:rFonts w:hint="eastAsia" w:ascii="宋体" w:hAnsi="宋体" w:eastAsia="宋体" w:cs="宋体"/>
+                <w:color w:val="1E0707"/>
+                <w:kern w:val="0"/>
+                <w:sz w:val="19"/>
+                <w:szCs w:val="19"/>
+                <w:lang w:val="en-US" w:eastAsia="zh-CN" w:bidi="ar"/>
+              </w:rPr>
+              <w:t>，计算 n=p×q</w:t>
+            </w:r>
+            <w:r>
+              <w:rPr>
+                <w:rFonts w:hint="eastAsia" w:ascii="宋体" w:hAnsi="宋体" w:cs="宋体"/>
+                <w:color w:val="1E0707"/>
+                <w:kern w:val="0"/>
+                <w:sz w:val="19"/>
+                <w:szCs w:val="19"/>
+                <w:lang w:val="en-US" w:eastAsia="zh-CN" w:bidi="ar"/>
+              </w:rPr>
+              <w:t>;</w:t>
+            </w:r>
+          </w:p>
+          <w:p>
+            <w:pPr>
+              <w:keepNext w:val="0"/>
+              <w:keepLines w:val="0"/>
+              <w:widowControl/>
+              <w:suppressLineNumbers w:val="0"/>
+              <w:jc w:val="left"/>
+              <w:rPr>
+                <w:rFonts w:hint="eastAsia" w:ascii="宋体" w:hAnsi="宋体" w:eastAsia="宋体" w:cs="宋体"/>
+                <w:color w:val="1E0707"/>
+                <w:kern w:val="0"/>
+                <w:sz w:val="19"/>
+                <w:szCs w:val="19"/>
+                <w:lang w:val="en-US" w:eastAsia="zh-CN" w:bidi="ar"/>
+              </w:rPr>
+            </w:pPr>
+            <w:r>
+              <w:rPr>
+                <w:rFonts w:hint="eastAsia" w:ascii="宋体" w:hAnsi="宋体" w:eastAsia="宋体" w:cs="宋体"/>
+                <w:color w:val="1E0707"/>
+                <w:kern w:val="0"/>
+                <w:sz w:val="19"/>
+                <w:szCs w:val="19"/>
+                <w:lang w:val="en-US" w:eastAsia="zh-CN" w:bidi="ar"/>
+              </w:rPr>
+              <w:t>计算欧拉函数 φ(n)=(p−1)(q−1)；</w:t>
+            </w:r>
+          </w:p>
+          <w:p>
+            <w:pPr>
+              <w:keepNext w:val="0"/>
+              <w:keepLines w:val="0"/>
+              <w:widowControl/>
+              <w:suppressLineNumbers w:val="0"/>
+              <w:jc w:val="left"/>
+              <w:rPr>
+                <w:rFonts w:hint="eastAsia" w:ascii="宋体" w:hAnsi="宋体" w:eastAsia="宋体" w:cs="宋体"/>
+                <w:color w:val="1E0707"/>
+                <w:kern w:val="0"/>
+                <w:sz w:val="19"/>
+                <w:szCs w:val="19"/>
+                <w:lang w:val="en-US" w:eastAsia="zh-CN" w:bidi="ar"/>
+              </w:rPr>
+            </w:pPr>
+            <w:r>
+              <w:rPr>
+                <w:rFonts w:hint="eastAsia" w:ascii="宋体" w:hAnsi="宋体" w:eastAsia="宋体" w:cs="宋体"/>
+                <w:color w:val="1E0707"/>
+                <w:kern w:val="0"/>
+                <w:sz w:val="19"/>
+                <w:szCs w:val="19"/>
+                <w:lang w:val="en-US" w:eastAsia="zh-CN" w:bidi="ar"/>
+              </w:rPr>
+              <w:t>选择与φ(n)互质的加密指数</w:t>
+            </w:r>
+            <w:r>
+              <w:rPr>
+                <w:rFonts w:hint="eastAsia" w:ascii="宋体" w:hAnsi="宋体" w:cs="宋体"/>
+                <w:color w:val="1E0707"/>
+                <w:kern w:val="0"/>
+                <w:sz w:val="19"/>
+                <w:szCs w:val="19"/>
+                <w:lang w:val="en-US" w:eastAsia="zh-CN" w:bidi="ar"/>
+              </w:rPr>
+              <w:t>e</w:t>
+            </w:r>
+            <w:r>
+              <w:rPr>
+                <w:rFonts w:hint="eastAsia" w:ascii="宋体" w:hAnsi="宋体" w:eastAsia="宋体" w:cs="宋体"/>
+                <w:color w:val="1E0707"/>
+                <w:kern w:val="0"/>
+                <w:sz w:val="19"/>
+                <w:szCs w:val="19"/>
+                <w:lang w:val="en-US" w:eastAsia="zh-CN" w:bidi="ar"/>
+              </w:rPr>
+              <w:t>；</w:t>
+            </w:r>
+          </w:p>
+          <w:p>
+            <w:pPr>
+              <w:keepNext w:val="0"/>
+              <w:keepLines w:val="0"/>
+              <w:widowControl/>
+              <w:suppressLineNumbers w:val="0"/>
+              <w:jc w:val="left"/>
+              <w:rPr>
+                <w:rFonts w:hint="eastAsia" w:ascii="宋体" w:hAnsi="宋体" w:eastAsia="宋体" w:cs="宋体"/>
+                <w:color w:val="1E0707"/>
+                <w:kern w:val="0"/>
+                <w:sz w:val="19"/>
+                <w:szCs w:val="19"/>
+                <w:lang w:val="en-US" w:eastAsia="zh-CN" w:bidi="ar"/>
+              </w:rPr>
+            </w:pPr>
+            <w:r>
+              <w:rPr>
+                <w:rFonts w:hint="eastAsia" w:ascii="宋体" w:hAnsi="宋体" w:eastAsia="宋体" w:cs="宋体"/>
+                <w:color w:val="1E0707"/>
+                <w:kern w:val="0"/>
+                <w:sz w:val="19"/>
+                <w:szCs w:val="19"/>
+                <w:lang w:val="en-US" w:eastAsia="zh-CN" w:bidi="ar"/>
+              </w:rPr>
+              <w:t>通过扩展欧几里得算法计算</w:t>
+            </w:r>
+            <w:r>
+              <w:rPr>
+                <w:rFonts w:hint="eastAsia" w:ascii="宋体" w:hAnsi="宋体" w:cs="宋体"/>
+                <w:color w:val="1E0707"/>
+                <w:kern w:val="0"/>
+                <w:sz w:val="19"/>
+                <w:szCs w:val="19"/>
+                <w:lang w:val="en-US" w:eastAsia="zh-CN" w:bidi="ar"/>
+              </w:rPr>
+              <w:t>e</w:t>
+            </w:r>
+            <w:r>
+              <w:rPr>
+                <w:rFonts w:hint="eastAsia" w:ascii="宋体" w:hAnsi="宋体" w:eastAsia="宋体" w:cs="宋体"/>
+                <w:color w:val="1E0707"/>
+                <w:kern w:val="0"/>
+                <w:sz w:val="19"/>
+                <w:szCs w:val="19"/>
+                <w:lang w:val="en-US" w:eastAsia="zh-CN" w:bidi="ar"/>
+              </w:rPr>
+              <w:t>关于φ(n)的模反元素</w:t>
+            </w:r>
+            <w:r>
+              <w:rPr>
+                <w:rFonts w:hint="eastAsia" w:ascii="宋体" w:hAnsi="宋体" w:cs="宋体"/>
+                <w:color w:val="1E0707"/>
+                <w:kern w:val="0"/>
+                <w:sz w:val="19"/>
+                <w:szCs w:val="19"/>
+                <w:lang w:val="en-US" w:eastAsia="zh-CN" w:bidi="ar"/>
+              </w:rPr>
+              <w:t>d</w:t>
+            </w:r>
+            <w:r>
+              <w:rPr>
+                <w:rFonts w:hint="eastAsia" w:ascii="宋体" w:hAnsi="宋体" w:eastAsia="宋体" w:cs="宋体"/>
+                <w:color w:val="1E0707"/>
+                <w:kern w:val="0"/>
+                <w:sz w:val="19"/>
+                <w:szCs w:val="19"/>
+                <w:lang w:val="en-US" w:eastAsia="zh-CN" w:bidi="ar"/>
+              </w:rPr>
+              <w:t>，即私钥；</w:t>
+            </w:r>
+          </w:p>
+          <w:p>
+            <w:pPr>
+              <w:keepNext w:val="0"/>
+              <w:keepLines w:val="0"/>
+              <w:widowControl/>
+              <w:suppressLineNumbers w:val="0"/>
+              <w:jc w:val="left"/>
+              <w:rPr>
+                <w:rFonts w:hint="eastAsia" w:ascii="宋体" w:hAnsi="宋体" w:eastAsia="宋体" w:cs="宋体"/>
+                <w:color w:val="1E0707"/>
+                <w:kern w:val="0"/>
+                <w:sz w:val="19"/>
+                <w:szCs w:val="19"/>
+                <w:lang w:val="en-US" w:eastAsia="zh-CN" w:bidi="ar"/>
+              </w:rPr>
+            </w:pPr>
+            <w:r>
+              <w:rPr>
+                <w:rFonts w:hint="eastAsia" w:ascii="宋体" w:hAnsi="宋体" w:eastAsia="宋体" w:cs="宋体"/>
+                <w:color w:val="1E0707"/>
+                <w:kern w:val="0"/>
+                <w:sz w:val="19"/>
+                <w:szCs w:val="19"/>
+                <w:lang w:val="en-US" w:eastAsia="zh-CN" w:bidi="ar"/>
+              </w:rPr>
+              <w:t>返回公钥 (n, e) 和私钥 (n, d)。</w:t>
+            </w:r>
+          </w:p>
+          <w:p>
+            <w:pPr>
+              <w:keepNext w:val="0"/>
+              <w:keepLines w:val="0"/>
+              <w:widowControl/>
+              <w:suppressLineNumbers w:val="0"/>
+              <w:jc w:val="left"/>
+              <w:rPr>
+                <w:rFonts w:hint="eastAsia" w:ascii="宋体" w:hAnsi="宋体" w:eastAsia="宋体" w:cs="宋体"/>
+                <w:color w:val="1E0707"/>
+                <w:kern w:val="0"/>
+                <w:sz w:val="19"/>
+                <w:szCs w:val="19"/>
+                <w:lang w:val="en-US" w:eastAsia="zh-CN" w:bidi="ar"/>
+              </w:rPr>
+            </w:pPr>
+            <w:r>
+              <w:rPr>
+                <w:rFonts w:hint="eastAsia" w:ascii="宋体" w:hAnsi="宋体" w:eastAsia="宋体" w:cs="宋体"/>
+                <w:color w:val="1E0707"/>
+                <w:kern w:val="0"/>
+                <w:sz w:val="19"/>
+                <w:szCs w:val="19"/>
+                <w:lang w:val="en-US" w:eastAsia="zh-CN" w:bidi="ar"/>
+              </w:rPr>
+              <w:t>实验中需要手动实现 key_generation 函数。</w:t>
+            </w:r>
+          </w:p>
+          <w:p>
+            <w:pPr>
+              <w:keepNext w:val="0"/>
+              <w:keepLines w:val="0"/>
+              <w:widowControl/>
+              <w:suppressLineNumbers w:val="0"/>
+              <w:jc w:val="left"/>
+              <w:rPr>
+                <w:rFonts w:hint="eastAsia" w:ascii="宋体" w:hAnsi="宋体" w:eastAsia="宋体" w:cs="宋体"/>
+                <w:color w:val="1E0707"/>
+                <w:kern w:val="0"/>
+                <w:sz w:val="19"/>
+                <w:szCs w:val="19"/>
+                <w:lang w:val="en-US" w:eastAsia="zh-CN" w:bidi="ar"/>
+              </w:rPr>
+            </w:pPr>
+          </w:p>
+          <w:p>
+            <w:pPr>
+              <w:keepNext w:val="0"/>
+              <w:keepLines w:val="0"/>
+              <w:widowControl/>
+              <w:suppressLineNumbers w:val="0"/>
+              <w:jc w:val="left"/>
+              <w:rPr>
+                <w:rFonts w:hint="eastAsia" w:ascii="宋体" w:hAnsi="宋体" w:eastAsia="宋体" w:cs="宋体"/>
+                <w:b/>
+                <w:bCs/>
+                <w:color w:val="1E0707"/>
+                <w:kern w:val="0"/>
+                <w:sz w:val="19"/>
+                <w:szCs w:val="19"/>
+                <w:lang w:val="en-US" w:eastAsia="zh-CN" w:bidi="ar"/>
+              </w:rPr>
+            </w:pPr>
+            <w:r>
+              <w:rPr>
+                <w:rFonts w:hint="eastAsia" w:ascii="宋体" w:hAnsi="宋体" w:eastAsia="宋体" w:cs="宋体"/>
+                <w:b/>
+                <w:bCs/>
+                <w:color w:val="1E0707"/>
+                <w:kern w:val="0"/>
+                <w:sz w:val="19"/>
+                <w:szCs w:val="19"/>
+                <w:lang w:val="en-US" w:eastAsia="zh-CN" w:bidi="ar"/>
+              </w:rPr>
+              <w:t>3. 加密与解密 (Encryption &amp; Decryption)</w:t>
+            </w:r>
+          </w:p>
+          <w:p>
+            <w:pPr>
+              <w:keepNext w:val="0"/>
+              <w:keepLines w:val="0"/>
+              <w:widowControl/>
+              <w:suppressLineNumbers w:val="0"/>
+              <w:jc w:val="left"/>
+              <w:rPr>
+                <w:rFonts w:hint="eastAsia" w:ascii="宋体" w:hAnsi="宋体" w:eastAsia="宋体" w:cs="宋体"/>
+                <w:color w:val="1E0707"/>
+                <w:kern w:val="0"/>
+                <w:sz w:val="19"/>
+                <w:szCs w:val="19"/>
+                <w:lang w:val="en-US" w:eastAsia="zh-CN" w:bidi="ar"/>
+              </w:rPr>
+            </w:pPr>
+            <w:r>
+              <w:rPr>
+                <w:rFonts w:hint="eastAsia" w:ascii="宋体" w:hAnsi="宋体" w:eastAsia="宋体" w:cs="宋体"/>
+                <w:color w:val="1E0707"/>
+                <w:kern w:val="0"/>
+                <w:sz w:val="19"/>
+                <w:szCs w:val="19"/>
+                <w:lang w:val="en-US" w:eastAsia="zh-CN" w:bidi="ar"/>
+              </w:rPr>
+              <w:t>加密解密流程包括：</w:t>
+            </w:r>
+          </w:p>
+          <w:p>
+            <w:pPr>
+              <w:keepNext w:val="0"/>
+              <w:keepLines w:val="0"/>
+              <w:widowControl/>
+              <w:suppressLineNumbers w:val="0"/>
+              <w:jc w:val="left"/>
+              <w:rPr>
+                <w:rFonts w:hint="eastAsia" w:ascii="宋体" w:hAnsi="宋体" w:eastAsia="宋体" w:cs="宋体"/>
+                <w:color w:val="1E0707"/>
+                <w:kern w:val="0"/>
+                <w:sz w:val="19"/>
+                <w:szCs w:val="19"/>
+                <w:lang w:val="en-US" w:eastAsia="zh-CN" w:bidi="ar"/>
+              </w:rPr>
+            </w:pPr>
+            <w:r>
+              <w:rPr>
+                <w:rFonts w:hint="eastAsia" w:ascii="宋体" w:hAnsi="宋体" w:eastAsia="宋体" w:cs="宋体"/>
+                <w:color w:val="1E0707"/>
+                <w:kern w:val="0"/>
+                <w:sz w:val="19"/>
+                <w:szCs w:val="19"/>
+                <w:lang w:val="en-US" w:eastAsia="zh-CN" w:bidi="ar"/>
+              </w:rPr>
+              <w:t>将明文字符串转为整数</w:t>
+            </w:r>
+            <w:r>
+              <w:rPr>
+                <w:rFonts w:hint="eastAsia" w:ascii="宋体" w:hAnsi="宋体" w:cs="宋体"/>
+                <w:color w:val="1E0707"/>
+                <w:kern w:val="0"/>
+                <w:sz w:val="19"/>
+                <w:szCs w:val="19"/>
+                <w:lang w:val="en-US" w:eastAsia="zh-CN" w:bidi="ar"/>
+              </w:rPr>
+              <w:t>m</w:t>
+            </w:r>
+            <w:r>
+              <w:rPr>
+                <w:rFonts w:hint="eastAsia" w:ascii="宋体" w:hAnsi="宋体" w:eastAsia="宋体" w:cs="宋体"/>
+                <w:color w:val="1E0707"/>
+                <w:kern w:val="0"/>
+                <w:sz w:val="19"/>
+                <w:szCs w:val="19"/>
+                <w:lang w:val="en-US" w:eastAsia="zh-CN" w:bidi="ar"/>
+              </w:rPr>
+              <w:t>，使 0≤m</w:t>
+            </w:r>
+            <w:r>
+              <w:rPr>
+                <w:rFonts w:hint="eastAsia" w:ascii="宋体" w:hAnsi="宋体" w:cs="宋体"/>
+                <w:color w:val="1E0707"/>
+                <w:kern w:val="0"/>
+                <w:sz w:val="19"/>
+                <w:szCs w:val="19"/>
+                <w:lang w:val="en-US" w:eastAsia="zh-CN" w:bidi="ar"/>
+              </w:rPr>
+              <w:t>&lt;</w:t>
+            </w:r>
+            <w:r>
+              <w:rPr>
+                <w:rFonts w:hint="eastAsia" w:ascii="宋体" w:hAnsi="宋体" w:eastAsia="宋体" w:cs="宋体"/>
+                <w:color w:val="1E0707"/>
+                <w:kern w:val="0"/>
+                <w:sz w:val="19"/>
+                <w:szCs w:val="19"/>
+                <w:lang w:val="en-US" w:eastAsia="zh-CN" w:bidi="ar"/>
+              </w:rPr>
+              <w:t>n；</w:t>
+            </w:r>
+          </w:p>
+          <w:p>
+            <w:pPr>
+              <w:keepNext w:val="0"/>
+              <w:keepLines w:val="0"/>
+              <w:widowControl/>
+              <w:suppressLineNumbers w:val="0"/>
+              <w:jc w:val="left"/>
+              <w:rPr>
+                <w:rFonts w:hint="eastAsia" w:ascii="宋体" w:hAnsi="宋体" w:eastAsia="宋体" w:cs="宋体"/>
+                <w:color w:val="1E0707"/>
+                <w:kern w:val="0"/>
+                <w:sz w:val="19"/>
+                <w:szCs w:val="19"/>
+                <w:lang w:val="en-US" w:eastAsia="zh-CN" w:bidi="ar"/>
+              </w:rPr>
+            </w:pPr>
+            <w:r>
+              <w:rPr>
+                <w:rFonts w:hint="eastAsia" w:ascii="宋体" w:hAnsi="宋体" w:eastAsia="宋体" w:cs="宋体"/>
+                <w:color w:val="1E0707"/>
+                <w:kern w:val="0"/>
+                <w:sz w:val="19"/>
+                <w:szCs w:val="19"/>
+                <w:lang w:val="en-US" w:eastAsia="zh-CN" w:bidi="ar"/>
+              </w:rPr>
+              <w:t>使用公钥指数</w:t>
+            </w:r>
+            <w:r>
+              <w:rPr>
+                <w:rFonts w:hint="eastAsia" w:ascii="宋体" w:hAnsi="宋体" w:cs="宋体"/>
+                <w:color w:val="1E0707"/>
+                <w:kern w:val="0"/>
+                <w:sz w:val="19"/>
+                <w:szCs w:val="19"/>
+                <w:lang w:val="en-US" w:eastAsia="zh-CN" w:bidi="ar"/>
+              </w:rPr>
+              <w:t>e</w:t>
+            </w:r>
+            <w:r>
+              <w:rPr>
+                <w:rFonts w:hint="eastAsia" w:ascii="宋体" w:hAnsi="宋体" w:eastAsia="宋体" w:cs="宋体"/>
+                <w:color w:val="1E0707"/>
+                <w:kern w:val="0"/>
+                <w:sz w:val="19"/>
+                <w:szCs w:val="19"/>
+                <w:lang w:val="en-US" w:eastAsia="zh-CN" w:bidi="ar"/>
+              </w:rPr>
+              <w:t>进行加密：c=</w:t>
+            </w:r>
+            <m:oMath>
+              <m:sSup>
+                <m:sSupPr>
+                  <m:ctrlPr>
+                    <w:rPr>
+                      <w:rFonts w:ascii="Cambria Math" w:hAnsi="Cambria Math" w:cs="宋体"/>
+                      <w:i/>
+                      <w:color w:val="1E0707"/>
+                      <w:kern w:val="0"/>
+                      <w:sz w:val="19"/>
+                      <w:szCs w:val="19"/>
+                      <w:lang w:val="en-US" w:bidi="ar"/>
+                    </w:rPr>
+                  </m:ctrlPr>
+                </m:sSupPr>
+                <m:e>
+                  <m:r>
+                    <m:rPr/>
+                    <w:rPr>
+                      <w:rFonts w:hint="default" w:ascii="Cambria Math" w:hAnsi="Cambria Math" w:cs="宋体"/>
+                      <w:color w:val="1E0707"/>
+                      <w:kern w:val="0"/>
+                      <w:sz w:val="19"/>
+                      <w:szCs w:val="19"/>
+                      <w:lang w:val="en-US" w:eastAsia="zh-CN" w:bidi="ar"/>
+                    </w:rPr>
+                    <m:t>m</m:t>
+                  </m:r>
+                  <m:ctrlPr>
+                    <w:rPr>
+                      <w:rFonts w:ascii="Cambria Math" w:hAnsi="Cambria Math" w:cs="宋体"/>
+                      <w:i/>
+                      <w:color w:val="1E0707"/>
+                      <w:kern w:val="0"/>
+                      <w:sz w:val="19"/>
+                      <w:szCs w:val="19"/>
+                      <w:lang w:val="en-US" w:bidi="ar"/>
+                    </w:rPr>
+                  </m:ctrlPr>
+                </m:e>
+                <m:sup>
+                  <m:r>
+                    <m:rPr/>
+                    <w:rPr>
+                      <w:rFonts w:hint="default" w:ascii="Cambria Math" w:hAnsi="Cambria Math" w:cs="宋体"/>
+                      <w:color w:val="1E0707"/>
+                      <w:kern w:val="0"/>
+                      <w:sz w:val="19"/>
+                      <w:szCs w:val="19"/>
+                      <w:lang w:val="en-US" w:eastAsia="zh-CN" w:bidi="ar"/>
+                    </w:rPr>
+                    <m:t>e</m:t>
+                  </m:r>
+                  <m:ctrlPr>
+                    <w:rPr>
+                      <w:rFonts w:ascii="Cambria Math" w:hAnsi="Cambria Math" w:cs="宋体"/>
+                      <w:i/>
+                      <w:color w:val="1E0707"/>
+                      <w:kern w:val="0"/>
+                      <w:sz w:val="19"/>
+                      <w:szCs w:val="19"/>
+                      <w:lang w:val="en-US" w:bidi="ar"/>
+                    </w:rPr>
+                  </m:ctrlPr>
+                </m:sup>
+              </m:sSup>
+            </m:oMath>
+            <w:r>
+              <w:rPr>
+                <w:rFonts w:hint="eastAsia" w:ascii="宋体" w:hAnsi="宋体" w:eastAsia="宋体" w:cs="宋体"/>
+                <w:color w:val="1E0707"/>
+                <w:kern w:val="0"/>
+                <w:sz w:val="19"/>
+                <w:szCs w:val="19"/>
+                <w:lang w:val="en-US" w:eastAsia="zh-CN" w:bidi="ar"/>
+              </w:rPr>
+              <w:t>mod  n；</w:t>
+            </w:r>
+          </w:p>
+          <w:p>
+            <w:pPr>
+              <w:keepNext w:val="0"/>
+              <w:keepLines w:val="0"/>
+              <w:widowControl/>
+              <w:suppressLineNumbers w:val="0"/>
+              <w:jc w:val="left"/>
+              <w:rPr>
+                <w:rFonts w:hint="eastAsia" w:ascii="宋体" w:hAnsi="宋体" w:eastAsia="宋体" w:cs="宋体"/>
+                <w:color w:val="1E0707"/>
+                <w:kern w:val="0"/>
+                <w:sz w:val="19"/>
+                <w:szCs w:val="19"/>
+                <w:lang w:val="en-US" w:eastAsia="zh-CN" w:bidi="ar"/>
+              </w:rPr>
+            </w:pPr>
+            <w:r>
+              <w:rPr>
+                <w:rFonts w:hint="eastAsia" w:ascii="宋体" w:hAnsi="宋体" w:eastAsia="宋体" w:cs="宋体"/>
+                <w:color w:val="1E0707"/>
+                <w:kern w:val="0"/>
+                <w:sz w:val="19"/>
+                <w:szCs w:val="19"/>
+                <w:lang w:val="en-US" w:eastAsia="zh-CN" w:bidi="ar"/>
+              </w:rPr>
+              <w:t>使用私钥指数</w:t>
+            </w:r>
+            <w:r>
+              <w:rPr>
+                <w:rFonts w:hint="eastAsia" w:ascii="宋体" w:hAnsi="宋体" w:cs="宋体"/>
+                <w:color w:val="1E0707"/>
+                <w:kern w:val="0"/>
+                <w:sz w:val="19"/>
+                <w:szCs w:val="19"/>
+                <w:lang w:val="en-US" w:eastAsia="zh-CN" w:bidi="ar"/>
+              </w:rPr>
+              <w:t>d</w:t>
+            </w:r>
+            <w:r>
+              <w:rPr>
+                <w:rFonts w:hint="eastAsia" w:ascii="宋体" w:hAnsi="宋体" w:eastAsia="宋体" w:cs="宋体"/>
+                <w:color w:val="1E0707"/>
+                <w:kern w:val="0"/>
+                <w:sz w:val="19"/>
+                <w:szCs w:val="19"/>
+                <w:lang w:val="en-US" w:eastAsia="zh-CN" w:bidi="ar"/>
+              </w:rPr>
+              <w:t>进行解密：m=</w:t>
+            </w:r>
+            <m:oMath>
+              <m:sSup>
+                <m:sSupPr>
+                  <m:ctrlPr>
+                    <w:rPr>
+                      <w:rFonts w:ascii="Cambria Math" w:hAnsi="Cambria Math" w:cs="宋体"/>
+                      <w:i/>
+                      <w:color w:val="1E0707"/>
+                      <w:kern w:val="0"/>
+                      <w:sz w:val="19"/>
+                      <w:szCs w:val="19"/>
+                      <w:lang w:val="en-US" w:bidi="ar"/>
+                    </w:rPr>
+                  </m:ctrlPr>
+                </m:sSupPr>
+                <m:e>
+                  <m:r>
+                    <m:rPr/>
+                    <w:rPr>
+                      <w:rFonts w:hint="default" w:ascii="Cambria Math" w:hAnsi="Cambria Math" w:cs="宋体"/>
+                      <w:color w:val="1E0707"/>
+                      <w:kern w:val="0"/>
+                      <w:sz w:val="19"/>
+                      <w:szCs w:val="19"/>
+                      <w:lang w:val="en-US" w:eastAsia="zh-CN" w:bidi="ar"/>
+                    </w:rPr>
+                    <m:t>c</m:t>
+                  </m:r>
+                  <m:ctrlPr>
+                    <w:rPr>
+                      <w:rFonts w:ascii="Cambria Math" w:hAnsi="Cambria Math" w:cs="宋体"/>
+                      <w:i/>
+                      <w:color w:val="1E0707"/>
+                      <w:kern w:val="0"/>
+                      <w:sz w:val="19"/>
+                      <w:szCs w:val="19"/>
+                      <w:lang w:val="en-US" w:bidi="ar"/>
+                    </w:rPr>
+                  </m:ctrlPr>
+                </m:e>
+                <m:sup>
+                  <m:r>
+                    <m:rPr/>
+                    <w:rPr>
+                      <w:rFonts w:hint="default" w:ascii="Cambria Math" w:hAnsi="Cambria Math" w:cs="宋体"/>
+                      <w:color w:val="1E0707"/>
+                      <w:kern w:val="0"/>
+                      <w:sz w:val="19"/>
+                      <w:szCs w:val="19"/>
+                      <w:lang w:val="en-US" w:eastAsia="zh-CN" w:bidi="ar"/>
+                    </w:rPr>
+                    <m:t>d</m:t>
+                  </m:r>
+                  <m:ctrlPr>
+                    <w:rPr>
+                      <w:rFonts w:ascii="Cambria Math" w:hAnsi="Cambria Math" w:cs="宋体"/>
+                      <w:i/>
+                      <w:color w:val="1E0707"/>
+                      <w:kern w:val="0"/>
+                      <w:sz w:val="19"/>
+                      <w:szCs w:val="19"/>
+                      <w:lang w:val="en-US" w:bidi="ar"/>
+                    </w:rPr>
+                  </m:ctrlPr>
+                </m:sup>
+              </m:sSup>
+            </m:oMath>
+            <w:r>
+              <w:rPr>
+                <w:rFonts w:hint="eastAsia" w:ascii="宋体" w:hAnsi="宋体" w:eastAsia="宋体" w:cs="宋体"/>
+                <w:color w:val="1E0707"/>
+                <w:kern w:val="0"/>
+                <w:sz w:val="19"/>
+                <w:szCs w:val="19"/>
+                <w:lang w:val="en-US" w:eastAsia="zh-CN" w:bidi="ar"/>
+              </w:rPr>
+              <w:t>mod  n；</w:t>
+            </w:r>
+          </w:p>
+          <w:p>
+            <w:pPr>
+              <w:keepNext w:val="0"/>
+              <w:keepLines w:val="0"/>
+              <w:widowControl/>
+              <w:suppressLineNumbers w:val="0"/>
+              <w:jc w:val="left"/>
+              <w:rPr>
+                <w:rFonts w:hint="eastAsia" w:ascii="宋体" w:hAnsi="宋体" w:eastAsia="宋体" w:cs="宋体"/>
+                <w:color w:val="1E0707"/>
+                <w:kern w:val="0"/>
+                <w:sz w:val="19"/>
+                <w:szCs w:val="19"/>
+                <w:lang w:val="en-US" w:eastAsia="zh-CN" w:bidi="ar"/>
+              </w:rPr>
+            </w:pPr>
+            <w:r>
+              <w:rPr>
+                <w:rFonts w:hint="eastAsia" w:ascii="宋体" w:hAnsi="宋体" w:eastAsia="宋体" w:cs="宋体"/>
+                <w:color w:val="1E0707"/>
+                <w:kern w:val="0"/>
+                <w:sz w:val="19"/>
+                <w:szCs w:val="19"/>
+                <w:lang w:val="en-US" w:eastAsia="zh-CN" w:bidi="ar"/>
+              </w:rPr>
+              <w:t>将解密后的整数还原为字符串。</w:t>
+            </w:r>
+          </w:p>
+          <w:p>
+            <w:pPr>
+              <w:keepNext w:val="0"/>
+              <w:keepLines w:val="0"/>
+              <w:widowControl/>
+              <w:suppressLineNumbers w:val="0"/>
+              <w:jc w:val="left"/>
+              <w:rPr>
+                <w:rFonts w:hint="eastAsia" w:ascii="宋体" w:hAnsi="宋体" w:eastAsia="宋体" w:cs="宋体"/>
+                <w:color w:val="1E0707"/>
+                <w:kern w:val="0"/>
+                <w:sz w:val="19"/>
+                <w:szCs w:val="19"/>
+                <w:lang w:val="en-US" w:eastAsia="zh-CN" w:bidi="ar"/>
+              </w:rPr>
+            </w:pPr>
+          </w:p>
+          <w:p>
+            <w:pPr>
+              <w:keepNext w:val="0"/>
+              <w:keepLines w:val="0"/>
+              <w:widowControl/>
+              <w:suppressLineNumbers w:val="0"/>
+              <w:jc w:val="left"/>
+              <w:rPr>
+                <w:rFonts w:hint="eastAsia" w:ascii="宋体" w:hAnsi="宋体" w:eastAsia="宋体" w:cs="宋体"/>
+                <w:b/>
+                <w:bCs/>
+                <w:color w:val="1E0707"/>
+                <w:kern w:val="0"/>
+                <w:sz w:val="19"/>
+                <w:szCs w:val="19"/>
+                <w:lang w:val="en-US" w:eastAsia="zh-CN" w:bidi="ar"/>
+              </w:rPr>
+            </w:pPr>
+            <w:r>
+              <w:rPr>
+                <w:rFonts w:hint="eastAsia" w:ascii="宋体" w:hAnsi="宋体" w:eastAsia="宋体" w:cs="宋体"/>
+                <w:b/>
+                <w:bCs/>
+                <w:color w:val="1E0707"/>
+                <w:kern w:val="0"/>
+                <w:sz w:val="19"/>
+                <w:szCs w:val="19"/>
+                <w:lang w:val="en-US" w:eastAsia="zh-CN" w:bidi="ar"/>
+              </w:rPr>
+              <w:t>4. 分解模数破解 RSA (Factoring Attack)</w:t>
+            </w:r>
+          </w:p>
+          <w:p>
+            <w:pPr>
+              <w:keepNext w:val="0"/>
+              <w:keepLines w:val="0"/>
+              <w:widowControl/>
+              <w:suppressLineNumbers w:val="0"/>
+              <w:jc w:val="left"/>
+              <w:rPr>
+                <w:rFonts w:hint="eastAsia" w:ascii="宋体" w:hAnsi="宋体" w:eastAsia="宋体" w:cs="宋体"/>
+                <w:color w:val="1E0707"/>
+                <w:kern w:val="0"/>
+                <w:sz w:val="19"/>
+                <w:szCs w:val="19"/>
+                <w:lang w:val="en-US" w:eastAsia="zh-CN" w:bidi="ar"/>
+              </w:rPr>
+            </w:pPr>
+            <w:r>
+              <w:rPr>
+                <w:rFonts w:hint="eastAsia" w:ascii="宋体" w:hAnsi="宋体" w:eastAsia="宋体" w:cs="宋体"/>
+                <w:color w:val="1E0707"/>
+                <w:kern w:val="0"/>
+                <w:sz w:val="19"/>
+                <w:szCs w:val="19"/>
+                <w:lang w:val="en-US" w:eastAsia="zh-CN" w:bidi="ar"/>
+              </w:rPr>
+              <w:t>通过以下步骤演示 RSA 的破解过程：</w:t>
+            </w:r>
+          </w:p>
+          <w:p>
+            <w:pPr>
+              <w:keepNext w:val="0"/>
+              <w:keepLines w:val="0"/>
+              <w:widowControl/>
+              <w:suppressLineNumbers w:val="0"/>
+              <w:jc w:val="left"/>
+              <w:rPr>
+                <w:rFonts w:hint="eastAsia" w:ascii="宋体" w:hAnsi="宋体" w:eastAsia="宋体" w:cs="宋体"/>
+                <w:color w:val="1E0707"/>
+                <w:kern w:val="0"/>
+                <w:sz w:val="19"/>
+                <w:szCs w:val="19"/>
+                <w:lang w:val="en-US" w:eastAsia="zh-CN" w:bidi="ar"/>
+              </w:rPr>
+            </w:pPr>
+            <w:r>
+              <w:rPr>
+                <w:rFonts w:hint="eastAsia" w:ascii="宋体" w:hAnsi="宋体" w:eastAsia="宋体" w:cs="宋体"/>
+                <w:color w:val="1E0707"/>
+                <w:kern w:val="0"/>
+                <w:sz w:val="19"/>
+                <w:szCs w:val="19"/>
+                <w:lang w:val="en-US" w:eastAsia="zh-CN" w:bidi="ar"/>
+              </w:rPr>
+              <w:t>解析提供的公钥文件 pubkey.pem，提取出</w:t>
+            </w:r>
+            <w:r>
+              <w:rPr>
+                <w:rFonts w:hint="eastAsia" w:ascii="宋体" w:hAnsi="宋体" w:cs="宋体"/>
+                <w:color w:val="1E0707"/>
+                <w:kern w:val="0"/>
+                <w:sz w:val="19"/>
+                <w:szCs w:val="19"/>
+                <w:lang w:val="en-US" w:eastAsia="zh-CN" w:bidi="ar"/>
+              </w:rPr>
+              <w:t>n</w:t>
+            </w:r>
+            <w:r>
+              <w:rPr>
+                <w:rFonts w:hint="eastAsia" w:ascii="宋体" w:hAnsi="宋体" w:eastAsia="宋体" w:cs="宋体"/>
+                <w:color w:val="1E0707"/>
+                <w:kern w:val="0"/>
+                <w:sz w:val="19"/>
+                <w:szCs w:val="19"/>
+                <w:lang w:val="en-US" w:eastAsia="zh-CN" w:bidi="ar"/>
+              </w:rPr>
+              <w:t>和</w:t>
+            </w:r>
+            <w:r>
+              <w:rPr>
+                <w:rFonts w:hint="eastAsia" w:ascii="宋体" w:hAnsi="宋体" w:cs="宋体"/>
+                <w:color w:val="1E0707"/>
+                <w:kern w:val="0"/>
+                <w:sz w:val="19"/>
+                <w:szCs w:val="19"/>
+                <w:lang w:val="en-US" w:eastAsia="zh-CN" w:bidi="ar"/>
+              </w:rPr>
+              <w:t>e</w:t>
+            </w:r>
+            <w:r>
+              <w:rPr>
+                <w:rFonts w:hint="eastAsia" w:ascii="宋体" w:hAnsi="宋体" w:eastAsia="宋体" w:cs="宋体"/>
+                <w:color w:val="1E0707"/>
+                <w:kern w:val="0"/>
+                <w:sz w:val="19"/>
+                <w:szCs w:val="19"/>
+                <w:lang w:val="en-US" w:eastAsia="zh-CN" w:bidi="ar"/>
+              </w:rPr>
+              <w:t>；</w:t>
+            </w:r>
+          </w:p>
+          <w:p>
+            <w:pPr>
+              <w:keepNext w:val="0"/>
+              <w:keepLines w:val="0"/>
+              <w:widowControl/>
+              <w:suppressLineNumbers w:val="0"/>
+              <w:jc w:val="left"/>
+              <w:rPr>
+                <w:rFonts w:hint="eastAsia" w:ascii="宋体" w:hAnsi="宋体" w:eastAsia="宋体" w:cs="宋体"/>
+                <w:color w:val="1E0707"/>
+                <w:kern w:val="0"/>
+                <w:sz w:val="19"/>
+                <w:szCs w:val="19"/>
+                <w:lang w:val="en-US" w:eastAsia="zh-CN" w:bidi="ar"/>
+              </w:rPr>
+            </w:pPr>
+            <w:r>
+              <w:rPr>
+                <w:rFonts w:hint="eastAsia" w:ascii="宋体" w:hAnsi="宋体" w:eastAsia="宋体" w:cs="宋体"/>
+                <w:color w:val="1E0707"/>
+                <w:kern w:val="0"/>
+                <w:sz w:val="19"/>
+                <w:szCs w:val="19"/>
+                <w:lang w:val="en-US" w:eastAsia="zh-CN" w:bidi="ar"/>
+              </w:rPr>
+              <w:t>将</w:t>
+            </w:r>
+            <w:r>
+              <w:rPr>
+                <w:rFonts w:hint="eastAsia" w:ascii="宋体" w:hAnsi="宋体" w:cs="宋体"/>
+                <w:color w:val="1E0707"/>
+                <w:kern w:val="0"/>
+                <w:sz w:val="19"/>
+                <w:szCs w:val="19"/>
+                <w:lang w:val="en-US" w:eastAsia="zh-CN" w:bidi="ar"/>
+              </w:rPr>
+              <w:t>n</w:t>
+            </w:r>
+            <w:r>
+              <w:rPr>
+                <w:rFonts w:hint="eastAsia" w:ascii="宋体" w:hAnsi="宋体" w:eastAsia="宋体" w:cs="宋体"/>
+                <w:color w:val="1E0707"/>
+                <w:kern w:val="0"/>
+                <w:sz w:val="19"/>
+                <w:szCs w:val="19"/>
+                <w:lang w:val="en-US" w:eastAsia="zh-CN" w:bidi="ar"/>
+              </w:rPr>
+              <w:t>转换为十进制；</w:t>
+            </w:r>
+          </w:p>
+          <w:p>
+            <w:pPr>
+              <w:keepNext w:val="0"/>
+              <w:keepLines w:val="0"/>
+              <w:widowControl/>
+              <w:suppressLineNumbers w:val="0"/>
+              <w:jc w:val="left"/>
+              <w:rPr>
+                <w:rFonts w:hint="eastAsia" w:ascii="宋体" w:hAnsi="宋体" w:eastAsia="宋体" w:cs="宋体"/>
+                <w:color w:val="1E0707"/>
+                <w:kern w:val="0"/>
+                <w:sz w:val="19"/>
+                <w:szCs w:val="19"/>
+                <w:lang w:val="en-US" w:eastAsia="zh-CN" w:bidi="ar"/>
+              </w:rPr>
+            </w:pPr>
+            <w:r>
+              <w:rPr>
+                <w:rFonts w:hint="eastAsia" w:ascii="宋体" w:hAnsi="宋体" w:eastAsia="宋体" w:cs="宋体"/>
+                <w:color w:val="1E0707"/>
+                <w:kern w:val="0"/>
+                <w:sz w:val="19"/>
+                <w:szCs w:val="19"/>
+                <w:lang w:val="en-US" w:eastAsia="zh-CN" w:bidi="ar"/>
+              </w:rPr>
+              <w:t>对</w:t>
+            </w:r>
+            <w:r>
+              <w:rPr>
+                <w:rFonts w:hint="eastAsia" w:ascii="宋体" w:hAnsi="宋体" w:cs="宋体"/>
+                <w:color w:val="1E0707"/>
+                <w:kern w:val="0"/>
+                <w:sz w:val="19"/>
+                <w:szCs w:val="19"/>
+                <w:lang w:val="en-US" w:eastAsia="zh-CN" w:bidi="ar"/>
+              </w:rPr>
+              <w:t>n</w:t>
+            </w:r>
+            <w:r>
+              <w:rPr>
+                <w:rFonts w:hint="eastAsia" w:ascii="宋体" w:hAnsi="宋体" w:eastAsia="宋体" w:cs="宋体"/>
+                <w:color w:val="1E0707"/>
+                <w:kern w:val="0"/>
+                <w:sz w:val="19"/>
+                <w:szCs w:val="19"/>
+                <w:lang w:val="en-US" w:eastAsia="zh-CN" w:bidi="ar"/>
+              </w:rPr>
+              <w:t>进行质因数分解，得到</w:t>
+            </w:r>
+            <w:r>
+              <w:rPr>
+                <w:rFonts w:hint="eastAsia" w:ascii="宋体" w:hAnsi="宋体" w:cs="宋体"/>
+                <w:color w:val="1E0707"/>
+                <w:kern w:val="0"/>
+                <w:sz w:val="19"/>
+                <w:szCs w:val="19"/>
+                <w:lang w:val="en-US" w:eastAsia="zh-CN" w:bidi="ar"/>
+              </w:rPr>
+              <w:t>p</w:t>
+            </w:r>
+            <w:r>
+              <w:rPr>
+                <w:rFonts w:hint="eastAsia" w:ascii="宋体" w:hAnsi="宋体" w:eastAsia="宋体" w:cs="宋体"/>
+                <w:color w:val="1E0707"/>
+                <w:kern w:val="0"/>
+                <w:sz w:val="19"/>
+                <w:szCs w:val="19"/>
+                <w:lang w:val="en-US" w:eastAsia="zh-CN" w:bidi="ar"/>
+              </w:rPr>
+              <w:t>和</w:t>
+            </w:r>
+            <w:r>
+              <w:rPr>
+                <w:rFonts w:hint="eastAsia" w:ascii="宋体" w:hAnsi="宋体" w:cs="宋体"/>
+                <w:color w:val="1E0707"/>
+                <w:kern w:val="0"/>
+                <w:sz w:val="19"/>
+                <w:szCs w:val="19"/>
+                <w:lang w:val="en-US" w:eastAsia="zh-CN" w:bidi="ar"/>
+              </w:rPr>
+              <w:t>q</w:t>
+            </w:r>
+            <w:r>
+              <w:rPr>
+                <w:rFonts w:hint="eastAsia" w:ascii="宋体" w:hAnsi="宋体" w:eastAsia="宋体" w:cs="宋体"/>
+                <w:color w:val="1E0707"/>
+                <w:kern w:val="0"/>
+                <w:sz w:val="19"/>
+                <w:szCs w:val="19"/>
+                <w:lang w:val="en-US" w:eastAsia="zh-CN" w:bidi="ar"/>
+              </w:rPr>
+              <w:t>（使用 factordb.com 网站）；</w:t>
+            </w:r>
+          </w:p>
+          <w:p>
+            <w:pPr>
+              <w:keepNext w:val="0"/>
+              <w:keepLines w:val="0"/>
+              <w:widowControl/>
+              <w:suppressLineNumbers w:val="0"/>
+              <w:jc w:val="left"/>
+              <w:rPr>
+                <w:rFonts w:hint="eastAsia" w:ascii="宋体" w:hAnsi="宋体" w:eastAsia="宋体" w:cs="宋体"/>
+                <w:color w:val="1E0707"/>
+                <w:kern w:val="0"/>
+                <w:sz w:val="19"/>
+                <w:szCs w:val="19"/>
+                <w:lang w:val="en-US" w:eastAsia="zh-CN" w:bidi="ar"/>
+              </w:rPr>
+            </w:pPr>
+            <w:r>
+              <w:rPr>
+                <w:rFonts w:hint="eastAsia" w:ascii="宋体" w:hAnsi="宋体" w:eastAsia="宋体" w:cs="宋体"/>
+                <w:color w:val="1E0707"/>
+                <w:kern w:val="0"/>
+                <w:sz w:val="19"/>
+                <w:szCs w:val="19"/>
+                <w:lang w:val="en-US" w:eastAsia="zh-CN" w:bidi="ar"/>
+              </w:rPr>
+              <w:t>计算 φ(n)，求出私钥</w:t>
+            </w:r>
+            <w:r>
+              <w:rPr>
+                <w:rFonts w:hint="eastAsia" w:ascii="宋体" w:hAnsi="宋体" w:cs="宋体"/>
+                <w:color w:val="1E0707"/>
+                <w:kern w:val="0"/>
+                <w:sz w:val="19"/>
+                <w:szCs w:val="19"/>
+                <w:lang w:val="en-US" w:eastAsia="zh-CN" w:bidi="ar"/>
+              </w:rPr>
+              <w:t>d</w:t>
+            </w:r>
+            <w:r>
+              <w:rPr>
+                <w:rFonts w:hint="eastAsia" w:ascii="宋体" w:hAnsi="宋体" w:eastAsia="宋体" w:cs="宋体"/>
+                <w:color w:val="1E0707"/>
+                <w:kern w:val="0"/>
+                <w:sz w:val="19"/>
+                <w:szCs w:val="19"/>
+                <w:lang w:val="en-US" w:eastAsia="zh-CN" w:bidi="ar"/>
+              </w:rPr>
+              <w:t>；</w:t>
+            </w:r>
+          </w:p>
+          <w:p>
+            <w:pPr>
+              <w:keepNext w:val="0"/>
+              <w:keepLines w:val="0"/>
+              <w:widowControl/>
+              <w:suppressLineNumbers w:val="0"/>
+              <w:jc w:val="left"/>
+              <w:rPr>
+                <w:rFonts w:hint="eastAsia" w:ascii="宋体" w:hAnsi="宋体" w:eastAsia="宋体" w:cs="宋体"/>
+                <w:color w:val="1E0707"/>
+                <w:kern w:val="0"/>
+                <w:sz w:val="19"/>
+                <w:szCs w:val="19"/>
+                <w:lang w:val="en-US" w:eastAsia="zh-CN" w:bidi="ar"/>
+              </w:rPr>
+            </w:pPr>
+            <w:r>
+              <w:rPr>
+                <w:rFonts w:hint="eastAsia" w:ascii="宋体" w:hAnsi="宋体" w:eastAsia="宋体" w:cs="宋体"/>
+                <w:color w:val="1E0707"/>
+                <w:kern w:val="0"/>
+                <w:sz w:val="19"/>
+                <w:szCs w:val="19"/>
+                <w:lang w:val="en-US" w:eastAsia="zh-CN" w:bidi="ar"/>
+              </w:rPr>
+              <w:t>读取密文文件 secret.enc，用得到的私钥进行解密，恢复出明文。</w:t>
+            </w:r>
+          </w:p>
+          <w:p>
+            <w:pPr>
+              <w:keepNext w:val="0"/>
+              <w:keepLines w:val="0"/>
+              <w:widowControl/>
+              <w:suppressLineNumbers w:val="0"/>
+              <w:jc w:val="left"/>
+              <w:rPr>
+                <w:rFonts w:hint="eastAsia" w:ascii="宋体" w:hAnsi="宋体" w:eastAsia="宋体" w:cs="宋体"/>
+                <w:color w:val="1E0707"/>
+                <w:kern w:val="0"/>
+                <w:sz w:val="19"/>
+                <w:szCs w:val="19"/>
+                <w:lang w:val="en-US" w:eastAsia="zh-CN" w:bidi="ar"/>
+              </w:rPr>
+            </w:pPr>
+          </w:p>
+          <w:p>
+            <w:pPr>
+              <w:keepNext w:val="0"/>
+              <w:keepLines w:val="0"/>
+              <w:widowControl/>
+              <w:suppressLineNumbers w:val="0"/>
+              <w:jc w:val="left"/>
+              <w:rPr>
+                <w:rFonts w:hint="eastAsia" w:ascii="宋体" w:hAnsi="宋体" w:eastAsia="宋体" w:cs="宋体"/>
+                <w:b/>
+                <w:bCs/>
+                <w:color w:val="1E0707"/>
+                <w:kern w:val="0"/>
+                <w:sz w:val="19"/>
+                <w:szCs w:val="19"/>
+                <w:lang w:val="en-US" w:eastAsia="zh-CN" w:bidi="ar"/>
+              </w:rPr>
+            </w:pPr>
+            <w:r>
+              <w:rPr>
+                <w:rFonts w:hint="eastAsia" w:ascii="宋体" w:hAnsi="宋体" w:eastAsia="宋体" w:cs="宋体"/>
+                <w:b/>
+                <w:bCs/>
+                <w:color w:val="1E0707"/>
+                <w:kern w:val="0"/>
+                <w:sz w:val="19"/>
+                <w:szCs w:val="19"/>
+                <w:lang w:val="en-US" w:eastAsia="zh-CN" w:bidi="ar"/>
+              </w:rPr>
+              <w:t>5. 公共模数攻击 (Common Modulus Attack)</w:t>
+            </w:r>
+          </w:p>
+          <w:p>
+            <w:pPr>
+              <w:keepNext w:val="0"/>
+              <w:keepLines w:val="0"/>
+              <w:widowControl/>
+              <w:suppressLineNumbers w:val="0"/>
+              <w:jc w:val="left"/>
+              <w:rPr>
+                <w:rFonts w:hint="eastAsia" w:ascii="宋体" w:hAnsi="宋体" w:eastAsia="宋体" w:cs="宋体"/>
+                <w:color w:val="1E0707"/>
+                <w:kern w:val="0"/>
+                <w:sz w:val="19"/>
+                <w:szCs w:val="19"/>
+                <w:lang w:val="en-US" w:eastAsia="zh-CN" w:bidi="ar"/>
+              </w:rPr>
+            </w:pPr>
+            <w:r>
+              <w:rPr>
+                <w:rFonts w:hint="eastAsia" w:ascii="宋体" w:hAnsi="宋体" w:eastAsia="宋体" w:cs="宋体"/>
+                <w:color w:val="1E0707"/>
+                <w:kern w:val="0"/>
+                <w:sz w:val="19"/>
+                <w:szCs w:val="19"/>
+                <w:lang w:val="en-US" w:eastAsia="zh-CN" w:bidi="ar"/>
+              </w:rPr>
+              <w:t>如果存在两个不同的加密指数 e1、e2，使用相同模数</w:t>
+            </w:r>
+            <w:r>
+              <w:rPr>
+                <w:rFonts w:hint="eastAsia" w:ascii="宋体" w:hAnsi="宋体" w:cs="宋体"/>
+                <w:color w:val="1E0707"/>
+                <w:kern w:val="0"/>
+                <w:sz w:val="19"/>
+                <w:szCs w:val="19"/>
+                <w:lang w:val="en-US" w:eastAsia="zh-CN" w:bidi="ar"/>
+              </w:rPr>
+              <w:t>n</w:t>
+            </w:r>
+            <w:r>
+              <w:rPr>
+                <w:rFonts w:hint="eastAsia" w:ascii="宋体" w:hAnsi="宋体" w:eastAsia="宋体" w:cs="宋体"/>
+                <w:color w:val="1E0707"/>
+                <w:kern w:val="0"/>
+                <w:sz w:val="19"/>
+                <w:szCs w:val="19"/>
+                <w:lang w:val="en-US" w:eastAsia="zh-CN" w:bidi="ar"/>
+              </w:rPr>
+              <w:t>加密了同一条明文，则可以利用贝祖定理（Bezout's theorem）恢复明文。具体步骤：</w:t>
+            </w:r>
+          </w:p>
+          <w:p>
+            <w:pPr>
+              <w:keepNext w:val="0"/>
+              <w:keepLines w:val="0"/>
+              <w:widowControl/>
+              <w:suppressLineNumbers w:val="0"/>
+              <w:jc w:val="left"/>
+              <w:rPr>
+                <w:rFonts w:hint="eastAsia" w:ascii="宋体" w:hAnsi="宋体" w:eastAsia="宋体" w:cs="宋体"/>
+                <w:color w:val="1E0707"/>
+                <w:kern w:val="0"/>
+                <w:sz w:val="19"/>
+                <w:szCs w:val="19"/>
+                <w:lang w:val="en-US" w:eastAsia="zh-CN" w:bidi="ar"/>
+              </w:rPr>
+            </w:pPr>
+            <w:r>
+              <w:rPr>
+                <w:rFonts w:hint="eastAsia" w:ascii="宋体" w:hAnsi="宋体" w:eastAsia="宋体" w:cs="宋体"/>
+                <w:color w:val="1E0707"/>
+                <w:kern w:val="0"/>
+                <w:sz w:val="19"/>
+                <w:szCs w:val="19"/>
+                <w:lang w:val="en-US" w:eastAsia="zh-CN" w:bidi="ar"/>
+              </w:rPr>
+              <w:t>根据扩展欧几里得算法计算 x,y，使 xe1+ye2=1；</w:t>
+            </w:r>
+          </w:p>
+          <w:p>
+            <w:pPr>
+              <w:keepNext w:val="0"/>
+              <w:keepLines w:val="0"/>
+              <w:widowControl/>
+              <w:suppressLineNumbers w:val="0"/>
+              <w:jc w:val="left"/>
+              <w:rPr>
+                <w:rFonts w:hint="eastAsia" w:ascii="宋体" w:hAnsi="宋体" w:eastAsia="宋体" w:cs="宋体"/>
+                <w:color w:val="1E0707"/>
+                <w:kern w:val="0"/>
+                <w:sz w:val="19"/>
+                <w:szCs w:val="19"/>
+                <w:lang w:val="en-US" w:eastAsia="zh-CN" w:bidi="ar"/>
+              </w:rPr>
+            </w:pPr>
+            <w:r>
+              <w:rPr>
+                <w:rFonts w:hint="eastAsia" w:ascii="宋体" w:hAnsi="宋体" w:eastAsia="宋体" w:cs="宋体"/>
+                <w:color w:val="1E0707"/>
+                <w:kern w:val="0"/>
+                <w:sz w:val="19"/>
+                <w:szCs w:val="19"/>
+                <w:lang w:val="en-US" w:eastAsia="zh-CN" w:bidi="ar"/>
+              </w:rPr>
+              <w:t>根据公式 m=</w:t>
+            </w:r>
+            <m:oMath>
+              <m:sSup>
+                <m:sSupPr>
+                  <m:ctrlPr>
+                    <w:rPr>
+                      <w:rFonts w:ascii="Cambria Math" w:hAnsi="Cambria Math" w:cs="宋体"/>
+                      <w:i/>
+                      <w:color w:val="1E0707"/>
+                      <w:kern w:val="0"/>
+                      <w:sz w:val="19"/>
+                      <w:szCs w:val="19"/>
+                      <w:lang w:val="en-US" w:bidi="ar"/>
+                    </w:rPr>
+                  </m:ctrlPr>
+                </m:sSupPr>
+                <m:e>
+                  <m:sSub>
+                    <m:sSubPr>
+                      <m:ctrlPr>
+                        <w:rPr>
+                          <w:rFonts w:ascii="Cambria Math" w:hAnsi="Cambria Math" w:cs="宋体"/>
+                          <w:i/>
+                          <w:color w:val="1E0707"/>
+                          <w:kern w:val="0"/>
+                          <w:sz w:val="19"/>
+                          <w:szCs w:val="19"/>
+                          <w:lang w:val="en-US" w:bidi="ar"/>
+                        </w:rPr>
+                      </m:ctrlPr>
+                    </m:sSubPr>
+                    <m:e>
+                      <m:r>
+                        <m:rPr/>
+                        <w:rPr>
+                          <w:rFonts w:hint="default" w:ascii="Cambria Math" w:hAnsi="Cambria Math" w:cs="宋体"/>
+                          <w:color w:val="1E0707"/>
+                          <w:kern w:val="0"/>
+                          <w:sz w:val="19"/>
+                          <w:szCs w:val="19"/>
+                          <w:lang w:val="en-US" w:eastAsia="zh-CN" w:bidi="ar"/>
+                        </w:rPr>
+                        <m:t>c</m:t>
+                      </m:r>
+                      <m:ctrlPr>
+                        <w:rPr>
+                          <w:rFonts w:ascii="Cambria Math" w:hAnsi="Cambria Math" w:cs="宋体"/>
+                          <w:i/>
+                          <w:color w:val="1E0707"/>
+                          <w:kern w:val="0"/>
+                          <w:sz w:val="19"/>
+                          <w:szCs w:val="19"/>
+                          <w:lang w:val="en-US" w:bidi="ar"/>
+                        </w:rPr>
+                      </m:ctrlPr>
+                    </m:e>
+                    <m:sub>
+                      <m:r>
+                        <m:rPr/>
+                        <w:rPr>
+                          <w:rFonts w:hint="default" w:ascii="Cambria Math" w:hAnsi="Cambria Math" w:cs="宋体"/>
+                          <w:color w:val="1E0707"/>
+                          <w:kern w:val="0"/>
+                          <w:sz w:val="19"/>
+                          <w:szCs w:val="19"/>
+                          <w:lang w:val="en-US" w:eastAsia="zh-CN" w:bidi="ar"/>
+                        </w:rPr>
+                        <m:t>1</m:t>
+                      </m:r>
+                      <m:ctrlPr>
+                        <w:rPr>
+                          <w:rFonts w:ascii="Cambria Math" w:hAnsi="Cambria Math" w:cs="宋体"/>
+                          <w:i/>
+                          <w:color w:val="1E0707"/>
+                          <w:kern w:val="0"/>
+                          <w:sz w:val="19"/>
+                          <w:szCs w:val="19"/>
+                          <w:lang w:val="en-US" w:bidi="ar"/>
+                        </w:rPr>
+                      </m:ctrlPr>
+                    </m:sub>
+                  </m:sSub>
+                  <m:ctrlPr>
+                    <w:rPr>
+                      <w:rFonts w:ascii="Cambria Math" w:hAnsi="Cambria Math" w:cs="宋体"/>
+                      <w:i/>
+                      <w:color w:val="1E0707"/>
+                      <w:kern w:val="0"/>
+                      <w:sz w:val="19"/>
+                      <w:szCs w:val="19"/>
+                      <w:lang w:val="en-US" w:bidi="ar"/>
+                    </w:rPr>
+                  </m:ctrlPr>
+                </m:e>
+                <m:sup>
+                  <m:r>
+                    <m:rPr/>
+                    <w:rPr>
+                      <w:rFonts w:hint="default" w:ascii="Cambria Math" w:hAnsi="Cambria Math" w:cs="宋体"/>
+                      <w:color w:val="1E0707"/>
+                      <w:kern w:val="0"/>
+                      <w:sz w:val="19"/>
+                      <w:szCs w:val="19"/>
+                      <w:lang w:val="en-US" w:eastAsia="zh-CN" w:bidi="ar"/>
+                    </w:rPr>
+                    <m:t>x</m:t>
+                  </m:r>
+                  <m:ctrlPr>
+                    <w:rPr>
+                      <w:rFonts w:ascii="Cambria Math" w:hAnsi="Cambria Math" w:cs="宋体"/>
+                      <w:i/>
+                      <w:color w:val="1E0707"/>
+                      <w:kern w:val="0"/>
+                      <w:sz w:val="19"/>
+                      <w:szCs w:val="19"/>
+                      <w:lang w:val="en-US" w:bidi="ar"/>
+                    </w:rPr>
+                  </m:ctrlPr>
+                </m:sup>
+              </m:sSup>
+            </m:oMath>
+            <w:r>
+              <w:rPr>
+                <w:rFonts w:hint="eastAsia" w:ascii="宋体" w:hAnsi="宋体" w:eastAsia="宋体" w:cs="宋体"/>
+                <w:color w:val="1E0707"/>
+                <w:kern w:val="0"/>
+                <w:sz w:val="19"/>
+                <w:szCs w:val="19"/>
+                <w:lang w:val="en-US" w:eastAsia="zh-CN" w:bidi="ar"/>
+              </w:rPr>
+              <w:t>×</w:t>
+            </w:r>
+            <m:oMath>
+              <m:sSup>
+                <m:sSupPr>
+                  <m:ctrlPr>
+                    <w:rPr>
+                      <w:rFonts w:ascii="Cambria Math" w:hAnsi="Cambria Math" w:cs="宋体"/>
+                      <w:i/>
+                      <w:color w:val="1E0707"/>
+                      <w:kern w:val="0"/>
+                      <w:sz w:val="19"/>
+                      <w:szCs w:val="19"/>
+                      <w:lang w:val="en-US" w:bidi="ar"/>
+                    </w:rPr>
+                  </m:ctrlPr>
+                </m:sSupPr>
+                <m:e>
+                  <m:r>
+                    <m:rPr>
+                      <m:sty m:val="p"/>
+                    </m:rPr>
+                    <w:rPr>
+                      <w:rFonts w:hint="eastAsia" w:ascii="宋体" w:hAnsi="宋体" w:eastAsia="宋体" w:cs="宋体"/>
+                      <w:color w:val="1E0707"/>
+                      <w:kern w:val="0"/>
+                      <w:sz w:val="19"/>
+                      <w:szCs w:val="19"/>
+                      <w:lang w:val="en-US" w:eastAsia="zh-CN" w:bidi="ar"/>
+                    </w:rPr>
+                    <m:t>(</m:t>
+                  </m:r>
+                  <m:sSup>
+                    <m:sSupPr>
+                      <m:ctrlPr>
+                        <w:rPr>
+                          <w:rFonts w:ascii="Cambria Math" w:hAnsi="Cambria Math" w:cs="宋体"/>
+                          <w:i/>
+                          <w:color w:val="1E0707"/>
+                          <w:kern w:val="0"/>
+                          <w:sz w:val="19"/>
+                          <w:szCs w:val="19"/>
+                          <w:lang w:val="en-US" w:bidi="ar"/>
+                        </w:rPr>
+                      </m:ctrlPr>
+                    </m:sSupPr>
+                    <m:e>
+                      <m:sSub>
+                        <m:sSubPr>
+                          <m:ctrlPr>
+                            <w:rPr>
+                              <w:rFonts w:ascii="Cambria Math" w:hAnsi="Cambria Math" w:cs="宋体"/>
+                              <w:i/>
+                              <w:color w:val="1E0707"/>
+                              <w:kern w:val="0"/>
+                              <w:sz w:val="19"/>
+                              <w:szCs w:val="19"/>
+                              <w:lang w:val="en-US" w:bidi="ar"/>
+                            </w:rPr>
+                          </m:ctrlPr>
+                        </m:sSubPr>
+                        <m:e>
+                          <m:r>
+                            <m:rPr/>
+                            <w:rPr>
+                              <w:rFonts w:hint="default" w:ascii="Cambria Math" w:hAnsi="Cambria Math" w:cs="宋体"/>
+                              <w:color w:val="1E0707"/>
+                              <w:kern w:val="0"/>
+                              <w:sz w:val="19"/>
+                              <w:szCs w:val="19"/>
+                              <w:lang w:val="en-US" w:eastAsia="zh-CN" w:bidi="ar"/>
+                            </w:rPr>
+                            <m:t>c</m:t>
+                          </m:r>
+                          <m:ctrlPr>
+                            <w:rPr>
+                              <w:rFonts w:ascii="Cambria Math" w:hAnsi="Cambria Math" w:cs="宋体"/>
+                              <w:i/>
+                              <w:color w:val="1E0707"/>
+                              <w:kern w:val="0"/>
+                              <w:sz w:val="19"/>
+                              <w:szCs w:val="19"/>
+                              <w:lang w:val="en-US" w:bidi="ar"/>
+                            </w:rPr>
+                          </m:ctrlPr>
+                        </m:e>
+                        <m:sub>
+                          <m:r>
+                            <m:rPr/>
+                            <w:rPr>
+                              <w:rFonts w:hint="default" w:ascii="Cambria Math" w:hAnsi="Cambria Math" w:cs="宋体"/>
+                              <w:color w:val="1E0707"/>
+                              <w:kern w:val="0"/>
+                              <w:sz w:val="19"/>
+                              <w:szCs w:val="19"/>
+                              <w:lang w:val="en-US" w:eastAsia="zh-CN" w:bidi="ar"/>
+                            </w:rPr>
+                            <m:t>2</m:t>
+                          </m:r>
+                          <m:ctrlPr>
+                            <w:rPr>
+                              <w:rFonts w:ascii="Cambria Math" w:hAnsi="Cambria Math" w:cs="宋体"/>
+                              <w:i/>
+                              <w:color w:val="1E0707"/>
+                              <w:kern w:val="0"/>
+                              <w:sz w:val="19"/>
+                              <w:szCs w:val="19"/>
+                              <w:lang w:val="en-US" w:bidi="ar"/>
+                            </w:rPr>
+                          </m:ctrlPr>
+                        </m:sub>
+                      </m:sSub>
+                      <m:ctrlPr>
+                        <w:rPr>
+                          <w:rFonts w:ascii="Cambria Math" w:hAnsi="Cambria Math" w:cs="宋体"/>
+                          <w:i/>
+                          <w:color w:val="1E0707"/>
+                          <w:kern w:val="0"/>
+                          <w:sz w:val="19"/>
+                          <w:szCs w:val="19"/>
+                          <w:lang w:val="en-US" w:bidi="ar"/>
+                        </w:rPr>
+                      </m:ctrlPr>
+                    </m:e>
+                    <m:sup>
+                      <m:r>
+                        <m:rPr/>
+                        <w:rPr>
+                          <w:rFonts w:hint="default" w:ascii="Cambria Math" w:hAnsi="Cambria Math" w:cs="宋体"/>
+                          <w:color w:val="1E0707"/>
+                          <w:kern w:val="0"/>
+                          <w:sz w:val="19"/>
+                          <w:szCs w:val="19"/>
+                          <w:lang w:val="en-US" w:eastAsia="zh-CN" w:bidi="ar"/>
+                        </w:rPr>
+                        <m:t>−1</m:t>
+                      </m:r>
+                      <m:ctrlPr>
+                        <w:rPr>
+                          <w:rFonts w:ascii="Cambria Math" w:hAnsi="Cambria Math" w:cs="宋体"/>
+                          <w:i/>
+                          <w:color w:val="1E0707"/>
+                          <w:kern w:val="0"/>
+                          <w:sz w:val="19"/>
+                          <w:szCs w:val="19"/>
+                          <w:lang w:val="en-US" w:bidi="ar"/>
+                        </w:rPr>
+                      </m:ctrlPr>
+                    </m:sup>
+                  </m:sSup>
+                  <m:r>
+                    <m:rPr>
+                      <m:sty m:val="p"/>
+                    </m:rPr>
+                    <w:rPr>
+                      <w:rFonts w:hint="eastAsia" w:ascii="宋体" w:hAnsi="宋体" w:eastAsia="宋体" w:cs="宋体"/>
+                      <w:color w:val="1E0707"/>
+                      <w:kern w:val="0"/>
+                      <w:sz w:val="19"/>
+                      <w:szCs w:val="19"/>
+                      <w:lang w:val="en-US" w:eastAsia="zh-CN" w:bidi="ar"/>
+                    </w:rPr>
+                    <m:t>)</m:t>
+                  </m:r>
+                  <m:ctrlPr>
+                    <w:rPr>
+                      <w:rFonts w:ascii="Cambria Math" w:hAnsi="Cambria Math" w:cs="宋体"/>
+                      <w:i/>
+                      <w:color w:val="1E0707"/>
+                      <w:kern w:val="0"/>
+                      <w:sz w:val="19"/>
+                      <w:szCs w:val="19"/>
+                      <w:lang w:val="en-US" w:bidi="ar"/>
+                    </w:rPr>
+                  </m:ctrlPr>
+                </m:e>
+                <m:sup>
+                  <m:r>
+                    <m:rPr/>
+                    <w:rPr>
+                      <w:rFonts w:hint="default" w:ascii="Cambria Math" w:hAnsi="Cambria Math" w:cs="宋体"/>
+                      <w:color w:val="1E0707"/>
+                      <w:kern w:val="0"/>
+                      <w:sz w:val="19"/>
+                      <w:szCs w:val="19"/>
+                      <w:lang w:val="en-US" w:eastAsia="zh-CN" w:bidi="ar"/>
+                    </w:rPr>
+                    <m:t>−y</m:t>
+                  </m:r>
+                  <m:ctrlPr>
+                    <w:rPr>
+                      <w:rFonts w:ascii="Cambria Math" w:hAnsi="Cambria Math" w:cs="宋体"/>
+                      <w:i/>
+                      <w:color w:val="1E0707"/>
+                      <w:kern w:val="0"/>
+                      <w:sz w:val="19"/>
+                      <w:szCs w:val="19"/>
+                      <w:lang w:val="en-US" w:bidi="ar"/>
+                    </w:rPr>
+                  </m:ctrlPr>
+                </m:sup>
+              </m:sSup>
+            </m:oMath>
+            <w:r>
+              <w:rPr>
+                <w:rFonts w:hint="eastAsia" w:hAnsi="Cambria Math" w:cs="宋体"/>
+                <w:i w:val="0"/>
+                <w:color w:val="1E0707"/>
+                <w:kern w:val="0"/>
+                <w:sz w:val="19"/>
+                <w:szCs w:val="19"/>
+                <w:lang w:val="en-US" w:eastAsia="zh-CN" w:bidi="ar"/>
+              </w:rPr>
+              <w:t xml:space="preserve"> </w:t>
+            </w:r>
+            <w:r>
+              <w:rPr>
+                <w:rFonts w:hint="eastAsia" w:ascii="宋体" w:hAnsi="宋体" w:eastAsia="宋体" w:cs="宋体"/>
+                <w:color w:val="1E0707"/>
+                <w:kern w:val="0"/>
+                <w:sz w:val="19"/>
+                <w:szCs w:val="19"/>
+                <w:lang w:val="en-US" w:eastAsia="zh-CN" w:bidi="ar"/>
+              </w:rPr>
+              <w:t>mod  n计算出明文；</w:t>
+            </w:r>
+          </w:p>
+          <w:p>
+            <w:pPr>
+              <w:keepNext w:val="0"/>
+              <w:keepLines w:val="0"/>
+              <w:widowControl/>
+              <w:suppressLineNumbers w:val="0"/>
+              <w:jc w:val="left"/>
               <w:rPr>
                 <w:bCs/>
                 <w:szCs w:val="21"/>
               </w:rPr>
             </w:pPr>
+            <w:r>
+              <w:rPr>
+                <w:rFonts w:hint="eastAsia" w:ascii="宋体" w:hAnsi="宋体" w:eastAsia="宋体" w:cs="宋体"/>
+                <w:color w:val="1E0707"/>
+                <w:kern w:val="0"/>
+                <w:sz w:val="19"/>
+                <w:szCs w:val="19"/>
+                <w:lang w:val="en-US" w:eastAsia="zh-CN" w:bidi="ar"/>
+              </w:rPr>
+              <w:t>注意处理</w:t>
+            </w:r>
+            <w:r>
+              <w:rPr>
+                <w:rFonts w:hint="eastAsia" w:ascii="宋体" w:hAnsi="宋体" w:cs="宋体"/>
+                <w:color w:val="1E0707"/>
+                <w:kern w:val="0"/>
+                <w:sz w:val="19"/>
+                <w:szCs w:val="19"/>
+                <w:lang w:val="en-US" w:eastAsia="zh-CN" w:bidi="ar"/>
+              </w:rPr>
+              <w:t>y</w:t>
+            </w:r>
+            <w:r>
+              <w:rPr>
+                <w:rFonts w:hint="eastAsia" w:ascii="宋体" w:hAnsi="宋体" w:eastAsia="宋体" w:cs="宋体"/>
+                <w:color w:val="1E0707"/>
+                <w:kern w:val="0"/>
+                <w:sz w:val="19"/>
+                <w:szCs w:val="19"/>
+                <w:lang w:val="en-US" w:eastAsia="zh-CN" w:bidi="ar"/>
+              </w:rPr>
+              <w:t>为负数时，需要对密文求逆元。</w:t>
+            </w:r>
           </w:p>
           <w:p>
             <w:pPr>
@@ -960,70 +2925,7 @@
           </w:p>
           <w:p>
             <w:pPr>
-              <w:rPr>
-                <w:bCs/>
-                <w:szCs w:val="21"/>
-              </w:rPr>
-            </w:pPr>
-          </w:p>
-          <w:p>
-            <w:pPr>
-              <w:rPr>
-                <w:bCs/>
-                <w:szCs w:val="21"/>
-              </w:rPr>
-            </w:pPr>
-          </w:p>
-          <w:p>
-            <w:pPr>
-              <w:rPr>
-                <w:bCs/>
-                <w:szCs w:val="21"/>
-              </w:rPr>
-            </w:pPr>
-          </w:p>
-          <w:p>
-            <w:pPr>
-              <w:rPr>
-                <w:bCs/>
-                <w:szCs w:val="21"/>
-              </w:rPr>
-            </w:pPr>
-          </w:p>
-          <w:p>
-            <w:pPr>
-              <w:rPr>
-                <w:bCs/>
-                <w:szCs w:val="21"/>
-              </w:rPr>
-            </w:pPr>
-          </w:p>
-          <w:p>
-            <w:pPr>
-              <w:rPr>
-                <w:sz w:val="24"/>
-              </w:rPr>
-            </w:pPr>
-          </w:p>
-          <w:p>
-            <w:pPr>
-              <w:spacing w:line="420" w:lineRule="exact"/>
-              <w:rPr>
-                <w:sz w:val="24"/>
-              </w:rPr>
-            </w:pPr>
-          </w:p>
-          <w:p>
-            <w:pPr>
-              <w:rPr>
-                <w:bCs/>
-                <w:szCs w:val="21"/>
-              </w:rPr>
-            </w:pPr>
-          </w:p>
-          <w:p>
-            <w:pPr>
-              <w:ind w:left="-42" w:right="-51"/>
+              <w:ind w:right="-51"/>
               <w:rPr>
                 <w:rFonts w:ascii="宋体" w:hAnsi="宋体"/>
                 <w:b/>
@@ -1041,163 +2943,1778 @@
           </w:p>
           <w:p>
             <w:pPr>
-              <w:rPr>
+              <w:keepNext w:val="0"/>
+              <w:keepLines w:val="0"/>
+              <w:widowControl/>
+              <w:suppressLineNumbers w:val="0"/>
+              <w:jc w:val="left"/>
+              <w:rPr>
+                <w:rFonts w:hint="eastAsia" w:ascii="宋体" w:hAnsi="宋体" w:eastAsia="宋体" w:cs="宋体"/>
+                <w:b/>
                 <w:bCs/>
-                <w:szCs w:val="21"/>
-              </w:rPr>
-            </w:pPr>
-          </w:p>
-          <w:p>
-            <w:pPr>
-              <w:rPr>
+                <w:color w:val="1E0707"/>
+                <w:kern w:val="0"/>
+                <w:sz w:val="19"/>
+                <w:szCs w:val="19"/>
+                <w:lang w:val="en-US" w:eastAsia="zh-CN" w:bidi="ar"/>
+              </w:rPr>
+            </w:pPr>
+            <w:r>
+              <w:rPr>
+                <w:rFonts w:hint="eastAsia" w:ascii="宋体" w:hAnsi="宋体" w:eastAsia="宋体" w:cs="宋体"/>
+                <w:b/>
                 <w:bCs/>
-                <w:szCs w:val="21"/>
-              </w:rPr>
-            </w:pPr>
-          </w:p>
-          <w:p>
-            <w:pPr>
-              <w:rPr>
+                <w:color w:val="1E0707"/>
+                <w:kern w:val="0"/>
+                <w:sz w:val="19"/>
+                <w:szCs w:val="19"/>
+                <w:lang w:val="en-US" w:eastAsia="zh-CN" w:bidi="ar"/>
+              </w:rPr>
+              <w:t>1、实现RSA算法实现函数：</w:t>
+            </w:r>
+          </w:p>
+          <w:p>
+            <w:pPr>
+              <w:keepNext w:val="0"/>
+              <w:keepLines w:val="0"/>
+              <w:widowControl/>
+              <w:suppressLineNumbers w:val="0"/>
+              <w:jc w:val="left"/>
+              <w:rPr>
+                <w:rFonts w:hint="eastAsia" w:ascii="宋体" w:hAnsi="宋体" w:cs="宋体"/>
+                <w:color w:val="1E0707"/>
+                <w:kern w:val="0"/>
+                <w:sz w:val="19"/>
+                <w:szCs w:val="19"/>
+                <w:lang w:val="en-US" w:eastAsia="zh-CN" w:bidi="ar"/>
+              </w:rPr>
+            </w:pPr>
+            <w:r>
+              <w:rPr>
+                <w:rFonts w:hint="eastAsia" w:ascii="宋体" w:hAnsi="宋体" w:cs="宋体"/>
+                <w:color w:val="1E0707"/>
+                <w:kern w:val="0"/>
+                <w:sz w:val="19"/>
+                <w:szCs w:val="19"/>
+                <w:lang w:val="en-US" w:eastAsia="zh-CN" w:bidi="ar"/>
+              </w:rPr>
+              <w:t>def</w:t>
+            </w:r>
+            <w:r>
+              <w:rPr>
+                <w:rFonts w:hint="eastAsia" w:ascii="宋体" w:hAnsi="宋体" w:cs="宋体"/>
+                <w:color w:val="1E0707"/>
+                <w:kern w:val="0"/>
+                <w:sz w:val="19"/>
+                <w:szCs w:val="19"/>
+                <w:lang w:val="en-US" w:eastAsia="zh-CN" w:bidi="ar"/>
+              </w:rPr>
+              <w:t xml:space="preserve"> multiplicative_inverse(e,phi)：</w:t>
+            </w:r>
+          </w:p>
+          <w:p>
+            <w:pPr>
+              <w:keepNext w:val="0"/>
+              <w:keepLines w:val="0"/>
+              <w:widowControl/>
+              <w:suppressLineNumbers w:val="0"/>
+              <w:jc w:val="left"/>
+              <w:rPr>
+                <w:rFonts w:hint="eastAsia" w:ascii="宋体" w:hAnsi="宋体" w:cs="宋体"/>
+                <w:color w:val="1E0707"/>
+                <w:kern w:val="0"/>
+                <w:sz w:val="19"/>
+                <w:szCs w:val="19"/>
+                <w:lang w:val="en-US" w:eastAsia="zh-CN" w:bidi="ar"/>
+              </w:rPr>
+            </w:pPr>
+            <w:r>
+              <w:rPr>
+                <w:rFonts w:hint="eastAsia" w:ascii="宋体" w:hAnsi="宋体" w:cs="宋体"/>
+                <w:color w:val="1E0707"/>
+                <w:kern w:val="0"/>
+                <w:sz w:val="19"/>
+                <w:szCs w:val="19"/>
+                <w:lang w:val="en-US" w:eastAsia="zh-CN" w:bidi="ar"/>
+              </w:rPr>
+              <w:t>使用扩展欧几里得算法递归地求e关于ϕ的模反元素。</w:t>
+            </w:r>
+          </w:p>
+          <w:p>
+            <w:pPr>
+              <w:keepNext w:val="0"/>
+              <w:keepLines w:val="0"/>
+              <w:widowControl/>
+              <w:suppressLineNumbers w:val="0"/>
+              <w:jc w:val="left"/>
+              <w:rPr>
+                <w:rFonts w:hint="eastAsia" w:ascii="宋体" w:hAnsi="宋体" w:cs="宋体"/>
+                <w:color w:val="1E0707"/>
+                <w:kern w:val="0"/>
+                <w:sz w:val="19"/>
+                <w:szCs w:val="19"/>
+                <w:lang w:val="en-US" w:eastAsia="zh-CN" w:bidi="ar"/>
+              </w:rPr>
+            </w:pPr>
+            <w:r>
+              <w:rPr>
+                <w:rFonts w:hint="eastAsia" w:ascii="宋体" w:hAnsi="宋体" w:cs="宋体"/>
+                <w:color w:val="1E0707"/>
+                <w:kern w:val="0"/>
+                <w:sz w:val="19"/>
+                <w:szCs w:val="19"/>
+                <w:lang w:val="en-US" w:eastAsia="zh-CN" w:bidi="ar"/>
+              </w:rPr>
+              <w:t>通过递归计算上一层的结果，回推得到当前的 x,y。</w:t>
+            </w:r>
+          </w:p>
+          <w:p>
+            <w:pPr>
+              <w:keepNext w:val="0"/>
+              <w:keepLines w:val="0"/>
+              <w:widowControl/>
+              <w:suppressLineNumbers w:val="0"/>
+              <w:jc w:val="left"/>
+              <w:rPr>
+                <w:rFonts w:hint="eastAsia" w:ascii="宋体" w:hAnsi="宋体" w:cs="宋体"/>
+                <w:color w:val="1E0707"/>
+                <w:kern w:val="0"/>
+                <w:sz w:val="19"/>
+                <w:szCs w:val="19"/>
+                <w:lang w:val="en-US" w:eastAsia="zh-CN" w:bidi="ar"/>
+              </w:rPr>
+            </w:pPr>
+            <w:r>
+              <w:rPr>
+                <w:rFonts w:hint="eastAsia" w:ascii="宋体" w:hAnsi="宋体" w:cs="宋体"/>
+                <w:color w:val="1E0707"/>
+                <w:kern w:val="0"/>
+                <w:sz w:val="19"/>
+                <w:szCs w:val="19"/>
+                <w:lang w:val="en-US" w:eastAsia="zh-CN" w:bidi="ar"/>
+              </w:rPr>
+              <w:t>返回x，即e的逆元</w:t>
+            </w:r>
+          </w:p>
+          <w:p>
+            <w:pPr>
+              <w:keepNext w:val="0"/>
+              <w:keepLines w:val="0"/>
+              <w:widowControl/>
+              <w:suppressLineNumbers w:val="0"/>
+              <w:jc w:val="left"/>
+              <w:rPr>
+                <w:rFonts w:hint="eastAsia" w:ascii="宋体" w:hAnsi="宋体" w:eastAsia="宋体" w:cs="宋体"/>
+                <w:color w:val="1E0707"/>
+                <w:kern w:val="0"/>
+                <w:sz w:val="19"/>
+                <w:szCs w:val="19"/>
+                <w:lang w:val="en-US" w:eastAsia="zh-CN" w:bidi="ar"/>
+              </w:rPr>
+            </w:pPr>
+          </w:p>
+          <w:p>
+            <w:pPr>
+              <w:keepNext w:val="0"/>
+              <w:keepLines w:val="0"/>
+              <w:widowControl/>
+              <w:suppressLineNumbers w:val="0"/>
+              <w:jc w:val="left"/>
+              <w:rPr>
+                <w:rFonts w:hint="eastAsia" w:ascii="宋体" w:hAnsi="宋体" w:cs="宋体"/>
+                <w:color w:val="1E0707"/>
+                <w:kern w:val="0"/>
+                <w:sz w:val="19"/>
+                <w:szCs w:val="19"/>
+                <w:lang w:val="en-US" w:eastAsia="zh-CN" w:bidi="ar"/>
+              </w:rPr>
+            </w:pPr>
+            <w:r>
+              <w:rPr>
+                <w:rFonts w:hint="eastAsia" w:ascii="宋体" w:hAnsi="宋体" w:cs="宋体"/>
+                <w:color w:val="1E0707"/>
+                <w:kern w:val="0"/>
+                <w:sz w:val="19"/>
+                <w:szCs w:val="19"/>
+                <w:lang w:val="en-US" w:eastAsia="zh-CN" w:bidi="ar"/>
+              </w:rPr>
+              <w:t>def</w:t>
+            </w:r>
+            <w:r>
+              <w:rPr>
+                <w:rFonts w:hint="eastAsia" w:ascii="宋体" w:hAnsi="宋体" w:cs="宋体"/>
+                <w:color w:val="1E0707"/>
+                <w:kern w:val="0"/>
+                <w:sz w:val="19"/>
+                <w:szCs w:val="19"/>
+                <w:lang w:val="en-US" w:eastAsia="zh-CN" w:bidi="ar"/>
+              </w:rPr>
+              <w:t xml:space="preserve"> key_generation(p,q)</w:t>
+            </w:r>
+            <w:r>
+              <w:rPr>
+                <w:rFonts w:hint="eastAsia" w:ascii="宋体" w:hAnsi="宋体" w:cs="宋体"/>
+                <w:color w:val="1E0707"/>
+                <w:kern w:val="0"/>
+                <w:sz w:val="19"/>
+                <w:szCs w:val="19"/>
+                <w:lang w:val="en-US" w:eastAsia="zh-CN" w:bidi="ar"/>
+              </w:rPr>
+              <w:t>：</w:t>
+            </w:r>
+          </w:p>
+          <w:p>
+            <w:pPr>
+              <w:keepNext w:val="0"/>
+              <w:keepLines w:val="0"/>
+              <w:widowControl/>
+              <w:suppressLineNumbers w:val="0"/>
+              <w:jc w:val="left"/>
+              <w:rPr>
+                <w:rFonts w:hint="eastAsia" w:ascii="宋体" w:hAnsi="宋体" w:cs="宋体"/>
+                <w:color w:val="1E0707"/>
+                <w:kern w:val="0"/>
+                <w:sz w:val="19"/>
+                <w:szCs w:val="19"/>
+                <w:lang w:val="en-US" w:eastAsia="zh-CN" w:bidi="ar"/>
+              </w:rPr>
+            </w:pPr>
+            <w:r>
+              <w:rPr>
+                <w:rFonts w:hint="eastAsia" w:ascii="宋体" w:hAnsi="宋体" w:cs="宋体"/>
+                <w:color w:val="1E0707"/>
+                <w:kern w:val="0"/>
+                <w:sz w:val="19"/>
+                <w:szCs w:val="19"/>
+                <w:lang w:val="en-US" w:eastAsia="zh-CN" w:bidi="ar"/>
+              </w:rPr>
+              <w:t>随机选取两个质数 p,q，计算模数 n=p×q。</w:t>
+            </w:r>
+          </w:p>
+          <w:p>
+            <w:pPr>
+              <w:keepNext w:val="0"/>
+              <w:keepLines w:val="0"/>
+              <w:widowControl/>
+              <w:suppressLineNumbers w:val="0"/>
+              <w:jc w:val="left"/>
+              <w:rPr>
+                <w:rFonts w:hint="eastAsia" w:ascii="宋体" w:hAnsi="宋体" w:cs="宋体"/>
+                <w:color w:val="1E0707"/>
+                <w:kern w:val="0"/>
+                <w:sz w:val="19"/>
+                <w:szCs w:val="19"/>
+                <w:lang w:val="en-US" w:eastAsia="zh-CN" w:bidi="ar"/>
+              </w:rPr>
+            </w:pPr>
+            <w:r>
+              <w:rPr>
+                <w:rFonts w:hint="eastAsia" w:ascii="宋体" w:hAnsi="宋体" w:cs="宋体"/>
+                <w:color w:val="1E0707"/>
+                <w:kern w:val="0"/>
+                <w:sz w:val="19"/>
+                <w:szCs w:val="19"/>
+                <w:lang w:val="en-US" w:eastAsia="zh-CN" w:bidi="ar"/>
+              </w:rPr>
+              <w:t>计算 ϕ(n)=(p−1)(q−1)。</w:t>
+            </w:r>
+          </w:p>
+          <w:p>
+            <w:pPr>
+              <w:keepNext w:val="0"/>
+              <w:keepLines w:val="0"/>
+              <w:widowControl/>
+              <w:suppressLineNumbers w:val="0"/>
+              <w:jc w:val="left"/>
+              <w:rPr>
+                <w:rFonts w:hint="eastAsia" w:ascii="宋体" w:hAnsi="宋体" w:cs="宋体"/>
+                <w:color w:val="1E0707"/>
+                <w:kern w:val="0"/>
+                <w:sz w:val="19"/>
+                <w:szCs w:val="19"/>
+                <w:lang w:val="en-US" w:eastAsia="zh-CN" w:bidi="ar"/>
+              </w:rPr>
+            </w:pPr>
+            <w:r>
+              <w:rPr>
+                <w:rFonts w:hint="eastAsia" w:ascii="宋体" w:hAnsi="宋体" w:cs="宋体"/>
+                <w:color w:val="1E0707"/>
+                <w:kern w:val="0"/>
+                <w:sz w:val="19"/>
+                <w:szCs w:val="19"/>
+                <w:lang w:val="en-US" w:eastAsia="zh-CN" w:bidi="ar"/>
+              </w:rPr>
+              <w:t>随机选择一个与 ϕ(n)互质的e。</w:t>
+            </w:r>
+          </w:p>
+          <w:p>
+            <w:pPr>
+              <w:keepNext w:val="0"/>
+              <w:keepLines w:val="0"/>
+              <w:widowControl/>
+              <w:suppressLineNumbers w:val="0"/>
+              <w:jc w:val="left"/>
+              <w:rPr>
+                <w:rFonts w:hint="eastAsia" w:ascii="宋体" w:hAnsi="宋体" w:cs="宋体"/>
+                <w:color w:val="1E0707"/>
+                <w:kern w:val="0"/>
+                <w:sz w:val="19"/>
+                <w:szCs w:val="19"/>
+                <w:lang w:val="en-US" w:eastAsia="zh-CN" w:bidi="ar"/>
+              </w:rPr>
+            </w:pPr>
+            <w:r>
+              <w:rPr>
+                <w:rFonts w:hint="eastAsia" w:ascii="宋体" w:hAnsi="宋体" w:cs="宋体"/>
+                <w:color w:val="1E0707"/>
+                <w:kern w:val="0"/>
+                <w:sz w:val="19"/>
+                <w:szCs w:val="19"/>
+                <w:lang w:val="en-US" w:eastAsia="zh-CN" w:bidi="ar"/>
+              </w:rPr>
+              <w:t>调用 multiplicative_inverse 计算私钥指数d。</w:t>
+            </w:r>
+          </w:p>
+          <w:p>
+            <w:pPr>
+              <w:keepNext w:val="0"/>
+              <w:keepLines w:val="0"/>
+              <w:widowControl/>
+              <w:suppressLineNumbers w:val="0"/>
+              <w:jc w:val="left"/>
+              <w:rPr>
+                <w:rFonts w:hint="eastAsia" w:ascii="宋体" w:hAnsi="宋体" w:cs="宋体"/>
+                <w:color w:val="1E0707"/>
+                <w:kern w:val="0"/>
+                <w:sz w:val="19"/>
+                <w:szCs w:val="19"/>
+                <w:lang w:val="en-US" w:eastAsia="zh-CN" w:bidi="ar"/>
+              </w:rPr>
+            </w:pPr>
+            <w:r>
+              <w:rPr>
+                <w:rFonts w:hint="eastAsia" w:ascii="宋体" w:hAnsi="宋体" w:cs="宋体"/>
+                <w:color w:val="1E0707"/>
+                <w:kern w:val="0"/>
+                <w:sz w:val="19"/>
+                <w:szCs w:val="19"/>
+                <w:lang w:val="en-US" w:eastAsia="zh-CN" w:bidi="ar"/>
+              </w:rPr>
+              <w:t>返回公钥 (e, n) 和私钥 (d, n)。</w:t>
+            </w:r>
+          </w:p>
+          <w:p>
+            <w:pPr>
+              <w:keepNext w:val="0"/>
+              <w:keepLines w:val="0"/>
+              <w:widowControl/>
+              <w:suppressLineNumbers w:val="0"/>
+              <w:jc w:val="left"/>
+              <w:rPr>
+                <w:rFonts w:hint="eastAsia" w:ascii="宋体" w:hAnsi="宋体" w:cs="宋体"/>
+                <w:color w:val="1E0707"/>
+                <w:kern w:val="0"/>
+                <w:sz w:val="19"/>
+                <w:szCs w:val="19"/>
+                <w:lang w:val="en-US" w:eastAsia="zh-CN" w:bidi="ar"/>
+              </w:rPr>
+            </w:pPr>
+          </w:p>
+          <w:p>
+            <w:pPr>
+              <w:keepNext w:val="0"/>
+              <w:keepLines w:val="0"/>
+              <w:widowControl/>
+              <w:suppressLineNumbers w:val="0"/>
+              <w:jc w:val="left"/>
+              <w:rPr>
+                <w:rFonts w:hint="eastAsia" w:ascii="宋体" w:hAnsi="宋体" w:cs="宋体"/>
+                <w:color w:val="1E0707"/>
+                <w:kern w:val="0"/>
+                <w:sz w:val="19"/>
+                <w:szCs w:val="19"/>
+                <w:lang w:val="en-US" w:eastAsia="zh-CN" w:bidi="ar"/>
+              </w:rPr>
+            </w:pPr>
+            <w:r>
+              <w:rPr>
+                <w:rFonts w:hint="eastAsia" w:ascii="宋体" w:hAnsi="宋体" w:cs="宋体"/>
+                <w:color w:val="1E0707"/>
+                <w:kern w:val="0"/>
+                <w:sz w:val="19"/>
+                <w:szCs w:val="19"/>
+                <w:lang w:val="en-US" w:eastAsia="zh-CN" w:bidi="ar"/>
+              </w:rPr>
+              <w:t>def</w:t>
+            </w:r>
+            <w:r>
+              <w:rPr>
+                <w:rFonts w:hint="eastAsia" w:ascii="宋体" w:hAnsi="宋体" w:cs="宋体"/>
+                <w:color w:val="1E0707"/>
+                <w:kern w:val="0"/>
+                <w:sz w:val="19"/>
+                <w:szCs w:val="19"/>
+                <w:lang w:val="en-US" w:eastAsia="zh-CN" w:bidi="ar"/>
+              </w:rPr>
+              <w:t xml:space="preserve"> encrypt(pk,plaintext)</w:t>
+            </w:r>
+            <w:r>
+              <w:rPr>
+                <w:rFonts w:hint="eastAsia" w:ascii="宋体" w:hAnsi="宋体" w:cs="宋体"/>
+                <w:color w:val="1E0707"/>
+                <w:kern w:val="0"/>
+                <w:sz w:val="19"/>
+                <w:szCs w:val="19"/>
+                <w:lang w:val="en-US" w:eastAsia="zh-CN" w:bidi="ar"/>
+              </w:rPr>
+              <w:t>:</w:t>
+            </w:r>
+          </w:p>
+          <w:p>
+            <w:pPr>
+              <w:keepNext w:val="0"/>
+              <w:keepLines w:val="0"/>
+              <w:widowControl/>
+              <w:suppressLineNumbers w:val="0"/>
+              <w:jc w:val="left"/>
+              <w:rPr>
+                <w:rFonts w:hint="eastAsia" w:ascii="宋体" w:hAnsi="宋体" w:cs="宋体"/>
+                <w:color w:val="1E0707"/>
+                <w:kern w:val="0"/>
+                <w:sz w:val="19"/>
+                <w:szCs w:val="19"/>
+                <w:lang w:val="en-US" w:eastAsia="zh-CN" w:bidi="ar"/>
+              </w:rPr>
+            </w:pPr>
+            <w:r>
+              <w:rPr>
+                <w:rFonts w:hint="eastAsia" w:ascii="宋体" w:hAnsi="宋体" w:cs="宋体"/>
+                <w:color w:val="1E0707"/>
+                <w:kern w:val="0"/>
+                <w:sz w:val="19"/>
+                <w:szCs w:val="19"/>
+                <w:lang w:val="en-US" w:eastAsia="zh-CN" w:bidi="ar"/>
+              </w:rPr>
+              <w:t>将明文字符串编码成字节，再转成整数m。</w:t>
+            </w:r>
+          </w:p>
+          <w:p>
+            <w:pPr>
+              <w:keepNext w:val="0"/>
+              <w:keepLines w:val="0"/>
+              <w:widowControl/>
+              <w:suppressLineNumbers w:val="0"/>
+              <w:jc w:val="left"/>
+              <w:rPr>
+                <w:rFonts w:hint="eastAsia" w:ascii="宋体" w:hAnsi="宋体" w:cs="宋体"/>
+                <w:color w:val="1E0707"/>
+                <w:kern w:val="0"/>
+                <w:sz w:val="19"/>
+                <w:szCs w:val="19"/>
+                <w:lang w:val="en-US" w:eastAsia="zh-CN" w:bidi="ar"/>
+              </w:rPr>
+            </w:pPr>
+            <w:r>
+              <w:rPr>
+                <w:rFonts w:hint="eastAsia" w:ascii="宋体" w:hAnsi="宋体" w:cs="宋体"/>
+                <w:color w:val="1E0707"/>
+                <w:kern w:val="0"/>
+                <w:sz w:val="19"/>
+                <w:szCs w:val="19"/>
+                <w:lang w:val="en-US" w:eastAsia="zh-CN" w:bidi="ar"/>
+              </w:rPr>
+              <w:t>使用公钥 (e, n) 进行快速幂加密：c=</w:t>
+            </w:r>
+            <m:oMath>
+              <m:sSup>
+                <m:sSupPr>
+                  <m:ctrlPr>
+                    <w:rPr>
+                      <w:rFonts w:hint="eastAsia" w:ascii="Cambria Math" w:hAnsi="Cambria Math" w:cs="宋体"/>
+                      <w:color w:val="1E0707"/>
+                      <w:kern w:val="0"/>
+                      <w:sz w:val="19"/>
+                      <w:szCs w:val="19"/>
+                      <w:lang w:val="en-US" w:eastAsia="zh-CN" w:bidi="ar"/>
+                    </w:rPr>
+                  </m:ctrlPr>
+                </m:sSupPr>
+                <m:e>
+                  <m:r>
+                    <m:rPr>
+                      <m:sty m:val="p"/>
+                    </m:rPr>
+                    <w:rPr>
+                      <w:rFonts w:hint="default" w:ascii="Cambria Math" w:hAnsi="Cambria Math" w:cs="宋体"/>
+                      <w:color w:val="1E0707"/>
+                      <w:kern w:val="0"/>
+                      <w:sz w:val="19"/>
+                      <w:szCs w:val="19"/>
+                      <w:lang w:val="en-US" w:eastAsia="zh-CN" w:bidi="ar"/>
+                    </w:rPr>
+                    <m:t>m</m:t>
+                  </m:r>
+                  <m:ctrlPr>
+                    <w:rPr>
+                      <w:rFonts w:hint="eastAsia" w:ascii="Cambria Math" w:hAnsi="Cambria Math" w:cs="宋体"/>
+                      <w:color w:val="1E0707"/>
+                      <w:kern w:val="0"/>
+                      <w:sz w:val="19"/>
+                      <w:szCs w:val="19"/>
+                      <w:lang w:val="en-US" w:eastAsia="zh-CN" w:bidi="ar"/>
+                    </w:rPr>
+                  </m:ctrlPr>
+                </m:e>
+                <m:sup>
+                  <m:r>
+                    <m:rPr>
+                      <m:sty m:val="p"/>
+                    </m:rPr>
+                    <w:rPr>
+                      <w:rFonts w:hint="default" w:ascii="Cambria Math" w:hAnsi="Cambria Math" w:cs="宋体"/>
+                      <w:color w:val="1E0707"/>
+                      <w:kern w:val="0"/>
+                      <w:sz w:val="19"/>
+                      <w:szCs w:val="19"/>
+                      <w:lang w:val="en-US" w:eastAsia="zh-CN" w:bidi="ar"/>
+                    </w:rPr>
+                    <m:t>e</m:t>
+                  </m:r>
+                  <m:ctrlPr>
+                    <w:rPr>
+                      <w:rFonts w:hint="eastAsia" w:ascii="Cambria Math" w:hAnsi="Cambria Math" w:cs="宋体"/>
+                      <w:color w:val="1E0707"/>
+                      <w:kern w:val="0"/>
+                      <w:sz w:val="19"/>
+                      <w:szCs w:val="19"/>
+                      <w:lang w:val="en-US" w:eastAsia="zh-CN" w:bidi="ar"/>
+                    </w:rPr>
+                  </m:ctrlPr>
+                </m:sup>
+              </m:sSup>
+            </m:oMath>
+            <w:r>
+              <w:rPr>
+                <w:rFonts w:hint="eastAsia" w:ascii="宋体" w:hAnsi="宋体" w:cs="宋体"/>
+                <w:color w:val="1E0707"/>
+                <w:kern w:val="0"/>
+                <w:sz w:val="19"/>
+                <w:szCs w:val="19"/>
+                <w:lang w:val="en-US" w:eastAsia="zh-CN" w:bidi="ar"/>
+              </w:rPr>
+              <w:t>mod  n。</w:t>
+            </w:r>
+          </w:p>
+          <w:p>
+            <w:pPr>
+              <w:keepNext w:val="0"/>
+              <w:keepLines w:val="0"/>
+              <w:widowControl/>
+              <w:suppressLineNumbers w:val="0"/>
+              <w:jc w:val="left"/>
+              <w:rPr>
+                <w:rFonts w:hint="eastAsia" w:ascii="宋体" w:hAnsi="宋体" w:cs="宋体"/>
+                <w:color w:val="1E0707"/>
+                <w:kern w:val="0"/>
+                <w:sz w:val="19"/>
+                <w:szCs w:val="19"/>
+                <w:lang w:val="en-US" w:eastAsia="zh-CN" w:bidi="ar"/>
+              </w:rPr>
+            </w:pPr>
+            <w:r>
+              <w:rPr>
+                <w:rFonts w:hint="eastAsia" w:ascii="宋体" w:hAnsi="宋体" w:cs="宋体"/>
+                <w:color w:val="1E0707"/>
+                <w:kern w:val="0"/>
+                <w:sz w:val="19"/>
+                <w:szCs w:val="19"/>
+                <w:lang w:val="en-US" w:eastAsia="zh-CN" w:bidi="ar"/>
+              </w:rPr>
+              <w:t>返回加密后的密文整数c。</w:t>
+            </w:r>
+          </w:p>
+          <w:p>
+            <w:pPr>
+              <w:keepNext w:val="0"/>
+              <w:keepLines w:val="0"/>
+              <w:widowControl/>
+              <w:suppressLineNumbers w:val="0"/>
+              <w:jc w:val="left"/>
+              <w:rPr>
+                <w:rFonts w:hint="default" w:ascii="宋体" w:hAnsi="宋体" w:cs="宋体"/>
+                <w:color w:val="1E0707"/>
+                <w:kern w:val="0"/>
+                <w:sz w:val="19"/>
+                <w:szCs w:val="19"/>
+                <w:lang w:val="en-US" w:eastAsia="zh-CN" w:bidi="ar"/>
+              </w:rPr>
+            </w:pPr>
+            <w:r>
+              <w:rPr>
+                <w:rFonts w:hint="eastAsia" w:ascii="宋体" w:hAnsi="宋体" w:cs="宋体"/>
+                <w:color w:val="1E0707"/>
+                <w:kern w:val="0"/>
+                <w:sz w:val="19"/>
+                <w:szCs w:val="19"/>
+                <w:lang w:val="en-US" w:eastAsia="zh-CN" w:bidi="ar"/>
+              </w:rPr>
+              <w:t xml:space="preserve"> </w:t>
+            </w:r>
+          </w:p>
+          <w:p>
+            <w:pPr>
+              <w:keepNext w:val="0"/>
+              <w:keepLines w:val="0"/>
+              <w:widowControl/>
+              <w:suppressLineNumbers w:val="0"/>
+              <w:jc w:val="left"/>
+              <w:rPr>
+                <w:rFonts w:hint="eastAsia" w:ascii="宋体" w:hAnsi="宋体" w:cs="宋体"/>
+                <w:color w:val="1E0707"/>
+                <w:kern w:val="0"/>
+                <w:sz w:val="19"/>
+                <w:szCs w:val="19"/>
+                <w:lang w:val="en-US" w:eastAsia="zh-CN" w:bidi="ar"/>
+              </w:rPr>
+            </w:pPr>
+            <w:r>
+              <w:rPr>
+                <w:rFonts w:hint="eastAsia" w:ascii="宋体" w:hAnsi="宋体" w:cs="宋体"/>
+                <w:color w:val="1E0707"/>
+                <w:kern w:val="0"/>
+                <w:sz w:val="19"/>
+                <w:szCs w:val="19"/>
+                <w:lang w:val="en-US" w:eastAsia="zh-CN" w:bidi="ar"/>
+              </w:rPr>
+              <w:t>def</w:t>
+            </w:r>
+            <w:r>
+              <w:rPr>
+                <w:rFonts w:hint="eastAsia" w:ascii="宋体" w:hAnsi="宋体" w:cs="宋体"/>
+                <w:color w:val="1E0707"/>
+                <w:kern w:val="0"/>
+                <w:sz w:val="19"/>
+                <w:szCs w:val="19"/>
+                <w:lang w:val="en-US" w:eastAsia="zh-CN" w:bidi="ar"/>
+              </w:rPr>
+              <w:t xml:space="preserve"> decrypt(sk,ciphertext)</w:t>
+            </w:r>
+            <w:r>
+              <w:rPr>
+                <w:rFonts w:hint="eastAsia" w:ascii="宋体" w:hAnsi="宋体" w:cs="宋体"/>
+                <w:color w:val="1E0707"/>
+                <w:kern w:val="0"/>
+                <w:sz w:val="19"/>
+                <w:szCs w:val="19"/>
+                <w:lang w:val="en-US" w:eastAsia="zh-CN" w:bidi="ar"/>
+              </w:rPr>
+              <w:t>:</w:t>
+            </w:r>
+          </w:p>
+          <w:p>
+            <w:pPr>
+              <w:keepNext w:val="0"/>
+              <w:keepLines w:val="0"/>
+              <w:widowControl/>
+              <w:suppressLineNumbers w:val="0"/>
+              <w:jc w:val="left"/>
+              <w:rPr>
+                <w:rFonts w:hint="eastAsia" w:ascii="宋体" w:hAnsi="宋体" w:cs="宋体"/>
+                <w:color w:val="1E0707"/>
+                <w:kern w:val="0"/>
+                <w:sz w:val="19"/>
+                <w:szCs w:val="19"/>
+                <w:lang w:val="en-US" w:eastAsia="zh-CN" w:bidi="ar"/>
+              </w:rPr>
+            </w:pPr>
+            <w:r>
+              <w:rPr>
+                <w:rFonts w:hint="eastAsia" w:ascii="宋体" w:hAnsi="宋体" w:cs="宋体"/>
+                <w:color w:val="1E0707"/>
+                <w:kern w:val="0"/>
+                <w:sz w:val="19"/>
+                <w:szCs w:val="19"/>
+                <w:lang w:val="en-US" w:eastAsia="zh-CN" w:bidi="ar"/>
+              </w:rPr>
+              <w:t>使用私钥 (d, n) 进行快速幂解密：m=</w:t>
+            </w:r>
+            <m:oMath>
+              <m:sSup>
+                <m:sSupPr>
+                  <m:ctrlPr>
+                    <w:rPr>
+                      <w:rFonts w:ascii="Cambria Math" w:hAnsi="Cambria Math" w:cs="宋体"/>
+                      <w:i/>
+                      <w:color w:val="1E0707"/>
+                      <w:kern w:val="0"/>
+                      <w:sz w:val="19"/>
+                      <w:szCs w:val="19"/>
+                      <w:lang w:val="en-US" w:bidi="ar"/>
+                    </w:rPr>
+                  </m:ctrlPr>
+                </m:sSupPr>
+                <m:e>
+                  <m:r>
+                    <m:rPr/>
+                    <w:rPr>
+                      <w:rFonts w:hint="default" w:ascii="Cambria Math" w:hAnsi="Cambria Math" w:cs="宋体"/>
+                      <w:color w:val="1E0707"/>
+                      <w:kern w:val="0"/>
+                      <w:sz w:val="19"/>
+                      <w:szCs w:val="19"/>
+                      <w:lang w:val="en-US" w:eastAsia="zh-CN" w:bidi="ar"/>
+                    </w:rPr>
+                    <m:t>c</m:t>
+                  </m:r>
+                  <m:ctrlPr>
+                    <w:rPr>
+                      <w:rFonts w:ascii="Cambria Math" w:hAnsi="Cambria Math" w:cs="宋体"/>
+                      <w:i/>
+                      <w:color w:val="1E0707"/>
+                      <w:kern w:val="0"/>
+                      <w:sz w:val="19"/>
+                      <w:szCs w:val="19"/>
+                      <w:lang w:val="en-US" w:bidi="ar"/>
+                    </w:rPr>
+                  </m:ctrlPr>
+                </m:e>
+                <m:sup>
+                  <m:r>
+                    <m:rPr/>
+                    <w:rPr>
+                      <w:rFonts w:hint="default" w:ascii="Cambria Math" w:hAnsi="Cambria Math" w:cs="宋体"/>
+                      <w:color w:val="1E0707"/>
+                      <w:kern w:val="0"/>
+                      <w:sz w:val="19"/>
+                      <w:szCs w:val="19"/>
+                      <w:lang w:val="en-US" w:eastAsia="zh-CN" w:bidi="ar"/>
+                    </w:rPr>
+                    <m:t>d</m:t>
+                  </m:r>
+                  <m:ctrlPr>
+                    <w:rPr>
+                      <w:rFonts w:ascii="Cambria Math" w:hAnsi="Cambria Math" w:cs="宋体"/>
+                      <w:i/>
+                      <w:color w:val="1E0707"/>
+                      <w:kern w:val="0"/>
+                      <w:sz w:val="19"/>
+                      <w:szCs w:val="19"/>
+                      <w:lang w:val="en-US" w:bidi="ar"/>
+                    </w:rPr>
+                  </m:ctrlPr>
+                </m:sup>
+              </m:sSup>
+            </m:oMath>
+            <w:r>
+              <w:rPr>
+                <w:rFonts w:hint="eastAsia" w:ascii="宋体" w:hAnsi="宋体" w:cs="宋体"/>
+                <w:color w:val="1E0707"/>
+                <w:kern w:val="0"/>
+                <w:sz w:val="19"/>
+                <w:szCs w:val="19"/>
+                <w:lang w:val="en-US" w:eastAsia="zh-CN" w:bidi="ar"/>
+              </w:rPr>
+              <w:t>mod  n。</w:t>
+            </w:r>
+          </w:p>
+          <w:p>
+            <w:pPr>
+              <w:keepNext w:val="0"/>
+              <w:keepLines w:val="0"/>
+              <w:widowControl/>
+              <w:suppressLineNumbers w:val="0"/>
+              <w:jc w:val="left"/>
+              <w:rPr>
+                <w:rFonts w:hint="eastAsia" w:ascii="宋体" w:hAnsi="宋体" w:cs="宋体"/>
+                <w:color w:val="1E0707"/>
+                <w:kern w:val="0"/>
+                <w:sz w:val="19"/>
+                <w:szCs w:val="19"/>
+                <w:lang w:val="en-US" w:eastAsia="zh-CN" w:bidi="ar"/>
+              </w:rPr>
+            </w:pPr>
+            <w:r>
+              <w:rPr>
+                <w:rFonts w:hint="eastAsia" w:ascii="宋体" w:hAnsi="宋体" w:cs="宋体"/>
+                <w:color w:val="1E0707"/>
+                <w:kern w:val="0"/>
+                <w:sz w:val="19"/>
+                <w:szCs w:val="19"/>
+                <w:lang w:val="en-US" w:eastAsia="zh-CN" w:bidi="ar"/>
+              </w:rPr>
+              <w:t>计算解密后整数m的位数，恢复成原始字节串并解码成字符串。</w:t>
+            </w:r>
+          </w:p>
+          <w:p>
+            <w:pPr>
+              <w:keepNext w:val="0"/>
+              <w:keepLines w:val="0"/>
+              <w:widowControl/>
+              <w:suppressLineNumbers w:val="0"/>
+              <w:jc w:val="left"/>
+              <w:rPr>
+                <w:rFonts w:hint="eastAsia" w:ascii="宋体" w:hAnsi="宋体" w:cs="宋体"/>
+                <w:color w:val="1E0707"/>
+                <w:kern w:val="0"/>
+                <w:sz w:val="19"/>
+                <w:szCs w:val="19"/>
+                <w:lang w:val="en-US" w:eastAsia="zh-CN" w:bidi="ar"/>
+              </w:rPr>
+            </w:pPr>
+            <w:r>
+              <w:rPr>
+                <w:rFonts w:hint="eastAsia" w:ascii="宋体" w:hAnsi="宋体" w:cs="宋体"/>
+                <w:color w:val="1E0707"/>
+                <w:kern w:val="0"/>
+                <w:sz w:val="19"/>
+                <w:szCs w:val="19"/>
+                <w:lang w:val="en-US" w:eastAsia="zh-CN" w:bidi="ar"/>
+              </w:rPr>
+              <w:t>返回解密得到的明文字符串。</w:t>
+            </w:r>
+          </w:p>
+          <w:p>
+            <w:pPr>
+              <w:keepNext w:val="0"/>
+              <w:keepLines w:val="0"/>
+              <w:widowControl/>
+              <w:suppressLineNumbers w:val="0"/>
+              <w:jc w:val="left"/>
+              <w:rPr>
+                <w:rFonts w:hint="eastAsia" w:ascii="宋体" w:hAnsi="宋体" w:cs="宋体"/>
+                <w:color w:val="1E0707"/>
+                <w:kern w:val="0"/>
+                <w:sz w:val="19"/>
+                <w:szCs w:val="19"/>
+                <w:lang w:val="en-US" w:eastAsia="zh-CN" w:bidi="ar"/>
+              </w:rPr>
+            </w:pPr>
+          </w:p>
+          <w:p>
+            <w:pPr>
+              <w:keepNext w:val="0"/>
+              <w:keepLines w:val="0"/>
+              <w:widowControl/>
+              <w:suppressLineNumbers w:val="0"/>
+              <w:jc w:val="left"/>
+              <w:rPr>
+                <w:rFonts w:hint="eastAsia" w:ascii="宋体" w:hAnsi="宋体" w:cs="宋体"/>
+                <w:color w:val="1E0707"/>
+                <w:kern w:val="0"/>
+                <w:sz w:val="19"/>
+                <w:szCs w:val="19"/>
+                <w:lang w:val="en-US" w:eastAsia="zh-CN" w:bidi="ar"/>
+              </w:rPr>
+            </w:pPr>
+            <w:r>
+              <w:rPr>
+                <w:rFonts w:hint="eastAsia" w:ascii="宋体" w:hAnsi="宋体" w:cs="宋体"/>
+                <w:color w:val="1E0707"/>
+                <w:kern w:val="0"/>
+                <w:sz w:val="19"/>
+                <w:szCs w:val="19"/>
+                <w:lang w:val="en-US" w:eastAsia="zh-CN" w:bidi="ar"/>
+              </w:rPr>
+              <w:t>调用函数进行加密解密：</w:t>
+            </w:r>
+          </w:p>
+          <w:p>
+            <w:pPr>
+              <w:keepNext w:val="0"/>
+              <w:keepLines w:val="0"/>
+              <w:widowControl/>
+              <w:suppressLineNumbers w:val="0"/>
+              <w:jc w:val="left"/>
+            </w:pPr>
+            <w:r>
+              <w:drawing>
+                <wp:inline distT="0" distB="0" distL="114300" distR="114300">
+                  <wp:extent cx="5913120" cy="1206500"/>
+                  <wp:effectExtent l="0" t="0" r="0" b="12700"/>
+                  <wp:docPr id="5" name="图片 8"/>
+                  <wp:cNvGraphicFramePr>
+                    <a:graphicFrameLocks xmlns:a="http://schemas.openxmlformats.org/drawingml/2006/main" noChangeAspect="1"/>
+                  </wp:cNvGraphicFramePr>
+                  <a:graphic xmlns:a="http://schemas.openxmlformats.org/drawingml/2006/main">
+                    <a:graphicData uri="http://schemas.openxmlformats.org/drawingml/2006/picture">
+                      <pic:pic xmlns:pic="http://schemas.openxmlformats.org/drawingml/2006/picture">
+                        <pic:nvPicPr>
+                          <pic:cNvPr id="5" name="图片 8"/>
+                          <pic:cNvPicPr>
+                            <a:picLocks noChangeAspect="1"/>
+                          </pic:cNvPicPr>
+                        </pic:nvPicPr>
+                        <pic:blipFill>
+                          <a:blip r:embed="rId6"/>
+                          <a:stretch>
+                            <a:fillRect/>
+                          </a:stretch>
+                        </pic:blipFill>
+                        <pic:spPr>
+                          <a:xfrm>
+                            <a:off x="0" y="0"/>
+                            <a:ext cx="5913120" cy="1206500"/>
+                          </a:xfrm>
+                          <a:prstGeom prst="rect">
+                            <a:avLst/>
+                          </a:prstGeom>
+                          <a:noFill/>
+                          <a:ln>
+                            <a:noFill/>
+                          </a:ln>
+                        </pic:spPr>
+                      </pic:pic>
+                    </a:graphicData>
+                  </a:graphic>
+                </wp:inline>
+              </w:drawing>
+            </w:r>
+          </w:p>
+          <w:p>
+            <w:pPr>
+              <w:keepNext w:val="0"/>
+              <w:keepLines w:val="0"/>
+              <w:widowControl/>
+              <w:suppressLineNumbers w:val="0"/>
+              <w:jc w:val="left"/>
+              <w:rPr>
+                <w:rFonts w:hint="default"/>
+                <w:lang w:val="en-US" w:eastAsia="zh-CN"/>
+              </w:rPr>
+            </w:pPr>
+            <w:r>
+              <w:drawing>
+                <wp:inline distT="0" distB="0" distL="114300" distR="114300">
+                  <wp:extent cx="2647950" cy="1219200"/>
+                  <wp:effectExtent l="0" t="0" r="3810" b="0"/>
+                  <wp:docPr id="6" name="图片 9"/>
+                  <wp:cNvGraphicFramePr>
+                    <a:graphicFrameLocks xmlns:a="http://schemas.openxmlformats.org/drawingml/2006/main" noChangeAspect="1"/>
+                  </wp:cNvGraphicFramePr>
+                  <a:graphic xmlns:a="http://schemas.openxmlformats.org/drawingml/2006/main">
+                    <a:graphicData uri="http://schemas.openxmlformats.org/drawingml/2006/picture">
+                      <pic:pic xmlns:pic="http://schemas.openxmlformats.org/drawingml/2006/picture">
+                        <pic:nvPicPr>
+                          <pic:cNvPr id="6" name="图片 9"/>
+                          <pic:cNvPicPr>
+                            <a:picLocks noChangeAspect="1"/>
+                          </pic:cNvPicPr>
+                        </pic:nvPicPr>
+                        <pic:blipFill>
+                          <a:blip r:embed="rId7"/>
+                          <a:stretch>
+                            <a:fillRect/>
+                          </a:stretch>
+                        </pic:blipFill>
+                        <pic:spPr>
+                          <a:xfrm>
+                            <a:off x="0" y="0"/>
+                            <a:ext cx="2647950" cy="1219200"/>
+                          </a:xfrm>
+                          <a:prstGeom prst="rect">
+                            <a:avLst/>
+                          </a:prstGeom>
+                          <a:noFill/>
+                          <a:ln>
+                            <a:noFill/>
+                          </a:ln>
+                        </pic:spPr>
+                      </pic:pic>
+                    </a:graphicData>
+                  </a:graphic>
+                </wp:inline>
+              </w:drawing>
+            </w:r>
+          </w:p>
+          <w:p>
+            <w:pPr>
+              <w:keepNext w:val="0"/>
+              <w:keepLines w:val="0"/>
+              <w:widowControl/>
+              <w:suppressLineNumbers w:val="0"/>
+              <w:jc w:val="left"/>
+              <w:rPr>
+                <w:rFonts w:hint="eastAsia" w:ascii="宋体" w:hAnsi="宋体" w:cs="宋体"/>
+                <w:color w:val="1E0707"/>
+                <w:kern w:val="0"/>
+                <w:sz w:val="19"/>
+                <w:szCs w:val="19"/>
+                <w:lang w:val="en-US" w:eastAsia="zh-CN" w:bidi="ar"/>
+              </w:rPr>
+            </w:pPr>
+            <w:r>
+              <w:rPr>
+                <w:rFonts w:hint="eastAsia" w:ascii="宋体" w:hAnsi="宋体" w:cs="宋体"/>
+                <w:color w:val="1E0707"/>
+                <w:kern w:val="0"/>
+                <w:sz w:val="19"/>
+                <w:szCs w:val="19"/>
+                <w:lang w:val="en-US" w:eastAsia="zh-CN" w:bidi="ar"/>
+              </w:rPr>
+              <w:t>输出结果如下：</w:t>
+            </w:r>
+          </w:p>
+          <w:p>
+            <w:pPr>
+              <w:keepNext w:val="0"/>
+              <w:keepLines w:val="0"/>
+              <w:widowControl/>
+              <w:suppressLineNumbers w:val="0"/>
+              <w:jc w:val="left"/>
+              <w:rPr>
+                <w:rFonts w:hint="eastAsia" w:ascii="宋体" w:hAnsi="宋体" w:cs="宋体"/>
+                <w:color w:val="1E0707"/>
+                <w:kern w:val="0"/>
+                <w:sz w:val="19"/>
+                <w:szCs w:val="19"/>
+                <w:lang w:val="en-US" w:eastAsia="zh-CN" w:bidi="ar"/>
+              </w:rPr>
+            </w:pPr>
+            <w:r>
+              <w:drawing>
+                <wp:inline distT="0" distB="0" distL="114300" distR="114300">
+                  <wp:extent cx="2638425" cy="533400"/>
+                  <wp:effectExtent l="0" t="0" r="13335" b="0"/>
+                  <wp:docPr id="7" name="图片 10"/>
+                  <wp:cNvGraphicFramePr>
+                    <a:graphicFrameLocks xmlns:a="http://schemas.openxmlformats.org/drawingml/2006/main" noChangeAspect="1"/>
+                  </wp:cNvGraphicFramePr>
+                  <a:graphic xmlns:a="http://schemas.openxmlformats.org/drawingml/2006/main">
+                    <a:graphicData uri="http://schemas.openxmlformats.org/drawingml/2006/picture">
+                      <pic:pic xmlns:pic="http://schemas.openxmlformats.org/drawingml/2006/picture">
+                        <pic:nvPicPr>
+                          <pic:cNvPr id="7" name="图片 10"/>
+                          <pic:cNvPicPr>
+                            <a:picLocks noChangeAspect="1"/>
+                          </pic:cNvPicPr>
+                        </pic:nvPicPr>
+                        <pic:blipFill>
+                          <a:blip r:embed="rId8"/>
+                          <a:stretch>
+                            <a:fillRect/>
+                          </a:stretch>
+                        </pic:blipFill>
+                        <pic:spPr>
+                          <a:xfrm>
+                            <a:off x="0" y="0"/>
+                            <a:ext cx="2638425" cy="533400"/>
+                          </a:xfrm>
+                          <a:prstGeom prst="rect">
+                            <a:avLst/>
+                          </a:prstGeom>
+                          <a:noFill/>
+                          <a:ln>
+                            <a:noFill/>
+                          </a:ln>
+                        </pic:spPr>
+                      </pic:pic>
+                    </a:graphicData>
+                  </a:graphic>
+                </wp:inline>
+              </w:drawing>
+            </w:r>
+          </w:p>
+          <w:p>
+            <w:pPr>
+              <w:keepNext w:val="0"/>
+              <w:keepLines w:val="0"/>
+              <w:widowControl/>
+              <w:suppressLineNumbers w:val="0"/>
+              <w:jc w:val="left"/>
+              <w:rPr>
+                <w:rFonts w:hint="default" w:ascii="宋体" w:hAnsi="宋体" w:cs="宋体"/>
+                <w:color w:val="1E0707"/>
+                <w:kern w:val="0"/>
+                <w:sz w:val="19"/>
+                <w:szCs w:val="19"/>
+                <w:lang w:val="en-US" w:eastAsia="zh-CN" w:bidi="ar"/>
+              </w:rPr>
+            </w:pPr>
+          </w:p>
+          <w:p>
+            <w:pPr>
+              <w:keepNext w:val="0"/>
+              <w:keepLines w:val="0"/>
+              <w:widowControl/>
+              <w:numPr>
+                <w:ilvl w:val="0"/>
+                <w:numId w:val="1"/>
+              </w:numPr>
+              <w:suppressLineNumbers w:val="0"/>
+              <w:jc w:val="left"/>
+              <w:rPr>
+                <w:rFonts w:hint="eastAsia" w:ascii="宋体" w:hAnsi="宋体" w:eastAsia="宋体" w:cs="宋体"/>
+                <w:b/>
                 <w:bCs/>
-                <w:szCs w:val="21"/>
-              </w:rPr>
-            </w:pPr>
-          </w:p>
-          <w:p>
-            <w:pPr>
-              <w:rPr>
+                <w:color w:val="1E0707"/>
+                <w:kern w:val="0"/>
+                <w:sz w:val="19"/>
+                <w:szCs w:val="19"/>
+                <w:lang w:val="en-US" w:eastAsia="zh-CN" w:bidi="ar"/>
+              </w:rPr>
+            </w:pPr>
+            <w:r>
+              <w:rPr>
+                <w:rFonts w:hint="eastAsia" w:ascii="宋体" w:hAnsi="宋体" w:eastAsia="宋体" w:cs="宋体"/>
+                <w:b/>
                 <w:bCs/>
-                <w:szCs w:val="21"/>
-              </w:rPr>
-            </w:pPr>
-          </w:p>
-          <w:p>
-            <w:pPr>
-              <w:rPr>
+                <w:color w:val="1E0707"/>
+                <w:kern w:val="0"/>
+                <w:sz w:val="19"/>
+                <w:szCs w:val="19"/>
+                <w:lang w:val="en-US" w:eastAsia="zh-CN" w:bidi="ar"/>
+              </w:rPr>
+              <w:t>分解模数破解RSA</w:t>
+            </w:r>
+          </w:p>
+          <w:p>
+            <w:pPr>
+              <w:keepNext w:val="0"/>
+              <w:keepLines w:val="0"/>
+              <w:widowControl/>
+              <w:suppressLineNumbers w:val="0"/>
+              <w:jc w:val="left"/>
+              <w:rPr>
+                <w:rFonts w:hint="eastAsia" w:ascii="宋体" w:hAnsi="宋体" w:eastAsia="宋体" w:cs="宋体"/>
+                <w:color w:val="1E0707"/>
+                <w:kern w:val="0"/>
+                <w:sz w:val="19"/>
+                <w:szCs w:val="19"/>
+                <w:lang w:val="en-US" w:eastAsia="zh-CN" w:bidi="ar"/>
+              </w:rPr>
+            </w:pPr>
+            <w:r>
+              <w:rPr>
+                <w:rFonts w:hint="eastAsia" w:ascii="宋体" w:hAnsi="宋体" w:eastAsia="宋体" w:cs="宋体"/>
+                <w:color w:val="1E0707"/>
+                <w:kern w:val="0"/>
+                <w:sz w:val="19"/>
+                <w:szCs w:val="19"/>
+                <w:lang w:val="en-US" w:eastAsia="zh-CN" w:bidi="ar"/>
+              </w:rPr>
+              <w:t>使用openssl解析pubkey.pem中参数，得到e,n</w:t>
+            </w:r>
+          </w:p>
+          <w:p>
+            <w:pPr>
+              <w:keepNext w:val="0"/>
+              <w:keepLines w:val="0"/>
+              <w:widowControl/>
+              <w:suppressLineNumbers w:val="0"/>
+              <w:jc w:val="left"/>
+              <w:rPr>
+                <w:rFonts w:hint="eastAsia" w:ascii="宋体" w:hAnsi="宋体" w:eastAsia="宋体" w:cs="宋体"/>
+                <w:color w:val="1E0707"/>
+                <w:kern w:val="0"/>
+                <w:sz w:val="19"/>
+                <w:szCs w:val="19"/>
+                <w:lang w:val="en-US" w:eastAsia="zh-CN" w:bidi="ar"/>
+              </w:rPr>
+            </w:pPr>
+            <w:r>
+              <w:drawing>
+                <wp:inline distT="0" distB="0" distL="114300" distR="114300">
+                  <wp:extent cx="5916295" cy="2322195"/>
+                  <wp:effectExtent l="0" t="0" r="12065" b="9525"/>
+                  <wp:docPr id="4" name="图片 7"/>
+                  <wp:cNvGraphicFramePr>
+                    <a:graphicFrameLocks xmlns:a="http://schemas.openxmlformats.org/drawingml/2006/main" noChangeAspect="1"/>
+                  </wp:cNvGraphicFramePr>
+                  <a:graphic xmlns:a="http://schemas.openxmlformats.org/drawingml/2006/main">
+                    <a:graphicData uri="http://schemas.openxmlformats.org/drawingml/2006/picture">
+                      <pic:pic xmlns:pic="http://schemas.openxmlformats.org/drawingml/2006/picture">
+                        <pic:nvPicPr>
+                          <pic:cNvPr id="4" name="图片 7"/>
+                          <pic:cNvPicPr>
+                            <a:picLocks noChangeAspect="1"/>
+                          </pic:cNvPicPr>
+                        </pic:nvPicPr>
+                        <pic:blipFill>
+                          <a:blip r:embed="rId9"/>
+                          <a:stretch>
+                            <a:fillRect/>
+                          </a:stretch>
+                        </pic:blipFill>
+                        <pic:spPr>
+                          <a:xfrm>
+                            <a:off x="0" y="0"/>
+                            <a:ext cx="5916295" cy="2322195"/>
+                          </a:xfrm>
+                          <a:prstGeom prst="rect">
+                            <a:avLst/>
+                          </a:prstGeom>
+                          <a:noFill/>
+                          <a:ln>
+                            <a:noFill/>
+                          </a:ln>
+                        </pic:spPr>
+                      </pic:pic>
+                    </a:graphicData>
+                  </a:graphic>
+                </wp:inline>
+              </w:drawing>
+            </w:r>
+          </w:p>
+          <w:p>
+            <w:pPr>
+              <w:keepNext w:val="0"/>
+              <w:keepLines w:val="0"/>
+              <w:widowControl/>
+              <w:suppressLineNumbers w:val="0"/>
+              <w:jc w:val="left"/>
+              <w:rPr>
+                <w:rFonts w:hint="default" w:ascii="宋体" w:hAnsi="宋体" w:eastAsia="宋体" w:cs="宋体"/>
+                <w:color w:val="1E0707"/>
+                <w:kern w:val="0"/>
+                <w:sz w:val="19"/>
+                <w:szCs w:val="19"/>
+                <w:lang w:val="en-US" w:eastAsia="zh-CN" w:bidi="ar"/>
+              </w:rPr>
+            </w:pPr>
+            <w:r>
+              <w:rPr>
+                <w:rFonts w:hint="eastAsia" w:ascii="宋体" w:hAnsi="宋体" w:cs="宋体"/>
+                <w:color w:val="1E0707"/>
+                <w:kern w:val="0"/>
+                <w:sz w:val="19"/>
+                <w:szCs w:val="19"/>
+                <w:lang w:val="en-US" w:eastAsia="zh-CN" w:bidi="ar"/>
+              </w:rPr>
+              <w:t>e = 65537</w:t>
+            </w:r>
+          </w:p>
+          <w:p>
+            <w:pPr>
+              <w:keepNext w:val="0"/>
+              <w:keepLines w:val="0"/>
+              <w:widowControl/>
+              <w:suppressLineNumbers w:val="0"/>
+              <w:jc w:val="left"/>
+              <w:rPr>
+                <w:rFonts w:hint="eastAsia" w:ascii="宋体" w:hAnsi="宋体" w:eastAsia="宋体" w:cs="宋体"/>
+                <w:color w:val="1E0707"/>
+                <w:kern w:val="0"/>
+                <w:sz w:val="19"/>
+                <w:szCs w:val="19"/>
+                <w:lang w:val="en-US" w:eastAsia="zh-CN" w:bidi="ar"/>
+              </w:rPr>
+            </w:pPr>
+            <w:r>
+              <w:rPr>
+                <w:rFonts w:hint="eastAsia" w:ascii="宋体" w:hAnsi="宋体" w:eastAsia="宋体" w:cs="宋体"/>
+                <w:color w:val="1E0707"/>
+                <w:kern w:val="0"/>
+                <w:sz w:val="19"/>
+                <w:szCs w:val="19"/>
+                <w:lang w:val="en-US" w:eastAsia="zh-CN" w:bidi="ar"/>
+              </w:rPr>
+              <w:t>将n由十六进制转换为十进制</w:t>
+            </w:r>
+          </w:p>
+          <w:p>
+            <w:pPr>
+              <w:keepNext w:val="0"/>
+              <w:keepLines w:val="0"/>
+              <w:widowControl/>
+              <w:suppressLineNumbers w:val="0"/>
+              <w:jc w:val="left"/>
+              <w:rPr>
+                <w:rFonts w:hint="eastAsia" w:ascii="宋体" w:hAnsi="宋体" w:eastAsia="宋体" w:cs="宋体"/>
+                <w:color w:val="1E0707"/>
+                <w:kern w:val="0"/>
+                <w:sz w:val="19"/>
+                <w:szCs w:val="19"/>
+                <w:lang w:val="en-US" w:eastAsia="zh-CN" w:bidi="ar"/>
+              </w:rPr>
+            </w:pPr>
+            <w:r>
+              <w:rPr>
+                <w:rFonts w:hint="eastAsia" w:cs="Times New Roman"/>
+                <w:color w:val="000000"/>
+                <w:kern w:val="0"/>
+                <w:sz w:val="20"/>
+                <w:szCs w:val="20"/>
+                <w:lang w:val="en-US" w:eastAsia="zh-CN" w:bidi="ar"/>
+              </w:rPr>
+              <w:t xml:space="preserve">n = </w:t>
+            </w:r>
+            <w:r>
+              <w:rPr>
+                <w:rFonts w:hint="default" w:ascii="Times New Roman" w:hAnsi="Times New Roman" w:eastAsia="宋体" w:cs="Times New Roman"/>
+                <w:color w:val="000000"/>
+                <w:kern w:val="0"/>
+                <w:sz w:val="20"/>
+                <w:szCs w:val="20"/>
+                <w:lang w:val="en-US" w:eastAsia="zh-CN" w:bidi="ar"/>
+              </w:rPr>
+              <w:t>87924348264132406875276140514499937145050893665602592992418171647042491658461</w:t>
+            </w:r>
+          </w:p>
+          <w:p>
+            <w:pPr>
+              <w:keepNext w:val="0"/>
+              <w:keepLines w:val="0"/>
+              <w:widowControl/>
+              <w:suppressLineNumbers w:val="0"/>
+              <w:jc w:val="left"/>
+              <w:rPr>
+                <w:rFonts w:hint="eastAsia" w:ascii="宋体" w:hAnsi="宋体" w:eastAsia="宋体" w:cs="宋体"/>
+                <w:color w:val="1E0707"/>
+                <w:kern w:val="0"/>
+                <w:sz w:val="19"/>
+                <w:szCs w:val="19"/>
+                <w:lang w:val="en-US" w:eastAsia="zh-CN" w:bidi="ar"/>
+              </w:rPr>
+            </w:pPr>
+            <w:r>
+              <w:rPr>
+                <w:rFonts w:hint="eastAsia" w:ascii="宋体" w:hAnsi="宋体" w:eastAsia="宋体" w:cs="宋体"/>
+                <w:color w:val="1E0707"/>
+                <w:kern w:val="0"/>
+                <w:sz w:val="19"/>
+                <w:szCs w:val="19"/>
+                <w:lang w:val="en-US" w:eastAsia="zh-CN" w:bidi="ar"/>
+              </w:rPr>
+              <w:t>对大整数n进行分解，得到p和q</w:t>
+            </w:r>
+          </w:p>
+          <w:p>
+            <w:pPr>
+              <w:keepNext w:val="0"/>
+              <w:keepLines w:val="0"/>
+              <w:widowControl/>
+              <w:suppressLineNumbers w:val="0"/>
+              <w:jc w:val="left"/>
+            </w:pPr>
+            <w:r>
+              <w:rPr>
+                <w:rFonts w:hint="eastAsia" w:ascii="宋体" w:hAnsi="宋体" w:cs="宋体"/>
+                <w:color w:val="1E0707"/>
+                <w:kern w:val="0"/>
+                <w:sz w:val="19"/>
+                <w:szCs w:val="19"/>
+                <w:lang w:val="en-US" w:eastAsia="zh-CN" w:bidi="ar"/>
+              </w:rPr>
+              <w:t xml:space="preserve">p = </w:t>
+            </w:r>
+            <w:r>
+              <w:rPr>
+                <w:rFonts w:hint="default" w:ascii="Times New Roman" w:hAnsi="Times New Roman" w:eastAsia="宋体" w:cs="Times New Roman"/>
+                <w:color w:val="000000"/>
+                <w:kern w:val="0"/>
+                <w:sz w:val="20"/>
+                <w:szCs w:val="20"/>
+                <w:lang w:val="en-US" w:eastAsia="zh-CN" w:bidi="ar"/>
+              </w:rPr>
+              <w:t>275127860351348928173285174381581152299</w:t>
+            </w:r>
+          </w:p>
+          <w:p>
+            <w:pPr>
+              <w:keepNext w:val="0"/>
+              <w:keepLines w:val="0"/>
+              <w:widowControl/>
+              <w:suppressLineNumbers w:val="0"/>
+              <w:jc w:val="left"/>
+              <w:rPr>
+                <w:rFonts w:hint="default" w:ascii="宋体" w:hAnsi="宋体" w:eastAsia="宋体" w:cs="宋体"/>
+                <w:color w:val="1E0707"/>
+                <w:kern w:val="0"/>
+                <w:sz w:val="19"/>
+                <w:szCs w:val="19"/>
+                <w:lang w:val="en-US" w:eastAsia="zh-CN" w:bidi="ar"/>
+              </w:rPr>
+            </w:pPr>
+            <w:r>
+              <w:rPr>
+                <w:rFonts w:hint="eastAsia" w:ascii="宋体" w:hAnsi="宋体" w:cs="宋体"/>
+                <w:color w:val="1E0707"/>
+                <w:kern w:val="0"/>
+                <w:sz w:val="19"/>
+                <w:szCs w:val="19"/>
+                <w:lang w:val="en-US" w:eastAsia="zh-CN" w:bidi="ar"/>
+              </w:rPr>
+              <w:t xml:space="preserve">q = </w:t>
+            </w:r>
+            <w:r>
+              <w:rPr>
+                <w:rFonts w:hint="default" w:ascii="Times New Roman" w:hAnsi="Times New Roman" w:eastAsia="宋体" w:cs="Times New Roman"/>
+                <w:color w:val="000000"/>
+                <w:kern w:val="0"/>
+                <w:sz w:val="20"/>
+                <w:szCs w:val="20"/>
+                <w:lang w:val="en-US" w:eastAsia="zh-CN" w:bidi="ar"/>
+              </w:rPr>
+              <w:t>319576316814478949870590164193048041239</w:t>
+            </w:r>
+          </w:p>
+          <w:p>
+            <w:pPr>
+              <w:keepNext w:val="0"/>
+              <w:keepLines w:val="0"/>
+              <w:widowControl/>
+              <w:suppressLineNumbers w:val="0"/>
+              <w:jc w:val="left"/>
+              <w:rPr>
+                <w:rFonts w:hint="eastAsia" w:ascii="宋体" w:hAnsi="宋体" w:eastAsia="宋体" w:cs="宋体"/>
+                <w:color w:val="1E0707"/>
+                <w:kern w:val="0"/>
+                <w:sz w:val="19"/>
+                <w:szCs w:val="19"/>
+                <w:lang w:val="en-US" w:eastAsia="zh-CN" w:bidi="ar"/>
+              </w:rPr>
+            </w:pPr>
+            <w:r>
+              <w:rPr>
+                <w:rFonts w:hint="eastAsia" w:ascii="宋体" w:hAnsi="宋体" w:eastAsia="宋体" w:cs="宋体"/>
+                <w:color w:val="1E0707"/>
+                <w:kern w:val="0"/>
+                <w:sz w:val="19"/>
+                <w:szCs w:val="19"/>
+                <w:lang w:val="en-US" w:eastAsia="zh-CN" w:bidi="ar"/>
+              </w:rPr>
+              <w:t>求出d</w:t>
+            </w:r>
+          </w:p>
+          <w:p>
+            <w:pPr>
+              <w:keepNext w:val="0"/>
+              <w:keepLines w:val="0"/>
+              <w:widowControl/>
+              <w:suppressLineNumbers w:val="0"/>
+              <w:jc w:val="left"/>
+            </w:pPr>
+            <w:r>
+              <w:rPr>
+                <w:rFonts w:hint="eastAsia" w:cs="Times New Roman"/>
+                <w:color w:val="000000"/>
+                <w:kern w:val="0"/>
+                <w:sz w:val="20"/>
+                <w:szCs w:val="20"/>
+                <w:lang w:val="en-US" w:eastAsia="zh-CN" w:bidi="ar"/>
+              </w:rPr>
+              <w:t xml:space="preserve">d </w:t>
+            </w:r>
+            <w:r>
+              <w:rPr>
+                <w:rFonts w:hint="default" w:ascii="Times New Roman" w:hAnsi="Times New Roman" w:eastAsia="宋体" w:cs="Times New Roman"/>
+                <w:color w:val="000000"/>
+                <w:kern w:val="0"/>
+                <w:sz w:val="20"/>
+                <w:szCs w:val="20"/>
+                <w:lang w:val="en-US" w:eastAsia="zh-CN" w:bidi="ar"/>
+              </w:rPr>
+              <w:t>=</w:t>
+            </w:r>
+            <w:r>
+              <w:rPr>
+                <w:rFonts w:hint="eastAsia" w:cs="Times New Roman"/>
+                <w:color w:val="000000"/>
+                <w:kern w:val="0"/>
+                <w:sz w:val="20"/>
+                <w:szCs w:val="20"/>
+                <w:lang w:val="en-US" w:eastAsia="zh-CN" w:bidi="ar"/>
+              </w:rPr>
+              <w:t xml:space="preserve"> </w:t>
+            </w:r>
+            <w:r>
+              <w:rPr>
+                <w:rFonts w:hint="default" w:ascii="Times New Roman" w:hAnsi="Times New Roman" w:eastAsia="宋体" w:cs="Times New Roman"/>
+                <w:color w:val="000000"/>
+                <w:kern w:val="0"/>
+                <w:sz w:val="20"/>
+                <w:szCs w:val="20"/>
+                <w:lang w:val="en-US" w:eastAsia="zh-CN" w:bidi="ar"/>
+              </w:rPr>
+              <w:t>10866948760844599168252082612378495977388271279679231539839049698621994994673</w:t>
+            </w:r>
+          </w:p>
+          <w:p>
+            <w:pPr>
+              <w:keepNext w:val="0"/>
+              <w:keepLines w:val="0"/>
+              <w:widowControl/>
+              <w:suppressLineNumbers w:val="0"/>
+              <w:jc w:val="left"/>
+              <w:rPr>
+                <w:rFonts w:hint="eastAsia" w:ascii="宋体" w:hAnsi="宋体" w:eastAsia="宋体" w:cs="宋体"/>
+                <w:color w:val="1E0707"/>
+                <w:kern w:val="0"/>
+                <w:sz w:val="19"/>
+                <w:szCs w:val="19"/>
+                <w:lang w:val="en-US" w:eastAsia="zh-CN" w:bidi="ar"/>
+              </w:rPr>
+            </w:pPr>
+          </w:p>
+          <w:p>
+            <w:pPr>
+              <w:keepNext w:val="0"/>
+              <w:keepLines w:val="0"/>
+              <w:widowControl/>
+              <w:suppressLineNumbers w:val="0"/>
+              <w:jc w:val="left"/>
+              <w:rPr>
+                <w:rFonts w:hint="eastAsia" w:ascii="宋体" w:hAnsi="宋体" w:eastAsia="宋体" w:cs="宋体"/>
+                <w:color w:val="1E0707"/>
+                <w:kern w:val="0"/>
+                <w:sz w:val="19"/>
+                <w:szCs w:val="19"/>
+                <w:lang w:val="en-US" w:eastAsia="zh-CN" w:bidi="ar"/>
+              </w:rPr>
+            </w:pPr>
+            <w:r>
+              <w:rPr>
+                <w:rFonts w:hint="eastAsia" w:ascii="宋体" w:hAnsi="宋体" w:eastAsia="宋体" w:cs="宋体"/>
+                <w:color w:val="1E0707"/>
+                <w:kern w:val="0"/>
+                <w:sz w:val="19"/>
+                <w:szCs w:val="19"/>
+                <w:lang w:val="en-US" w:eastAsia="zh-CN" w:bidi="ar"/>
+              </w:rPr>
+              <w:t>读出secret.enc中的字节数据，用bytes2num转为整数，再用私钥d解密，nums2str将解密的得到的整数转为字符串，得到明文</w:t>
+            </w:r>
+          </w:p>
+          <w:p>
+            <w:pPr>
+              <w:keepNext w:val="0"/>
+              <w:keepLines w:val="0"/>
+              <w:widowControl/>
+              <w:suppressLineNumbers w:val="0"/>
+              <w:jc w:val="left"/>
+            </w:pPr>
+            <w:r>
+              <w:drawing>
+                <wp:inline distT="0" distB="0" distL="114300" distR="114300">
+                  <wp:extent cx="2305050" cy="247650"/>
+                  <wp:effectExtent l="0" t="0" r="11430" b="11430"/>
+                  <wp:docPr id="8" name="图片 11"/>
+                  <wp:cNvGraphicFramePr>
+                    <a:graphicFrameLocks xmlns:a="http://schemas.openxmlformats.org/drawingml/2006/main" noChangeAspect="1"/>
+                  </wp:cNvGraphicFramePr>
+                  <a:graphic xmlns:a="http://schemas.openxmlformats.org/drawingml/2006/main">
+                    <a:graphicData uri="http://schemas.openxmlformats.org/drawingml/2006/picture">
+                      <pic:pic xmlns:pic="http://schemas.openxmlformats.org/drawingml/2006/picture">
+                        <pic:nvPicPr>
+                          <pic:cNvPr id="8" name="图片 11"/>
+                          <pic:cNvPicPr>
+                            <a:picLocks noChangeAspect="1"/>
+                          </pic:cNvPicPr>
+                        </pic:nvPicPr>
+                        <pic:blipFill>
+                          <a:blip r:embed="rId10"/>
+                          <a:stretch>
+                            <a:fillRect/>
+                          </a:stretch>
+                        </pic:blipFill>
+                        <pic:spPr>
+                          <a:xfrm>
+                            <a:off x="0" y="0"/>
+                            <a:ext cx="2305050" cy="247650"/>
+                          </a:xfrm>
+                          <a:prstGeom prst="rect">
+                            <a:avLst/>
+                          </a:prstGeom>
+                          <a:noFill/>
+                          <a:ln>
+                            <a:noFill/>
+                          </a:ln>
+                        </pic:spPr>
+                      </pic:pic>
+                    </a:graphicData>
+                  </a:graphic>
+                </wp:inline>
+              </w:drawing>
+            </w:r>
+          </w:p>
+          <w:p>
+            <w:pPr>
+              <w:keepNext w:val="0"/>
+              <w:keepLines w:val="0"/>
+              <w:widowControl/>
+              <w:suppressLineNumbers w:val="0"/>
+              <w:jc w:val="left"/>
+              <w:rPr>
+                <w:rFonts w:hint="eastAsia"/>
+                <w:lang w:val="en-US" w:eastAsia="zh-CN"/>
+              </w:rPr>
+            </w:pPr>
+          </w:p>
+          <w:p>
+            <w:pPr>
+              <w:keepNext w:val="0"/>
+              <w:keepLines w:val="0"/>
+              <w:widowControl/>
+              <w:suppressLineNumbers w:val="0"/>
+              <w:jc w:val="left"/>
+              <w:rPr>
+                <w:b/>
                 <w:bCs/>
-                <w:szCs w:val="21"/>
-              </w:rPr>
-            </w:pPr>
-          </w:p>
-          <w:p>
-            <w:pPr>
-              <w:rPr>
+              </w:rPr>
+            </w:pPr>
+            <w:r>
+              <w:rPr>
+                <w:rFonts w:hint="eastAsia" w:ascii="宋体" w:hAnsi="宋体" w:eastAsia="宋体" w:cs="宋体"/>
+                <w:b/>
                 <w:bCs/>
-                <w:szCs w:val="21"/>
-              </w:rPr>
-            </w:pPr>
-          </w:p>
-          <w:p>
-            <w:pPr>
-              <w:rPr>
+                <w:color w:val="1E0707"/>
+                <w:kern w:val="0"/>
+                <w:sz w:val="19"/>
+                <w:szCs w:val="19"/>
+                <w:lang w:val="en-US" w:eastAsia="zh-CN" w:bidi="ar"/>
+              </w:rPr>
+              <w:t>3、</w:t>
+            </w:r>
+            <w:r>
+              <w:rPr>
+                <w:rFonts w:hint="eastAsia" w:ascii="宋体" w:hAnsi="宋体" w:eastAsia="宋体" w:cs="宋体"/>
+                <w:b/>
                 <w:bCs/>
-                <w:szCs w:val="21"/>
-              </w:rPr>
-            </w:pPr>
-          </w:p>
-          <w:p>
-            <w:pPr>
-              <w:rPr>
-                <w:bCs/>
-                <w:szCs w:val="21"/>
-              </w:rPr>
-            </w:pPr>
-          </w:p>
-          <w:p>
-            <w:pPr>
-              <w:rPr>
-                <w:bCs/>
-                <w:szCs w:val="21"/>
-              </w:rPr>
-            </w:pPr>
-          </w:p>
-          <w:p>
-            <w:pPr>
-              <w:rPr>
-                <w:bCs/>
-                <w:szCs w:val="21"/>
-              </w:rPr>
-            </w:pPr>
-          </w:p>
-          <w:p>
-            <w:pPr>
-              <w:rPr>
-                <w:bCs/>
-                <w:szCs w:val="21"/>
-              </w:rPr>
-            </w:pPr>
-          </w:p>
-          <w:p>
-            <w:pPr>
-              <w:rPr>
-                <w:bCs/>
-                <w:szCs w:val="21"/>
-              </w:rPr>
-            </w:pPr>
-          </w:p>
-          <w:p>
-            <w:pPr>
-              <w:rPr>
-                <w:bCs/>
-                <w:szCs w:val="21"/>
-              </w:rPr>
-            </w:pPr>
-          </w:p>
-          <w:p>
-            <w:pPr>
-              <w:rPr>
-                <w:bCs/>
-                <w:szCs w:val="21"/>
-              </w:rPr>
-            </w:pPr>
-          </w:p>
-          <w:p>
-            <w:pPr>
-              <w:rPr>
-                <w:bCs/>
-                <w:szCs w:val="21"/>
-              </w:rPr>
-            </w:pPr>
-          </w:p>
-          <w:p>
-            <w:pPr>
-              <w:rPr>
-                <w:bCs/>
-                <w:szCs w:val="21"/>
-              </w:rPr>
-            </w:pPr>
-          </w:p>
-          <w:p>
-            <w:pPr>
-              <w:rPr>
-                <w:bCs/>
-                <w:szCs w:val="21"/>
-              </w:rPr>
-            </w:pPr>
-          </w:p>
-          <w:p>
-            <w:pPr>
-              <w:rPr>
-                <w:bCs/>
-                <w:szCs w:val="21"/>
-              </w:rPr>
-            </w:pPr>
-          </w:p>
-          <w:p>
-            <w:pPr>
-              <w:rPr>
-                <w:bCs/>
-                <w:szCs w:val="21"/>
-              </w:rPr>
-            </w:pPr>
-          </w:p>
-          <w:p>
-            <w:pPr>
-              <w:rPr>
-                <w:bCs/>
-                <w:szCs w:val="21"/>
-              </w:rPr>
-            </w:pPr>
+                <w:color w:val="000000"/>
+                <w:kern w:val="0"/>
+                <w:sz w:val="20"/>
+                <w:szCs w:val="20"/>
+                <w:lang w:val="en-US" w:eastAsia="zh-CN" w:bidi="ar"/>
+              </w:rPr>
+              <w:t>公共模数攻击</w:t>
+            </w:r>
+          </w:p>
+          <w:p>
+            <w:pPr>
+              <w:keepNext w:val="0"/>
+              <w:keepLines w:val="0"/>
+              <w:widowControl/>
+              <w:suppressLineNumbers w:val="0"/>
+              <w:jc w:val="left"/>
+              <w:rPr>
+                <w:rFonts w:hint="eastAsia" w:ascii="宋体" w:hAnsi="宋体" w:eastAsia="宋体" w:cs="宋体"/>
+                <w:color w:val="1E0707"/>
+                <w:kern w:val="0"/>
+                <w:sz w:val="19"/>
+                <w:szCs w:val="19"/>
+                <w:lang w:val="en-US" w:eastAsia="zh-CN" w:bidi="ar"/>
+              </w:rPr>
+            </w:pPr>
+            <w:r>
+              <w:rPr>
+                <w:rFonts w:hint="eastAsia" w:ascii="宋体" w:hAnsi="宋体" w:eastAsia="宋体" w:cs="宋体"/>
+                <w:color w:val="1E0707"/>
+                <w:kern w:val="0"/>
+                <w:sz w:val="19"/>
+                <w:szCs w:val="19"/>
+                <w:lang w:val="en-US" w:eastAsia="zh-CN" w:bidi="ar"/>
+              </w:rPr>
+              <w:t>公共模数攻击在common_modulus.py中实现攻击脚本，并破解参数，输出明文</w:t>
+            </w:r>
+          </w:p>
+          <w:p>
+            <w:pPr>
+              <w:keepNext w:val="0"/>
+              <w:keepLines w:val="0"/>
+              <w:widowControl/>
+              <w:suppressLineNumbers w:val="0"/>
+              <w:jc w:val="left"/>
+              <w:rPr>
+                <w:rFonts w:hint="eastAsia" w:ascii="宋体" w:hAnsi="宋体" w:eastAsia="宋体" w:cs="宋体"/>
+                <w:color w:val="1E0707"/>
+                <w:kern w:val="0"/>
+                <w:sz w:val="19"/>
+                <w:szCs w:val="19"/>
+                <w:lang w:val="en-US" w:eastAsia="zh-CN" w:bidi="ar"/>
+              </w:rPr>
+            </w:pPr>
+            <w:r>
+              <w:rPr>
+                <w:rFonts w:hint="eastAsia" w:ascii="宋体" w:hAnsi="宋体" w:eastAsia="宋体" w:cs="宋体"/>
+                <w:color w:val="1E0707"/>
+                <w:kern w:val="0"/>
+                <w:sz w:val="19"/>
+                <w:szCs w:val="19"/>
+                <w:lang w:val="en-US" w:eastAsia="zh-CN" w:bidi="ar"/>
+              </w:rPr>
+              <w:t>def attack(c1, c2, e1, e2, n)</w:t>
+            </w:r>
+            <w:r>
+              <w:rPr>
+                <w:rFonts w:hint="eastAsia" w:ascii="宋体" w:hAnsi="宋体" w:cs="宋体"/>
+                <w:color w:val="1E0707"/>
+                <w:kern w:val="0"/>
+                <w:sz w:val="19"/>
+                <w:szCs w:val="19"/>
+                <w:lang w:val="en-US" w:eastAsia="zh-CN" w:bidi="ar"/>
+              </w:rPr>
+              <w:t>：</w:t>
+            </w:r>
+            <w:r>
+              <w:rPr>
+                <w:rFonts w:hint="eastAsia" w:ascii="宋体" w:hAnsi="宋体" w:eastAsia="宋体" w:cs="宋体"/>
+                <w:color w:val="1E0707"/>
+                <w:kern w:val="0"/>
+                <w:sz w:val="19"/>
+                <w:szCs w:val="19"/>
+                <w:lang w:val="en-US" w:eastAsia="zh-CN" w:bidi="ar"/>
+              </w:rPr>
+              <w:t>通过扩展欧几里得算法求出系数，调整密文幂次并相乘，从而利用公共模数攻击恢复原始明文</w:t>
+            </w:r>
+          </w:p>
+          <w:p>
+            <w:pPr>
+              <w:keepNext w:val="0"/>
+              <w:keepLines w:val="0"/>
+              <w:widowControl/>
+              <w:suppressLineNumbers w:val="0"/>
+              <w:jc w:val="left"/>
+              <w:rPr>
+                <w:rFonts w:hint="eastAsia" w:ascii="宋体" w:hAnsi="宋体" w:eastAsia="宋体" w:cs="宋体"/>
+                <w:color w:val="1E0707"/>
+                <w:kern w:val="0"/>
+                <w:sz w:val="19"/>
+                <w:szCs w:val="19"/>
+                <w:lang w:val="en-US" w:eastAsia="zh-CN" w:bidi="ar"/>
+              </w:rPr>
+            </w:pPr>
+            <w:r>
+              <w:drawing>
+                <wp:inline distT="0" distB="0" distL="114300" distR="114300">
+                  <wp:extent cx="5911850" cy="541655"/>
+                  <wp:effectExtent l="0" t="0" r="1270" b="6985"/>
+                  <wp:docPr id="10" name="图片 13"/>
+                  <wp:cNvGraphicFramePr>
+                    <a:graphicFrameLocks xmlns:a="http://schemas.openxmlformats.org/drawingml/2006/main" noChangeAspect="1"/>
+                  </wp:cNvGraphicFramePr>
+                  <a:graphic xmlns:a="http://schemas.openxmlformats.org/drawingml/2006/main">
+                    <a:graphicData uri="http://schemas.openxmlformats.org/drawingml/2006/picture">
+                      <pic:pic xmlns:pic="http://schemas.openxmlformats.org/drawingml/2006/picture">
+                        <pic:nvPicPr>
+                          <pic:cNvPr id="10" name="图片 13"/>
+                          <pic:cNvPicPr>
+                            <a:picLocks noChangeAspect="1"/>
+                          </pic:cNvPicPr>
+                        </pic:nvPicPr>
+                        <pic:blipFill>
+                          <a:blip r:embed="rId11"/>
+                          <a:stretch>
+                            <a:fillRect/>
+                          </a:stretch>
+                        </pic:blipFill>
+                        <pic:spPr>
+                          <a:xfrm>
+                            <a:off x="0" y="0"/>
+                            <a:ext cx="5911850" cy="541655"/>
+                          </a:xfrm>
+                          <a:prstGeom prst="rect">
+                            <a:avLst/>
+                          </a:prstGeom>
+                          <a:noFill/>
+                          <a:ln>
+                            <a:noFill/>
+                          </a:ln>
+                        </pic:spPr>
+                      </pic:pic>
+                    </a:graphicData>
+                  </a:graphic>
+                </wp:inline>
+              </w:drawing>
+            </w:r>
           </w:p>
           <w:p>
             <w:pPr>
@@ -1226,19 +4743,202 @@
           </w:p>
           <w:p>
             <w:pPr>
-              <w:rPr>
-                <w:rFonts w:ascii="宋体" w:hAnsi="宋体"/>
-                <w:szCs w:val="21"/>
-              </w:rPr>
-            </w:pPr>
-          </w:p>
-          <w:p>
-            <w:pPr>
-              <w:rPr>
-                <w:rFonts w:ascii="宋体" w:hAnsi="宋体"/>
-                <w:szCs w:val="21"/>
-              </w:rPr>
-            </w:pPr>
+              <w:keepNext w:val="0"/>
+              <w:keepLines w:val="0"/>
+              <w:widowControl/>
+              <w:suppressLineNumbers w:val="0"/>
+              <w:jc w:val="left"/>
+              <w:rPr>
+                <w:rFonts w:hint="eastAsia" w:ascii="宋体" w:hAnsi="宋体" w:eastAsia="宋体" w:cs="宋体"/>
+                <w:color w:val="000000"/>
+                <w:kern w:val="0"/>
+                <w:sz w:val="20"/>
+                <w:szCs w:val="20"/>
+                <w:lang w:val="en-US" w:eastAsia="zh-CN" w:bidi="ar"/>
+              </w:rPr>
+            </w:pPr>
+            <w:r>
+              <w:rPr>
+                <w:rFonts w:hint="eastAsia" w:ascii="宋体" w:hAnsi="宋体" w:eastAsia="宋体" w:cs="宋体"/>
+                <w:color w:val="000000"/>
+                <w:kern w:val="0"/>
+                <w:sz w:val="20"/>
+                <w:szCs w:val="20"/>
+                <w:lang w:val="en-US" w:eastAsia="zh-CN" w:bidi="ar"/>
+              </w:rPr>
+              <w:t xml:space="preserve">1、RSA 加密算法 </w:t>
+            </w:r>
+          </w:p>
+          <w:p>
+            <w:pPr>
+              <w:keepNext w:val="0"/>
+              <w:keepLines w:val="0"/>
+              <w:widowControl/>
+              <w:suppressLineNumbers w:val="0"/>
+              <w:jc w:val="left"/>
+              <w:rPr>
+                <w:rFonts w:hint="eastAsia" w:ascii="宋体" w:hAnsi="宋体" w:eastAsia="宋体" w:cs="宋体"/>
+                <w:color w:val="000000"/>
+                <w:kern w:val="0"/>
+                <w:sz w:val="20"/>
+                <w:szCs w:val="20"/>
+                <w:lang w:val="en-US" w:eastAsia="zh-CN" w:bidi="ar"/>
+              </w:rPr>
+            </w:pPr>
+            <w:r>
+              <w:drawing>
+                <wp:inline distT="0" distB="0" distL="114300" distR="114300">
+                  <wp:extent cx="2638425" cy="533400"/>
+                  <wp:effectExtent l="0" t="0" r="13335" b="0"/>
+                  <wp:docPr id="11" name="图片 10"/>
+                  <wp:cNvGraphicFramePr>
+                    <a:graphicFrameLocks xmlns:a="http://schemas.openxmlformats.org/drawingml/2006/main" noChangeAspect="1"/>
+                  </wp:cNvGraphicFramePr>
+                  <a:graphic xmlns:a="http://schemas.openxmlformats.org/drawingml/2006/main">
+                    <a:graphicData uri="http://schemas.openxmlformats.org/drawingml/2006/picture">
+                      <pic:pic xmlns:pic="http://schemas.openxmlformats.org/drawingml/2006/picture">
+                        <pic:nvPicPr>
+                          <pic:cNvPr id="11" name="图片 10"/>
+                          <pic:cNvPicPr>
+                            <a:picLocks noChangeAspect="1"/>
+                          </pic:cNvPicPr>
+                        </pic:nvPicPr>
+                        <pic:blipFill>
+                          <a:blip r:embed="rId8"/>
+                          <a:stretch>
+                            <a:fillRect/>
+                          </a:stretch>
+                        </pic:blipFill>
+                        <pic:spPr>
+                          <a:xfrm>
+                            <a:off x="0" y="0"/>
+                            <a:ext cx="2638425" cy="533400"/>
+                          </a:xfrm>
+                          <a:prstGeom prst="rect">
+                            <a:avLst/>
+                          </a:prstGeom>
+                          <a:noFill/>
+                          <a:ln>
+                            <a:noFill/>
+                          </a:ln>
+                        </pic:spPr>
+                      </pic:pic>
+                    </a:graphicData>
+                  </a:graphic>
+                </wp:inline>
+              </w:drawing>
+            </w:r>
+          </w:p>
+          <w:p>
+            <w:pPr>
+              <w:keepNext w:val="0"/>
+              <w:keepLines w:val="0"/>
+              <w:widowControl/>
+              <w:suppressLineNumbers w:val="0"/>
+              <w:jc w:val="left"/>
+            </w:pPr>
+            <w:r>
+              <w:rPr>
+                <w:rFonts w:hint="eastAsia" w:ascii="宋体" w:hAnsi="宋体" w:eastAsia="宋体" w:cs="宋体"/>
+                <w:color w:val="000000"/>
+                <w:kern w:val="0"/>
+                <w:sz w:val="20"/>
+                <w:szCs w:val="20"/>
+                <w:lang w:val="en-US" w:eastAsia="zh-CN" w:bidi="ar"/>
+              </w:rPr>
+              <w:t xml:space="preserve">2、分解模数破解 RSA </w:t>
+            </w:r>
+          </w:p>
+          <w:p>
+            <w:r>
+              <w:drawing>
+                <wp:inline distT="0" distB="0" distL="114300" distR="114300">
+                  <wp:extent cx="2305050" cy="247650"/>
+                  <wp:effectExtent l="0" t="0" r="11430" b="11430"/>
+                  <wp:docPr id="12" name="图片 11"/>
+                  <wp:cNvGraphicFramePr>
+                    <a:graphicFrameLocks xmlns:a="http://schemas.openxmlformats.org/drawingml/2006/main" noChangeAspect="1"/>
+                  </wp:cNvGraphicFramePr>
+                  <a:graphic xmlns:a="http://schemas.openxmlformats.org/drawingml/2006/main">
+                    <a:graphicData uri="http://schemas.openxmlformats.org/drawingml/2006/picture">
+                      <pic:pic xmlns:pic="http://schemas.openxmlformats.org/drawingml/2006/picture">
+                        <pic:nvPicPr>
+                          <pic:cNvPr id="12" name="图片 11"/>
+                          <pic:cNvPicPr>
+                            <a:picLocks noChangeAspect="1"/>
+                          </pic:cNvPicPr>
+                        </pic:nvPicPr>
+                        <pic:blipFill>
+                          <a:blip r:embed="rId10"/>
+                          <a:stretch>
+                            <a:fillRect/>
+                          </a:stretch>
+                        </pic:blipFill>
+                        <pic:spPr>
+                          <a:xfrm>
+                            <a:off x="0" y="0"/>
+                            <a:ext cx="2305050" cy="247650"/>
+                          </a:xfrm>
+                          <a:prstGeom prst="rect">
+                            <a:avLst/>
+                          </a:prstGeom>
+                          <a:noFill/>
+                          <a:ln>
+                            <a:noFill/>
+                          </a:ln>
+                        </pic:spPr>
+                      </pic:pic>
+                    </a:graphicData>
+                  </a:graphic>
+                </wp:inline>
+              </w:drawing>
+            </w:r>
+          </w:p>
+          <w:p>
+            <w:pPr>
+              <w:rPr>
+                <w:rFonts w:hint="default" w:eastAsia="宋体"/>
+                <w:lang w:val="en-US" w:eastAsia="zh-CN"/>
+              </w:rPr>
+            </w:pPr>
+            <w:r>
+              <w:rPr>
+                <w:rFonts w:hint="eastAsia"/>
+                <w:lang w:val="en-US" w:eastAsia="zh-CN"/>
+              </w:rPr>
+              <w:t>期中vFQQV可能是数据转换问题</w:t>
+            </w:r>
+          </w:p>
+          <w:p>
+            <w:pPr>
+              <w:keepNext w:val="0"/>
+              <w:keepLines w:val="0"/>
+              <w:widowControl/>
+              <w:suppressLineNumbers w:val="0"/>
+              <w:jc w:val="left"/>
+            </w:pPr>
+            <w:r>
+              <w:rPr>
+                <w:rFonts w:hint="default" w:ascii="Times New Roman" w:hAnsi="Times New Roman" w:eastAsia="宋体" w:cs="Times New Roman"/>
+                <w:color w:val="000000"/>
+                <w:kern w:val="0"/>
+                <w:sz w:val="20"/>
+                <w:szCs w:val="20"/>
+                <w:lang w:val="en-US" w:eastAsia="zh-CN" w:bidi="ar"/>
+              </w:rPr>
+              <w:t>3</w:t>
+            </w:r>
+            <w:r>
+              <w:rPr>
+                <w:rFonts w:hint="eastAsia" w:ascii="宋体" w:hAnsi="宋体" w:eastAsia="宋体" w:cs="宋体"/>
+                <w:color w:val="000000"/>
+                <w:kern w:val="0"/>
+                <w:sz w:val="20"/>
+                <w:szCs w:val="20"/>
+                <w:lang w:val="en-US" w:eastAsia="zh-CN" w:bidi="ar"/>
+              </w:rPr>
+              <w:t>、公共模数攻击</w:t>
+            </w:r>
           </w:p>
           <w:p>
             <w:pPr>
@@ -1247,38 +4947,49 @@
                 <w:szCs w:val="21"/>
               </w:rPr>
             </w:pPr>
-          </w:p>
-          <w:p>
-            <w:pPr>
-              <w:rPr>
-                <w:bCs/>
-                <w:szCs w:val="21"/>
-              </w:rPr>
-            </w:pPr>
-          </w:p>
-          <w:p>
-            <w:pPr>
-              <w:rPr>
-                <w:bCs/>
-                <w:szCs w:val="21"/>
-              </w:rPr>
-            </w:pPr>
-          </w:p>
-          <w:p>
-            <w:pPr>
-              <w:rPr>
-                <w:bCs/>
-                <w:szCs w:val="21"/>
-              </w:rPr>
-            </w:pPr>
-          </w:p>
-          <w:p>
-            <w:pPr>
-              <w:rPr>
-                <w:bCs/>
-                <w:szCs w:val="21"/>
-              </w:rPr>
-            </w:pPr>
+            <w:r>
+              <w:drawing>
+                <wp:inline distT="0" distB="0" distL="114300" distR="114300">
+                  <wp:extent cx="5911850" cy="541655"/>
+                  <wp:effectExtent l="0" t="0" r="1270" b="6985"/>
+                  <wp:docPr id="13" name="图片 13"/>
+                  <wp:cNvGraphicFramePr>
+                    <a:graphicFrameLocks xmlns:a="http://schemas.openxmlformats.org/drawingml/2006/main" noChangeAspect="1"/>
+                  </wp:cNvGraphicFramePr>
+                  <a:graphic xmlns:a="http://schemas.openxmlformats.org/drawingml/2006/main">
+                    <a:graphicData uri="http://schemas.openxmlformats.org/drawingml/2006/picture">
+                      <pic:pic xmlns:pic="http://schemas.openxmlformats.org/drawingml/2006/picture">
+                        <pic:nvPicPr>
+                          <pic:cNvPr id="13" name="图片 13"/>
+                          <pic:cNvPicPr>
+                            <a:picLocks noChangeAspect="1"/>
+                          </pic:cNvPicPr>
+                        </pic:nvPicPr>
+                        <pic:blipFill>
+                          <a:blip r:embed="rId11"/>
+                          <a:stretch>
+                            <a:fillRect/>
+                          </a:stretch>
+                        </pic:blipFill>
+                        <pic:spPr>
+                          <a:xfrm>
+                            <a:off x="0" y="0"/>
+                            <a:ext cx="5911850" cy="541655"/>
+                          </a:xfrm>
+                          <a:prstGeom prst="rect">
+                            <a:avLst/>
+                          </a:prstGeom>
+                          <a:noFill/>
+                          <a:ln>
+                            <a:noFill/>
+                          </a:ln>
+                        </pic:spPr>
+                      </pic:pic>
+                    </a:graphicData>
+                  </a:graphic>
+                </wp:inline>
+              </w:drawing>
+            </w:r>
           </w:p>
           <w:p>
             <w:pPr>
@@ -1295,76 +5006,6 @@
               <w:rPr>
                 <w:b/>
                 <w:bCs/>
-                <w:sz w:val="32"/>
-                <w:szCs w:val="32"/>
-              </w:rPr>
-            </w:pPr>
-          </w:p>
-          <w:p>
-            <w:pPr>
-              <w:rPr>
-                <w:b/>
-                <w:bCs/>
-                <w:sz w:val="32"/>
-                <w:szCs w:val="32"/>
-              </w:rPr>
-            </w:pPr>
-          </w:p>
-          <w:p>
-            <w:pPr>
-              <w:rPr>
-                <w:b/>
-                <w:bCs/>
-                <w:sz w:val="32"/>
-                <w:szCs w:val="32"/>
-              </w:rPr>
-            </w:pPr>
-          </w:p>
-          <w:p>
-            <w:pPr>
-              <w:rPr>
-                <w:b/>
-                <w:bCs/>
-                <w:sz w:val="32"/>
-                <w:szCs w:val="32"/>
-              </w:rPr>
-            </w:pPr>
-          </w:p>
-          <w:p>
-            <w:pPr>
-              <w:rPr>
-                <w:b/>
-                <w:bCs/>
-                <w:sz w:val="32"/>
-                <w:szCs w:val="32"/>
-              </w:rPr>
-            </w:pPr>
-          </w:p>
-          <w:p>
-            <w:pPr>
-              <w:rPr>
-                <w:b/>
-                <w:bCs/>
-                <w:sz w:val="32"/>
-                <w:szCs w:val="32"/>
-              </w:rPr>
-            </w:pPr>
-          </w:p>
-          <w:p>
-            <w:pPr>
-              <w:rPr>
-                <w:b/>
-                <w:bCs/>
-                <w:sz w:val="32"/>
-                <w:szCs w:val="32"/>
-              </w:rPr>
-            </w:pPr>
-          </w:p>
-          <w:p>
-            <w:pPr>
-              <w:rPr>
-                <w:b/>
-                <w:bCs/>
                 <w:sz w:val="24"/>
               </w:rPr>
             </w:pPr>
@@ -1376,6 +5017,76 @@
                 <w:sz w:val="24"/>
               </w:rPr>
               <w:t>五、实验总结</w:t>
+            </w:r>
+          </w:p>
+          <w:p>
+            <w:pPr>
+              <w:pStyle w:val="5"/>
+              <w:keepNext w:val="0"/>
+              <w:keepLines w:val="0"/>
+              <w:widowControl/>
+              <w:suppressLineNumbers w:val="0"/>
+              <w:spacing w:before="0" w:beforeAutospacing="1" w:after="0" w:afterAutospacing="1"/>
+              <w:ind w:left="0" w:right="0"/>
+              <w:rPr>
+                <w:rFonts w:hint="eastAsia" w:ascii="Times New Roman" w:hAnsi="Times New Roman" w:eastAsia="宋体" w:cs="Times New Roman"/>
+                <w:kern w:val="2"/>
+                <w:sz w:val="21"/>
+                <w:szCs w:val="24"/>
+                <w:lang w:val="en-US" w:eastAsia="zh-CN" w:bidi="ar-SA"/>
+              </w:rPr>
+            </w:pPr>
+            <w:r>
+              <w:rPr>
+                <w:rFonts w:hint="eastAsia" w:ascii="Times New Roman" w:hAnsi="Times New Roman" w:eastAsia="宋体" w:cs="Times New Roman"/>
+                <w:kern w:val="2"/>
+                <w:sz w:val="21"/>
+                <w:szCs w:val="24"/>
+                <w:lang w:val="en-US" w:eastAsia="zh-CN" w:bidi="ar-SA"/>
+              </w:rPr>
+              <w:t>本次实验通过实现RS</w:t>
+            </w:r>
+            <w:r>
+              <w:rPr>
+                <w:rFonts w:hint="eastAsia" w:cs="Times New Roman"/>
+                <w:kern w:val="2"/>
+                <w:sz w:val="21"/>
+                <w:szCs w:val="24"/>
+                <w:lang w:val="en-US" w:eastAsia="zh-CN" w:bidi="ar-SA"/>
+              </w:rPr>
+              <w:t>A</w:t>
+            </w:r>
+            <w:r>
+              <w:rPr>
+                <w:rFonts w:hint="eastAsia" w:ascii="Times New Roman" w:hAnsi="Times New Roman" w:eastAsia="宋体" w:cs="Times New Roman"/>
+                <w:kern w:val="2"/>
+                <w:sz w:val="21"/>
+                <w:szCs w:val="24"/>
+                <w:lang w:val="en-US" w:eastAsia="zh-CN" w:bidi="ar-SA"/>
+              </w:rPr>
+              <w:t>的加密、解密与破解，</w:t>
+            </w:r>
+            <w:bookmarkStart w:id="0" w:name="_GoBack"/>
+            <w:bookmarkEnd w:id="0"/>
+            <w:r>
+              <w:rPr>
+                <w:rFonts w:hint="eastAsia" w:ascii="Times New Roman" w:hAnsi="Times New Roman" w:eastAsia="宋体" w:cs="Times New Roman"/>
+                <w:kern w:val="2"/>
+                <w:sz w:val="21"/>
+                <w:szCs w:val="24"/>
+                <w:lang w:val="en-US" w:eastAsia="zh-CN" w:bidi="ar-SA"/>
+              </w:rPr>
+              <w:t>了解扩展欧几里得算法求乘法逆元的方法，以及大数分解在攻击 RSA 中的应用。同时，通过使用 openssl 工具提取公钥参数，加深了对公钥文件结构的理解。在破解部分，熟悉了质因数分解恢复私钥的流程，并掌握了利用扩展欧几里得算法实现共模攻击的方法，理解了通过贝祖定理联合两个密文恢复明文的原理</w:t>
+            </w:r>
+            <w:r>
+              <w:rPr>
+                <w:rFonts w:hint="eastAsia" w:cs="Times New Roman"/>
+                <w:kern w:val="2"/>
+                <w:sz w:val="21"/>
+                <w:szCs w:val="24"/>
+                <w:lang w:val="en-US" w:eastAsia="zh-CN" w:bidi="ar-SA"/>
+              </w:rPr>
+              <w:t>。</w:t>
             </w:r>
           </w:p>
           <w:p>
@@ -1457,7 +5168,7 @@
 <w:hdr xmlns:wpc="http://schemas.microsoft.com/office/word/2010/wordprocessingCanvas" xmlns:mc="http://schemas.openxmlformats.org/markup-compatibility/2006" xmlns:o="urn:schemas-microsoft-com:office:office" xmlns:r="http://schemas.openxmlformats.org/officeDocument/2006/relationships" xmlns:m="http://schemas.openxmlformats.org/officeDocument/2006/math" xmlns:v="urn:schemas-microsoft-com:vml" xmlns:wp14="http://schemas.microsoft.com/office/word/2010/wordprocessingDrawing" xmlns:wp="http://schemas.openxmlformats.org/drawingml/2006/wordprocessingDrawing" xmlns:w10="urn:schemas-microsoft-com:office:word" xmlns:w="http://schemas.openxmlformats.org/wordprocessingml/2006/main" xmlns:w14="http://schemas.microsoft.com/office/word/2010/wordml" xmlns:w15="http://schemas.microsoft.com/office/word/2012/wordml" xmlns:wpg="http://schemas.microsoft.com/office/word/2010/wordprocessingGroup" xmlns:wpi="http://schemas.microsoft.com/office/word/2010/wordprocessingInk" xmlns:wne="http://schemas.microsoft.com/office/word/2006/wordml" xmlns:wps="http://schemas.microsoft.com/office/word/2010/wordprocessingShape" xmlns:wpsCustomData="http://www.wps.cn/officeDocument/2013/wpsCustomData" mc:Ignorable="w14 w15 wp14">
   <w:p>
     <w:pPr>
-      <w:pStyle w:val="3"/>
+      <w:pStyle w:val="4"/>
       <w:pBdr>
         <w:bottom w:val="none" w:color="auto" w:sz="0" w:space="0"/>
       </w:pBdr>
@@ -1466,12 +5177,32 @@
 </w:hdr>
 </file>
 
+<file path=word/numbering.xml><?xml version="1.0" encoding="utf-8"?>
+<w:numbering xmlns:wpc="http://schemas.microsoft.com/office/word/2010/wordprocessingCanvas" xmlns:mc="http://schemas.openxmlformats.org/markup-compatibility/2006" xmlns:o="urn:schemas-microsoft-com:office:office" xmlns:r="http://schemas.openxmlformats.org/officeDocument/2006/relationships" xmlns:m="http://schemas.openxmlformats.org/officeDocument/2006/math" xmlns:v="urn:schemas-microsoft-com:vml" xmlns:wp14="http://schemas.microsoft.com/office/word/2010/wordprocessingDrawing" xmlns:wp="http://schemas.openxmlformats.org/drawingml/2006/wordprocessingDrawing" xmlns:w10="urn:schemas-microsoft-com:office:word" xmlns:w="http://schemas.openxmlformats.org/wordprocessingml/2006/main" xmlns:w14="http://schemas.microsoft.com/office/word/2010/wordml" xmlns:wpg="http://schemas.microsoft.com/office/word/2010/wordprocessingGroup" xmlns:wpi="http://schemas.microsoft.com/office/word/2010/wordprocessingInk" xmlns:wne="http://schemas.microsoft.com/office/word/2006/wordml" xmlns:wps="http://schemas.microsoft.com/office/word/2010/wordprocessingShape" xmlns:wpsCustomData="http://www.wps.cn/officeDocument/2013/wpsCustomData" mc:Ignorable="w14 wp14">
+  <w:abstractNum w:abstractNumId="0">
+    <w:nsid w:val="6A4440DC"/>
+    <w:multiLevelType w:val="singleLevel"/>
+    <w:tmpl w:val="6A4440DC"/>
+    <w:lvl w:ilvl="0" w:tentative="0">
+      <w:start w:val="2"/>
+      <w:numFmt w:val="decimal"/>
+      <w:suff w:val="space"/>
+      <w:lvlText w:val="%1."/>
+      <w:lvlJc w:val="left"/>
+    </w:lvl>
+  </w:abstractNum>
+  <w:num w:numId="1">
+    <w:abstractNumId w:val="0"/>
+  </w:num>
+</w:numbering>
+</file>
+
 <file path=word/styles.xml><?xml version="1.0" encoding="utf-8"?>
 <w:styles xmlns:mc="http://schemas.openxmlformats.org/markup-compatibility/2006" xmlns:o="urn:schemas-microsoft-com:office:office" xmlns:r="http://schemas.openxmlformats.org/officeDocument/2006/relationships" xmlns:m="http://schemas.openxmlformats.org/officeDocument/2006/math" xmlns:v="urn:schemas-microsoft-com:vml" xmlns:w="http://schemas.openxmlformats.org/wordprocessingml/2006/main" xmlns:w14="http://schemas.microsoft.com/office/word/2010/wordml" xmlns:w10="urn:schemas-microsoft-com:office:word" xmlns:sl="http://schemas.openxmlformats.org/schemaLibrary/2006/main" xmlns:wpsCustomData="http://www.wps.cn/officeDocument/2013/wpsCustomData" mc:Ignorable="w14">
   <w:docDefaults>
     <w:rPrDefault>
       <w:rPr>
-        <w:rFonts w:asciiTheme="minorHAnsi" w:hAnsiTheme="minorHAnsi" w:eastAsiaTheme="minorEastAsia" w:cstheme="minorBidi"/>
+        <w:rFonts w:ascii="Times New Roman" w:hAnsi="Times New Roman" w:eastAsia="宋体" w:cs="Times New Roman"/>
       </w:rPr>
     </w:rPrDefault>
     <w:pPrDefault/>
@@ -1508,7 +5239,7 @@
     <w:lsdException w:uiPriority="99" w:name="Normal Indent"/>
     <w:lsdException w:uiPriority="99" w:name="footnote text"/>
     <w:lsdException w:uiPriority="99" w:name="annotation text"/>
-    <w:lsdException w:uiPriority="0" w:semiHidden="0" w:name="header"/>
+    <w:lsdException w:qFormat="1" w:uiPriority="0" w:semiHidden="0" w:name="header"/>
     <w:lsdException w:uiPriority="99" w:semiHidden="0" w:name="footer"/>
     <w:lsdException w:uiPriority="99" w:name="index heading"/>
     <w:lsdException w:qFormat="1" w:uiPriority="35" w:name="caption"/>
@@ -1580,7 +5311,7 @@
     <w:lsdException w:uiPriority="99" w:name="HTML Sample"/>
     <w:lsdException w:uiPriority="99" w:name="HTML Typewriter"/>
     <w:lsdException w:uiPriority="99" w:name="HTML Variable"/>
-    <w:lsdException w:uiPriority="99" w:name="Normal Table"/>
+    <w:lsdException w:qFormat="1" w:uiPriority="99" w:name="Normal Table"/>
     <w:lsdException w:uiPriority="99" w:name="annotation subject"/>
     <w:lsdException w:uiPriority="99" w:name="Table Simple 1"/>
     <w:lsdException w:uiPriority="99" w:name="Table Simple 2"/>
@@ -1742,16 +5473,39 @@
       <w:lang w:val="en-US" w:eastAsia="zh-CN" w:bidi="ar-SA"/>
     </w:rPr>
   </w:style>
-  <w:style w:type="character" w:default="1" w:styleId="5">
+  <w:style w:type="paragraph" w:styleId="2">
+    <w:name w:val="heading 2"/>
+    <w:basedOn w:val="1"/>
+    <w:next w:val="1"/>
+    <w:semiHidden/>
+    <w:unhideWhenUsed/>
+    <w:qFormat/>
+    <w:uiPriority w:val="9"/>
+    <w:pPr>
+      <w:spacing w:before="0" w:beforeAutospacing="1" w:after="0" w:afterAutospacing="1"/>
+      <w:jc w:val="left"/>
+    </w:pPr>
+    <w:rPr>
+      <w:rFonts w:hint="eastAsia" w:ascii="宋体" w:hAnsi="宋体" w:eastAsia="宋体" w:cs="宋体"/>
+      <w:b/>
+      <w:bCs/>
+      <w:kern w:val="0"/>
+      <w:sz w:val="36"/>
+      <w:szCs w:val="36"/>
+      <w:lang w:val="en-US" w:eastAsia="zh-CN" w:bidi="ar"/>
+    </w:rPr>
+  </w:style>
+  <w:style w:type="character" w:default="1" w:styleId="7">
     <w:name w:val="Default Paragraph Font"/>
     <w:semiHidden/>
     <w:unhideWhenUsed/>
     <w:uiPriority w:val="1"/>
   </w:style>
-  <w:style w:type="table" w:default="1" w:styleId="4">
+  <w:style w:type="table" w:default="1" w:styleId="6">
     <w:name w:val="Normal Table"/>
     <w:semiHidden/>
     <w:unhideWhenUsed/>
+    <w:qFormat/>
     <w:uiPriority w:val="99"/>
     <w:tblPr>
       <w:tblCellMar>
@@ -1762,10 +5516,10 @@
       </w:tblCellMar>
     </w:tblPr>
   </w:style>
-  <w:style w:type="paragraph" w:styleId="2">
+  <w:style w:type="paragraph" w:styleId="3">
     <w:name w:val="footer"/>
     <w:basedOn w:val="1"/>
-    <w:link w:val="7"/>
+    <w:link w:val="11"/>
     <w:unhideWhenUsed/>
     <w:uiPriority w:val="99"/>
     <w:pPr>
@@ -1781,11 +5535,12 @@
       <w:szCs w:val="18"/>
     </w:rPr>
   </w:style>
-  <w:style w:type="paragraph" w:styleId="3">
+  <w:style w:type="paragraph" w:styleId="4">
     <w:name w:val="header"/>
     <w:basedOn w:val="1"/>
-    <w:link w:val="6"/>
+    <w:link w:val="10"/>
     <w:unhideWhenUsed/>
+    <w:qFormat/>
     <w:uiPriority w:val="0"/>
     <w:pPr>
       <w:pBdr>
@@ -1803,20 +5558,51 @@
       <w:szCs w:val="18"/>
     </w:rPr>
   </w:style>
-  <w:style w:type="character" w:customStyle="1" w:styleId="6">
+  <w:style w:type="paragraph" w:styleId="5">
+    <w:name w:val="Normal (Web)"/>
+    <w:basedOn w:val="1"/>
+    <w:semiHidden/>
+    <w:unhideWhenUsed/>
+    <w:uiPriority w:val="99"/>
+    <w:rPr>
+      <w:sz w:val="24"/>
+    </w:rPr>
+  </w:style>
+  <w:style w:type="character" w:styleId="8">
+    <w:name w:val="Strong"/>
+    <w:basedOn w:val="7"/>
+    <w:qFormat/>
+    <w:uiPriority w:val="22"/>
+    <w:rPr>
+      <w:b/>
+    </w:rPr>
+  </w:style>
+  <w:style w:type="character" w:styleId="9">
+    <w:name w:val="HTML Code"/>
+    <w:basedOn w:val="7"/>
+    <w:semiHidden/>
+    <w:unhideWhenUsed/>
+    <w:uiPriority w:val="99"/>
+    <w:rPr>
+      <w:rFonts w:ascii="Courier New" w:hAnsi="Courier New"/>
+      <w:sz w:val="20"/>
+    </w:rPr>
+  </w:style>
+  <w:style w:type="character" w:customStyle="1" w:styleId="10">
     <w:name w:val="页眉 字符"/>
-    <w:basedOn w:val="5"/>
-    <w:link w:val="3"/>
+    <w:basedOn w:val="7"/>
+    <w:link w:val="4"/>
+    <w:qFormat/>
     <w:uiPriority w:val="0"/>
     <w:rPr>
       <w:sz w:val="18"/>
       <w:szCs w:val="18"/>
     </w:rPr>
   </w:style>
-  <w:style w:type="character" w:customStyle="1" w:styleId="7">
+  <w:style w:type="character" w:customStyle="1" w:styleId="11">
     <w:name w:val="页脚 字符"/>
-    <w:basedOn w:val="5"/>
-    <w:link w:val="2"/>
+    <w:basedOn w:val="7"/>
+    <w:link w:val="3"/>
     <w:uiPriority w:val="99"/>
     <w:rPr>
       <w:sz w:val="18"/>

</xml_diff>